<commit_message>
Actualizaciones TP 2 Paradigmas (Desktop Linux)
</commit_message>
<xml_diff>
--- a/PARADIGMAS DE PROGRAMACIÓN/TPs/TP 2/TP2.docx
+++ b/PARADIGMAS DE PROGRAMACIÓN/TPs/TP 2/TP2.docx
@@ -194,7 +194,7 @@
           <w:rFonts w:eastAsia="Times New Roman" w:cs="Times New Roman" w:ascii="Montserrat" w:hAnsi="Montserrat"/>
           <w:sz w:val="24"/>
           <w:szCs w:val="24"/>
-          <w:lang w:eastAsia="es"/>
+          <w:lang w:eastAsia="es-ES"/>
         </w:rPr>
         <w:t xml:space="preserve">β – </w:t>
       </w:r>
@@ -1873,9 +1873,6 @@
       </w:pPr>
       <w:r>
         <w:rPr>
-          <w:rFonts w:eastAsia="CMMI10" w:cs="XCharter-Roman" w:ascii="XCharter-Roman" w:hAnsi="XCharter-Roman"/>
-          <w:sz w:val="20"/>
-          <w:szCs w:val="20"/>
           <w:u w:val="single"/>
           <w:lang w:val="es-AR"/>
         </w:rPr>
@@ -1892,9 +1889,6 @@
       </w:pPr>
       <w:r>
         <w:rPr>
-          <w:rFonts w:eastAsia="CMMI10" w:cs="XCharter-Roman" w:ascii="XCharter-Roman" w:hAnsi="XCharter-Roman"/>
-          <w:sz w:val="20"/>
-          <w:szCs w:val="20"/>
           <w:u w:val="single"/>
           <w:lang w:val="es-AR"/>
         </w:rPr>
@@ -1969,27 +1963,7 @@
           <w:lang w:val="es-AR"/>
         </w:rPr>
         <w:tab/>
-        <w:t xml:space="preserve">Es parte del paradigma declarativo basado en el uso de funciones matemáticas. Se basa en un conjunto de funciones (relaciones que cumplen </w:t>
-      </w:r>
-      <w:r>
-        <w:rPr>
-          <w:rFonts w:ascii="Montserrat" w:hAnsi="Montserrat"/>
-          <w:sz w:val="22"/>
-          <w:szCs w:val="22"/>
-          <w:u w:val="none"/>
-          <w:lang w:val="es-AR"/>
-        </w:rPr>
-        <w:t>las propiedades de unicidad y existencia</w:t>
-      </w:r>
-      <w:r>
-        <w:rPr>
-          <w:rFonts w:ascii="Montserrat" w:hAnsi="Montserrat"/>
-          <w:sz w:val="22"/>
-          <w:szCs w:val="22"/>
-          <w:u w:val="none"/>
-          <w:lang w:val="es-AR"/>
-        </w:rPr>
-        <w:t>)</w:t>
+        <w:t>Es parte del paradigma declarativo basado en el uso de funciones matemáticas. Se basa en un conjunto de funciones (relaciones que cumplen las propiedades de unicidad y existencia)</w:t>
       </w:r>
     </w:p>
     <w:p>
@@ -2237,27 +2211,7 @@
           <w:u w:val="none"/>
           <w:lang w:val="es-AR"/>
         </w:rPr>
-        <w:t>Ejercicio 2.</w:t>
-      </w:r>
-      <w:r>
-        <w:rPr>
-          <w:rFonts w:ascii="Montserrat" w:hAnsi="Montserrat"/>
-          <w:sz w:val="22"/>
-          <w:szCs w:val="22"/>
-          <w:u w:val="none"/>
-          <w:lang w:val="es-AR"/>
-        </w:rPr>
-        <w:t>2</w:t>
-      </w:r>
-      <w:r>
-        <w:rPr>
-          <w:rFonts w:ascii="Montserrat" w:hAnsi="Montserrat"/>
-          <w:sz w:val="22"/>
-          <w:szCs w:val="22"/>
-          <w:u w:val="none"/>
-          <w:lang w:val="es-AR"/>
-        </w:rPr>
-        <w:t>:</w:t>
+        <w:t>Ejercicio 2.2:</w:t>
       </w:r>
     </w:p>
     <w:p>
@@ -2280,15 +2234,6 @@
           <w:lang w:val="es-AR"/>
         </w:rPr>
         <w:tab/>
-      </w:r>
-      <w:r>
-        <w:rPr>
-          <w:rFonts w:ascii="Montserrat" w:hAnsi="Montserrat"/>
-          <w:sz w:val="22"/>
-          <w:szCs w:val="22"/>
-          <w:u w:val="none"/>
-          <w:lang w:val="es-AR"/>
-        </w:rPr>
         <w:t>Características:</w:t>
       </w:r>
     </w:p>
@@ -2791,17 +2736,3164 @@
           <w:u w:val="none"/>
           <w:lang w:val="es-AR"/>
         </w:rPr>
-        <w:t xml:space="preserve">La computadora tiene un rol fundamental en estos lenguajes, debido a que, </w:t>
-      </w:r>
-      <w:r>
-        <w:rPr>
-          <w:rFonts w:ascii="Montserrat" w:hAnsi="Montserrat"/>
-          <w:sz w:val="22"/>
-          <w:szCs w:val="22"/>
-          <w:u w:val="none"/>
-          <w:lang w:val="es-AR"/>
-        </w:rPr>
-        <w:t>en el lenguaje imperativo, el dispositivo ejecuta órdenes. Sigue una secuencia de comandos de manera estructurada que modifica la memoria interna. Por otro lado, en los lenguajes funcionales, la computadora sirve como  una evaluadora de expresiones.</w:t>
+        <w:t>La computadora tiene un rol fundamental en estos lenguajes, debido a que, en el lenguaje imperativo, el dispositivo ejecuta órdenes. Sigue una secuencia de comandos de manera estructurada que modifica la memoria interna. Por otro lado, en los lenguajes funcionales, la computadora sirve como  una evaluadora de expresiones.</w:t>
+      </w:r>
+    </w:p>
+    <w:p>
+      <w:pPr>
+        <w:pStyle w:val="Normal"/>
+        <w:widowControl/>
+        <w:bidi w:val="0"/>
+        <w:spacing w:lineRule="auto" w:line="259" w:before="0" w:after="160"/>
+        <w:ind w:hanging="0" w:start="720" w:end="0"/>
+        <w:jc w:val="start"/>
+        <w:rPr>
+          <w:rFonts w:ascii="Montserrat" w:hAnsi="Montserrat"/>
+          <w:sz w:val="22"/>
+          <w:szCs w:val="22"/>
+          <w:u w:val="none"/>
+          <w:lang w:val="es-AR"/>
+        </w:rPr>
+      </w:pPr>
+      <w:r>
+        <w:rPr>
+          <w:rFonts w:ascii="Montserrat" w:hAnsi="Montserrat"/>
+          <w:sz w:val="22"/>
+          <w:szCs w:val="22"/>
+          <w:u w:val="none"/>
+          <w:lang w:val="es-AR"/>
+        </w:rPr>
+      </w:r>
+    </w:p>
+    <w:p>
+      <w:pPr>
+        <w:pStyle w:val="Normal"/>
+        <w:ind w:hanging="0" w:start="0" w:end="0"/>
+        <w:rPr>
+          <w:rFonts w:ascii="Montserrat" w:hAnsi="Montserrat"/>
+          <w:u w:val="none"/>
+          <w:lang w:val="es-AR"/>
+        </w:rPr>
+      </w:pPr>
+      <w:r>
+        <w:rPr>
+          <w:rFonts w:ascii="Montserrat" w:hAnsi="Montserrat"/>
+          <w:u w:val="none"/>
+          <w:lang w:val="es-AR"/>
+        </w:rPr>
+        <w:t>Ejercicio 2.</w:t>
+      </w:r>
+      <w:r>
+        <w:rPr>
+          <w:rFonts w:ascii="Montserrat" w:hAnsi="Montserrat"/>
+          <w:u w:val="none"/>
+          <w:lang w:val="es-AR"/>
+        </w:rPr>
+        <w:t>3</w:t>
+      </w:r>
+      <w:r>
+        <w:rPr>
+          <w:rFonts w:ascii="Montserrat" w:hAnsi="Montserrat"/>
+          <w:u w:val="none"/>
+          <w:lang w:val="es-AR"/>
+        </w:rPr>
+        <w:t>:</w:t>
+      </w:r>
+    </w:p>
+    <w:p>
+      <w:pPr>
+        <w:pStyle w:val="Normal"/>
+        <w:ind w:hanging="0" w:start="720" w:end="0"/>
+        <w:rPr>
+          <w:rFonts w:ascii="Google Sans Flex;Google Sans;Helvetica Neue;sans-serif" w:hAnsi="Google Sans Flex;Google Sans;Helvetica Neue;sans-serif"/>
+          <w:b w:val="false"/>
+          <w:i w:val="false"/>
+          <w:caps w:val="false"/>
+          <w:smallCaps w:val="false"/>
+          <w:color w:val="E3E3E3"/>
+          <w:spacing w:val="0"/>
+          <w:sz w:val="24"/>
+          <w:u w:val="none"/>
+          <w:lang w:val="es-AR"/>
+        </w:rPr>
+      </w:pPr>
+      <w:r>
+        <w:rPr>
+          <w:rFonts w:ascii="Google Sans Flex;Google Sans;Helvetica Neue;sans-serif" w:hAnsi="Google Sans Flex;Google Sans;Helvetica Neue;sans-serif"/>
+          <w:b w:val="false"/>
+          <w:i w:val="false"/>
+          <w:caps w:val="false"/>
+          <w:smallCaps w:val="false"/>
+          <w:color w:val="E3E3E3"/>
+          <w:spacing w:val="0"/>
+          <w:sz w:val="24"/>
+          <w:u w:val="none"/>
+          <w:lang w:val="es-AR"/>
+        </w:rPr>
+        <w:t>En este tipo de lenguajes no existen variables como tal. Se habla más bien de identificadores inmutables (sirven para “etiquetar” expresiones matemáticas). Esto significa que una vez que se le asigna un valor a un identificador, éste no va a cambiar (dentro de su entorno). Otra forma de entender esto es que no van a ocurrir asignaciones destructivas</w:t>
+      </w:r>
+    </w:p>
+    <w:p>
+      <w:pPr>
+        <w:pStyle w:val="Normal"/>
+        <w:ind w:hanging="0" w:start="0" w:end="0"/>
+        <w:rPr>
+          <w:rFonts w:ascii="Google Sans Flex;Google Sans;Helvetica Neue;sans-serif" w:hAnsi="Google Sans Flex;Google Sans;Helvetica Neue;sans-serif"/>
+          <w:b w:val="false"/>
+          <w:i w:val="false"/>
+          <w:caps w:val="false"/>
+          <w:smallCaps w:val="false"/>
+          <w:color w:val="E3E3E3"/>
+          <w:spacing w:val="0"/>
+          <w:sz w:val="24"/>
+          <w:u w:val="none"/>
+          <w:lang w:val="es-AR"/>
+        </w:rPr>
+      </w:pPr>
+      <w:r>
+        <w:rPr>
+          <w:rFonts w:ascii="Google Sans Flex;Google Sans;Helvetica Neue;sans-serif" w:hAnsi="Google Sans Flex;Google Sans;Helvetica Neue;sans-serif"/>
+          <w:b w:val="false"/>
+          <w:i w:val="false"/>
+          <w:caps w:val="false"/>
+          <w:smallCaps w:val="false"/>
+          <w:color w:val="E3E3E3"/>
+          <w:spacing w:val="0"/>
+          <w:sz w:val="24"/>
+          <w:u w:val="none"/>
+          <w:lang w:val="es-AR"/>
+        </w:rPr>
+      </w:r>
+    </w:p>
+    <w:p>
+      <w:pPr>
+        <w:pStyle w:val="Normal"/>
+        <w:ind w:hanging="0" w:start="0" w:end="0"/>
+        <w:rPr>
+          <w:rFonts w:ascii="Montserrat" w:hAnsi="Montserrat"/>
+          <w:u w:val="none"/>
+          <w:lang w:val="es-AR"/>
+        </w:rPr>
+      </w:pPr>
+      <w:r>
+        <w:rPr>
+          <w:rFonts w:ascii="Montserrat" w:hAnsi="Montserrat"/>
+          <w:u w:val="none"/>
+          <w:lang w:val="es-AR"/>
+        </w:rPr>
+        <w:t>Ejercicio 2.</w:t>
+      </w:r>
+      <w:r>
+        <w:rPr>
+          <w:rFonts w:ascii="Montserrat" w:hAnsi="Montserrat"/>
+          <w:u w:val="none"/>
+          <w:lang w:val="es-AR"/>
+        </w:rPr>
+        <w:t>4</w:t>
+      </w:r>
+      <w:r>
+        <w:rPr>
+          <w:rFonts w:ascii="Montserrat" w:hAnsi="Montserrat"/>
+          <w:u w:val="none"/>
+          <w:lang w:val="es-AR"/>
+        </w:rPr>
+        <w:t>:</w:t>
+      </w:r>
+    </w:p>
+    <w:p>
+      <w:pPr>
+        <w:pStyle w:val="BodyText"/>
+        <w:widowControl/>
+        <w:numPr>
+          <w:ilvl w:val="0"/>
+          <w:numId w:val="11"/>
+        </w:numPr>
+        <w:suppressAutoHyphens w:val="true"/>
+        <w:overflowPunct w:val="false"/>
+        <w:bidi w:val="0"/>
+        <w:spacing w:lineRule="auto" w:line="259" w:before="0" w:after="160"/>
+        <w:jc w:val="start"/>
+        <w:rPr>
+          <w:rFonts w:ascii="Google Sans Flex;Google Sans;Helvetica Neue;sans-serif" w:hAnsi="Google Sans Flex;Google Sans;Helvetica Neue;sans-serif"/>
+          <w:b w:val="false"/>
+          <w:i w:val="false"/>
+          <w:caps w:val="false"/>
+          <w:smallCaps w:val="false"/>
+          <w:color w:val="E3E3E3"/>
+          <w:spacing w:val="0"/>
+          <w:sz w:val="24"/>
+          <w:u w:val="none"/>
+          <w:lang w:val="es-AR"/>
+        </w:rPr>
+      </w:pPr>
+      <w:r>
+        <w:rPr>
+          <w:rFonts w:ascii="Google Sans Flex;Google Sans;Helvetica Neue;sans-serif" w:hAnsi="Google Sans Flex;Google Sans;Helvetica Neue;sans-serif"/>
+          <w:b w:val="false"/>
+          <w:i w:val="false"/>
+          <w:caps w:val="false"/>
+          <w:smallCaps w:val="false"/>
+          <w:color w:val="E3E3E3"/>
+          <w:spacing w:val="0"/>
+          <w:sz w:val="24"/>
+          <w:u w:val="none"/>
+          <w:lang w:val="es-AR"/>
+        </w:rPr>
+        <w:t>Paradigma procedimental/imperativo: Este paradigma se centra en “como” hacer las cosas. El programador se va a encargar de darle una serie de reglas y normas (instrucciones) que el programa debe seguir, una después de otra y en un orden determinado. Los datos y los bloques de código conviven en ambientes separados.</w:t>
+      </w:r>
+    </w:p>
+    <w:p>
+      <w:pPr>
+        <w:pStyle w:val="BodyText"/>
+        <w:widowControl/>
+        <w:numPr>
+          <w:ilvl w:val="0"/>
+          <w:numId w:val="11"/>
+        </w:numPr>
+        <w:suppressAutoHyphens w:val="true"/>
+        <w:overflowPunct w:val="false"/>
+        <w:bidi w:val="0"/>
+        <w:spacing w:lineRule="auto" w:line="259" w:before="0" w:after="160"/>
+        <w:jc w:val="start"/>
+        <w:rPr>
+          <w:rFonts w:ascii="Google Sans Flex;Google Sans;Helvetica Neue;sans-serif" w:hAnsi="Google Sans Flex;Google Sans;Helvetica Neue;sans-serif"/>
+          <w:b w:val="false"/>
+          <w:i w:val="false"/>
+          <w:caps w:val="false"/>
+          <w:smallCaps w:val="false"/>
+          <w:color w:val="E3E3E3"/>
+          <w:spacing w:val="0"/>
+          <w:sz w:val="24"/>
+          <w:lang w:val="es-AR"/>
+        </w:rPr>
+      </w:pPr>
+      <w:r>
+        <w:rPr>
+          <w:rFonts w:ascii="Google Sans Flex;Google Sans;Helvetica Neue;sans-serif" w:hAnsi="Google Sans Flex;Google Sans;Helvetica Neue;sans-serif"/>
+          <w:b w:val="false"/>
+          <w:i w:val="false"/>
+          <w:caps w:val="false"/>
+          <w:smallCaps w:val="false"/>
+          <w:color w:val="E3E3E3"/>
+          <w:spacing w:val="0"/>
+          <w:sz w:val="24"/>
+          <w:lang w:val="es-AR"/>
+        </w:rPr>
+        <w:t>Paradigma funcional: Se centra en “que” se quiere hacer. El paradigma funcional se caracteriza por parecerse lo más posible a un modelo matemático, por lo que tiene varios factores que lo separan de los otros paradigmas. Primeramente, en un lenguaje funcional puro es muy importante lograr transparencia referencial (una serie de condiciones que aseguran que los valores no son modificados fuera de su contexto y que el programa sea determinista), luego, el concepto de variable se ve cambiado por el de identificador (inmutable) y, finalmente, podemos pensar en la información como un flujo de datos que entran a un bloque de código (función), se procesan y luego pasan a otro bloque, y así hasta dar con el resultado</w:t>
+      </w:r>
+    </w:p>
+    <w:p>
+      <w:pPr>
+        <w:pStyle w:val="BodyText"/>
+        <w:widowControl/>
+        <w:numPr>
+          <w:ilvl w:val="0"/>
+          <w:numId w:val="11"/>
+        </w:numPr>
+        <w:suppressAutoHyphens w:val="true"/>
+        <w:overflowPunct w:val="false"/>
+        <w:bidi w:val="0"/>
+        <w:spacing w:lineRule="auto" w:line="259" w:before="0" w:after="0"/>
+        <w:jc w:val="start"/>
+        <w:rPr>
+          <w:rFonts w:ascii="Google Sans Flex;Google Sans;Helvetica Neue;sans-serif" w:hAnsi="Google Sans Flex;Google Sans;Helvetica Neue;sans-serif"/>
+          <w:b w:val="false"/>
+          <w:i w:val="false"/>
+          <w:caps w:val="false"/>
+          <w:smallCaps w:val="false"/>
+          <w:color w:val="E3E3E3"/>
+          <w:spacing w:val="0"/>
+          <w:sz w:val="24"/>
+          <w:lang w:val="es-AR"/>
+        </w:rPr>
+      </w:pPr>
+      <w:r>
+        <w:rPr>
+          <w:rFonts w:ascii="Google Sans Flex;Google Sans;Helvetica Neue;sans-serif" w:hAnsi="Google Sans Flex;Google Sans;Helvetica Neue;sans-serif"/>
+          <w:b w:val="false"/>
+          <w:i w:val="false"/>
+          <w:caps w:val="false"/>
+          <w:smallCaps w:val="false"/>
+          <w:color w:val="E3E3E3"/>
+          <w:spacing w:val="0"/>
+          <w:sz w:val="24"/>
+          <w:lang w:val="es-AR"/>
+        </w:rPr>
+        <w:t>Paradigma lógico: Este paradigma intenta parecerse lo más posible a un sistema de lógica de primer orden. Al igual que el funcional, también es un paradigma declarativo, por lo que también busca en “que” se quiere hacer. Se basa en un sistema de “hechos”, “reglas” y una “base de conocimiento”. Los hechos pueden interpretarse como axiomas en un sistema lógico, mientras que las reglas son análogas a los silogismos (mi base de conocimiento es la información que yo le inyecto al programa).</w:t>
+      </w:r>
+    </w:p>
+    <w:p>
+      <w:pPr>
+        <w:pStyle w:val="Normal"/>
+        <w:widowControl/>
+        <w:suppressAutoHyphens w:val="true"/>
+        <w:overflowPunct w:val="false"/>
+        <w:bidi w:val="0"/>
+        <w:spacing w:lineRule="auto" w:line="259" w:before="0" w:after="160"/>
+        <w:jc w:val="start"/>
+        <w:rPr>
+          <w:rFonts w:ascii="Montserrat" w:hAnsi="Montserrat"/>
+          <w:u w:val="none"/>
+          <w:lang w:val="es-AR"/>
+        </w:rPr>
+      </w:pPr>
+      <w:r>
+        <w:rPr>
+          <w:rFonts w:ascii="Montserrat" w:hAnsi="Montserrat"/>
+          <w:u w:val="none"/>
+          <w:lang w:val="es-AR"/>
+        </w:rPr>
+      </w:r>
+    </w:p>
+    <w:p>
+      <w:pPr>
+        <w:pStyle w:val="Normal"/>
+        <w:rPr>
+          <w:rFonts w:ascii="Montserrat" w:hAnsi="Montserrat"/>
+          <w:u w:val="none"/>
+          <w:lang w:val="es-AR"/>
+        </w:rPr>
+      </w:pPr>
+      <w:r>
+        <w:rPr>
+          <w:rFonts w:ascii="Montserrat" w:hAnsi="Montserrat"/>
+          <w:u w:val="none"/>
+          <w:lang w:val="es-AR"/>
+        </w:rPr>
+        <w:t>Ejercicio 2.5:</w:t>
+      </w:r>
+    </w:p>
+    <w:p>
+      <w:pPr>
+        <w:pStyle w:val="Normal"/>
+        <w:widowControl/>
+        <w:suppressAutoHyphens w:val="true"/>
+        <w:overflowPunct w:val="false"/>
+        <w:bidi w:val="0"/>
+        <w:spacing w:lineRule="auto" w:line="259" w:before="0" w:after="160"/>
+        <w:ind w:hanging="0" w:start="720" w:end="0"/>
+        <w:jc w:val="start"/>
+        <w:rPr>
+          <w:rFonts w:ascii="Montserrat" w:hAnsi="Montserrat"/>
+          <w:u w:val="none"/>
+          <w:lang w:val="es-AR"/>
+        </w:rPr>
+      </w:pPr>
+      <w:r>
+        <w:rPr>
+          <w:rFonts w:ascii="Montserrat" w:hAnsi="Montserrat"/>
+          <w:u w:val="none"/>
+          <w:lang w:val="es-AR"/>
+        </w:rPr>
+        <w:t>Debido a su parecido semántico y conceptual con la matemática, estos lenguajes resultan altamente efectivos para aplicaciones que requieran hacer cálculos complejos. Por este motivo, el dominio de aplicación de lenguajes funcionales (como Haskell) es, mayoritariamente, la academia, sistemas de alta concurrencia, finanzas, trading y escritura de compiladores.</w:t>
+      </w:r>
+    </w:p>
+    <w:p>
+      <w:pPr>
+        <w:pStyle w:val="Normal"/>
+        <w:rPr>
+          <w:rFonts w:ascii="Montserrat" w:hAnsi="Montserrat"/>
+          <w:u w:val="none"/>
+          <w:lang w:val="es-AR"/>
+        </w:rPr>
+      </w:pPr>
+      <w:r>
+        <w:rPr>
+          <w:rFonts w:ascii="Montserrat" w:hAnsi="Montserrat"/>
+          <w:u w:val="none"/>
+          <w:lang w:val="es-AR"/>
+        </w:rPr>
+      </w:r>
+    </w:p>
+    <w:p>
+      <w:pPr>
+        <w:pStyle w:val="Normal"/>
+        <w:rPr>
+          <w:rFonts w:ascii="Montserrat" w:hAnsi="Montserrat"/>
+          <w:u w:val="none"/>
+          <w:lang w:val="es-AR"/>
+        </w:rPr>
+      </w:pPr>
+      <w:r>
+        <w:rPr>
+          <w:rFonts w:ascii="Montserrat" w:hAnsi="Montserrat"/>
+          <w:u w:val="none"/>
+          <w:lang w:val="es-AR"/>
+        </w:rPr>
+        <w:t>Ejercicio 2.6:</w:t>
+      </w:r>
+    </w:p>
+    <w:p>
+      <w:pPr>
+        <w:pStyle w:val="Normal"/>
+        <w:widowControl/>
+        <w:suppressAutoHyphens w:val="true"/>
+        <w:overflowPunct w:val="false"/>
+        <w:bidi w:val="0"/>
+        <w:spacing w:lineRule="auto" w:line="259" w:before="0" w:after="160"/>
+        <w:ind w:hanging="0" w:start="720" w:end="0"/>
+        <w:jc w:val="start"/>
+        <w:rPr>
+          <w:rFonts w:ascii="Montserrat" w:hAnsi="Montserrat"/>
+          <w:u w:val="none"/>
+          <w:lang w:val="es-AR"/>
+        </w:rPr>
+      </w:pPr>
+      <w:r>
+        <w:rPr>
+          <w:rFonts w:ascii="Montserrat" w:hAnsi="Montserrat"/>
+          <w:u w:val="none"/>
+          <w:lang w:val="es-AR"/>
+        </w:rPr>
+        <w:t>La respuesta a esta pregunta es un rotundo NO. El paradigma que se basa en la arquitectura de Von Neumann es el imperativo (cuyo modelo es cambiar secuencialmente el estado de la memoria a través de instrucciones). Por el contrario, el paradigma funcional se abstrae por completo de la arquitectura del hardware y no tiene noción de "estado" o "celdas de memoria". En lugar de basarse en la máquina de Von Neumann, se fundamenta en un modelo matemático abstracto: el Cálculo Lambda de Alonzo Church, basando su ejecución en la reducción y evaluación de expresiones matemáticas puras.</w:t>
+      </w:r>
+    </w:p>
+    <w:p>
+      <w:pPr>
+        <w:pStyle w:val="Normal"/>
+        <w:rPr>
+          <w:rFonts w:ascii="Montserrat" w:hAnsi="Montserrat"/>
+          <w:u w:val="none"/>
+          <w:lang w:val="es-AR"/>
+        </w:rPr>
+      </w:pPr>
+      <w:r>
+        <w:rPr>
+          <w:rFonts w:ascii="Montserrat" w:hAnsi="Montserrat"/>
+          <w:u w:val="none"/>
+          <w:lang w:val="es-AR"/>
+        </w:rPr>
+      </w:r>
+    </w:p>
+    <w:p>
+      <w:pPr>
+        <w:pStyle w:val="Normal"/>
+        <w:rPr>
+          <w:rFonts w:ascii="Montserrat" w:hAnsi="Montserrat"/>
+          <w:u w:val="none"/>
+          <w:lang w:val="es-AR"/>
+        </w:rPr>
+      </w:pPr>
+      <w:r>
+        <w:rPr>
+          <w:rFonts w:ascii="Montserrat" w:hAnsi="Montserrat"/>
+          <w:u w:val="none"/>
+          <w:lang w:val="es-AR"/>
+        </w:rPr>
+        <w:t>Ejercicio 2.7:</w:t>
+      </w:r>
+    </w:p>
+    <w:p>
+      <w:pPr>
+        <w:pStyle w:val="Normal"/>
+        <w:widowControl/>
+        <w:tabs>
+          <w:tab w:val="clear" w:pos="708"/>
+          <w:tab w:val="left" w:pos="720" w:leader="none"/>
+        </w:tabs>
+        <w:suppressAutoHyphens w:val="true"/>
+        <w:overflowPunct w:val="false"/>
+        <w:bidi w:val="0"/>
+        <w:spacing w:lineRule="auto" w:line="259" w:before="0" w:after="160"/>
+        <w:ind w:hanging="0" w:start="720" w:end="0"/>
+        <w:jc w:val="start"/>
+        <w:rPr>
+          <w:rFonts w:ascii="Montserrat" w:hAnsi="Montserrat"/>
+          <w:u w:val="none"/>
+          <w:lang w:val="es-AR"/>
+        </w:rPr>
+      </w:pPr>
+      <w:r>
+        <w:rPr>
+          <w:rFonts w:ascii="Montserrat" w:hAnsi="Montserrat"/>
+          <w:u w:val="none"/>
+          <w:lang w:val="es-AR"/>
+        </w:rPr>
+        <w:t>El cálculo lambda se puede ver como un lenguaje de definición de funciones cuyos únicos tipos de datos primitivos son las funciones. No hay números ni cadenas de caracteres. Incluye un mecanismo de evaluación de las funciones basado en sustitución de variables por expresiones. En particular, todas las funciones tienen un argumento que representa a su vez otra función y sus imágenes son a su vez funciones. Los lenguajes funcionales se basan en él porque brinda una base sólida y, más importante, fácilmente computable y "traducible" para una computadora. Ofrece un modelo matemático que no requiere el concepto de estado, memoria o asignación destructiva, garantizando así la transparencia referencial.</w:t>
+      </w:r>
+    </w:p>
+    <w:p>
+      <w:pPr>
+        <w:pStyle w:val="Normal"/>
+        <w:widowControl/>
+        <w:tabs>
+          <w:tab w:val="clear" w:pos="708"/>
+          <w:tab w:val="left" w:pos="720" w:leader="none"/>
+        </w:tabs>
+        <w:suppressAutoHyphens w:val="true"/>
+        <w:overflowPunct w:val="false"/>
+        <w:bidi w:val="0"/>
+        <w:spacing w:lineRule="auto" w:line="259" w:before="0" w:after="160"/>
+        <w:ind w:hanging="0" w:start="0" w:end="0"/>
+        <w:jc w:val="start"/>
+        <w:rPr>
+          <w:rFonts w:ascii="Montserrat" w:hAnsi="Montserrat"/>
+          <w:u w:val="none"/>
+          <w:lang w:val="es-AR"/>
+        </w:rPr>
+      </w:pPr>
+      <w:r>
+        <w:rPr>
+          <w:rFonts w:ascii="Montserrat" w:hAnsi="Montserrat"/>
+          <w:u w:val="none"/>
+          <w:lang w:val="es-AR"/>
+        </w:rPr>
+      </w:r>
+    </w:p>
+    <w:p>
+      <w:pPr>
+        <w:pStyle w:val="Normal"/>
+        <w:rPr>
+          <w:rFonts w:ascii="Montserrat" w:hAnsi="Montserrat"/>
+          <w:u w:val="none"/>
+          <w:lang w:val="es-AR"/>
+        </w:rPr>
+      </w:pPr>
+      <w:r>
+        <w:rPr>
+          <w:rFonts w:ascii="Montserrat" w:hAnsi="Montserrat"/>
+          <w:u w:val="none"/>
+          <w:lang w:val="es-AR"/>
+        </w:rPr>
+        <w:t>Ejercicio 2.</w:t>
+      </w:r>
+      <w:r>
+        <w:rPr>
+          <w:rFonts w:ascii="Montserrat" w:hAnsi="Montserrat"/>
+          <w:u w:val="none"/>
+          <w:lang w:val="es-AR"/>
+        </w:rPr>
+        <w:t>8</w:t>
+      </w:r>
+      <w:r>
+        <w:rPr>
+          <w:rFonts w:ascii="Montserrat" w:hAnsi="Montserrat"/>
+          <w:u w:val="none"/>
+          <w:lang w:val="es-AR"/>
+        </w:rPr>
+        <w:t>:</w:t>
+      </w:r>
+    </w:p>
+    <w:p>
+      <w:pPr>
+        <w:pStyle w:val="BodyText"/>
+        <w:widowControl/>
+        <w:numPr>
+          <w:ilvl w:val="0"/>
+          <w:numId w:val="12"/>
+        </w:numPr>
+        <w:suppressAutoHyphens w:val="true"/>
+        <w:overflowPunct w:val="false"/>
+        <w:bidi w:val="0"/>
+        <w:spacing w:lineRule="auto" w:line="259" w:before="0" w:after="160"/>
+        <w:jc w:val="start"/>
+        <w:rPr>
+          <w:rFonts w:ascii="Google Sans Flex;Google Sans;Helvetica Neue;sans-serif" w:hAnsi="Google Sans Flex;Google Sans;Helvetica Neue;sans-serif"/>
+          <w:b w:val="false"/>
+          <w:i w:val="false"/>
+          <w:caps w:val="false"/>
+          <w:smallCaps w:val="false"/>
+          <w:color w:val="E3E3E3"/>
+          <w:spacing w:val="0"/>
+          <w:sz w:val="24"/>
+          <w:u w:val="none"/>
+          <w:lang w:val="es-AR"/>
+        </w:rPr>
+      </w:pPr>
+      <w:r>
+        <w:rPr>
+          <w:rFonts w:ascii="Google Sans Flex;Google Sans;Helvetica Neue;sans-serif" w:hAnsi="Google Sans Flex;Google Sans;Helvetica Neue;sans-serif"/>
+          <w:b w:val="false"/>
+          <w:i w:val="false"/>
+          <w:caps w:val="false"/>
+          <w:smallCaps w:val="false"/>
+          <w:color w:val="E3E3E3"/>
+          <w:spacing w:val="0"/>
+          <w:sz w:val="24"/>
+          <w:u w:val="none"/>
+          <w:lang w:val="es-AR"/>
+        </w:rPr>
+        <w:t>Una operación tiene transparencia referencial si:</w:t>
+      </w:r>
+    </w:p>
+    <w:p>
+      <w:pPr>
+        <w:pStyle w:val="BodyText"/>
+        <w:widowControl/>
+        <w:numPr>
+          <w:ilvl w:val="0"/>
+          <w:numId w:val="12"/>
+        </w:numPr>
+        <w:suppressAutoHyphens w:val="true"/>
+        <w:overflowPunct w:val="false"/>
+        <w:bidi w:val="0"/>
+        <w:spacing w:lineRule="auto" w:line="259" w:before="0" w:after="0"/>
+        <w:jc w:val="start"/>
+        <w:rPr>
+          <w:rFonts w:ascii="Google Sans Flex;Google Sans;Helvetica Neue;sans-serif" w:hAnsi="Google Sans Flex;Google Sans;Helvetica Neue;sans-serif"/>
+          <w:lang w:val="es-AR"/>
+        </w:rPr>
+      </w:pPr>
+      <w:r>
+        <w:rPr>
+          <w:rFonts w:ascii="Google Sans Flex;Google Sans;Helvetica Neue;sans-serif" w:hAnsi="Google Sans Flex;Google Sans;Helvetica Neue;sans-serif"/>
+          <w:b w:val="false"/>
+          <w:i w:val="false"/>
+          <w:caps w:val="false"/>
+          <w:smallCaps w:val="false"/>
+          <w:color w:val="E3E3E3"/>
+          <w:spacing w:val="0"/>
+          <w:sz w:val="24"/>
+          <w:lang w:val="es-AR"/>
+        </w:rPr>
+        <w:t>Es determinística: dados los mismos argumentos, arroja las mismas salidas).</w:t>
+      </w:r>
+    </w:p>
+    <w:p>
+      <w:pPr>
+        <w:pStyle w:val="BodyText"/>
+        <w:widowControl/>
+        <w:numPr>
+          <w:ilvl w:val="0"/>
+          <w:numId w:val="12"/>
+        </w:numPr>
+        <w:suppressAutoHyphens w:val="true"/>
+        <w:overflowPunct w:val="false"/>
+        <w:bidi w:val="0"/>
+        <w:spacing w:lineRule="auto" w:line="259" w:before="0" w:after="0"/>
+        <w:jc w:val="start"/>
+        <w:rPr>
+          <w:rFonts w:ascii="Google Sans Flex;Google Sans;Helvetica Neue;sans-serif" w:hAnsi="Google Sans Flex;Google Sans;Helvetica Neue;sans-serif"/>
+          <w:b w:val="false"/>
+          <w:i w:val="false"/>
+          <w:caps w:val="false"/>
+          <w:smallCaps w:val="false"/>
+          <w:color w:val="E3E3E3"/>
+          <w:spacing w:val="0"/>
+          <w:sz w:val="24"/>
+          <w:lang w:val="es-AR"/>
+        </w:rPr>
+      </w:pPr>
+      <w:r>
+        <w:rPr>
+          <w:rFonts w:ascii="Google Sans Flex;Google Sans;Helvetica Neue;sans-serif" w:hAnsi="Google Sans Flex;Google Sans;Helvetica Neue;sans-serif"/>
+          <w:b w:val="false"/>
+          <w:i w:val="false"/>
+          <w:caps w:val="false"/>
+          <w:smallCaps w:val="false"/>
+          <w:color w:val="E3E3E3"/>
+          <w:spacing w:val="0"/>
+          <w:sz w:val="24"/>
+          <w:lang w:val="es-AR"/>
+        </w:rPr>
+        <w:t>Es independiente: no depende del contexto del entorno (variables globales, I/O, tiempo, random, etc.).</w:t>
+      </w:r>
+    </w:p>
+    <w:p>
+      <w:pPr>
+        <w:pStyle w:val="BodyText"/>
+        <w:widowControl/>
+        <w:numPr>
+          <w:ilvl w:val="0"/>
+          <w:numId w:val="12"/>
+        </w:numPr>
+        <w:suppressAutoHyphens w:val="true"/>
+        <w:overflowPunct w:val="false"/>
+        <w:bidi w:val="0"/>
+        <w:spacing w:lineRule="auto" w:line="259" w:before="0" w:after="0"/>
+        <w:jc w:val="start"/>
+        <w:rPr>
+          <w:rFonts w:ascii="Google Sans Flex;Google Sans;Helvetica Neue;sans-serif" w:hAnsi="Google Sans Flex;Google Sans;Helvetica Neue;sans-serif"/>
+          <w:b w:val="false"/>
+          <w:i w:val="false"/>
+          <w:caps w:val="false"/>
+          <w:smallCaps w:val="false"/>
+          <w:color w:val="E3E3E3"/>
+          <w:spacing w:val="0"/>
+          <w:sz w:val="24"/>
+          <w:lang w:val="es-AR"/>
+        </w:rPr>
+      </w:pPr>
+      <w:r>
+        <w:rPr>
+          <w:rFonts w:ascii="Google Sans Flex;Google Sans;Helvetica Neue;sans-serif" w:hAnsi="Google Sans Flex;Google Sans;Helvetica Neue;sans-serif"/>
+          <w:b w:val="false"/>
+          <w:i w:val="false"/>
+          <w:caps w:val="false"/>
+          <w:smallCaps w:val="false"/>
+          <w:color w:val="E3E3E3"/>
+          <w:spacing w:val="0"/>
+          <w:sz w:val="24"/>
+          <w:lang w:val="es-AR"/>
+        </w:rPr>
+        <w:t>No tiene estado (stateless): no lee ni modifica estado mutable compartido.</w:t>
+      </w:r>
+    </w:p>
+    <w:p>
+      <w:pPr>
+        <w:pStyle w:val="BodyText"/>
+        <w:widowControl/>
+        <w:numPr>
+          <w:ilvl w:val="0"/>
+          <w:numId w:val="12"/>
+        </w:numPr>
+        <w:suppressAutoHyphens w:val="true"/>
+        <w:overflowPunct w:val="false"/>
+        <w:bidi w:val="0"/>
+        <w:spacing w:lineRule="auto" w:line="259" w:before="0" w:after="0"/>
+        <w:jc w:val="start"/>
+        <w:rPr>
+          <w:rFonts w:ascii="Google Sans Flex;Google Sans;Helvetica Neue;sans-serif" w:hAnsi="Google Sans Flex;Google Sans;Helvetica Neue;sans-serif"/>
+          <w:lang w:val="es-AR"/>
+        </w:rPr>
+      </w:pPr>
+      <w:r>
+        <w:rPr>
+          <w:rFonts w:ascii="Google Sans Flex;Google Sans;Helvetica Neue;sans-serif" w:hAnsi="Google Sans Flex;Google Sans;Helvetica Neue;sans-serif"/>
+          <w:b w:val="false"/>
+          <w:i w:val="false"/>
+          <w:caps w:val="false"/>
+          <w:smallCaps w:val="false"/>
+          <w:color w:val="E3E3E3"/>
+          <w:spacing w:val="0"/>
+          <w:sz w:val="24"/>
+          <w:lang w:val="es-AR"/>
+        </w:rPr>
+        <w:t>No produce efectos colaterales: no cambia nada observable fuera de la fución.</w:t>
+      </w:r>
+    </w:p>
+    <w:p>
+      <w:pPr>
+        <w:pStyle w:val="BodyText"/>
+        <w:widowControl/>
+        <w:numPr>
+          <w:ilvl w:val="0"/>
+          <w:numId w:val="12"/>
+        </w:numPr>
+        <w:suppressAutoHyphens w:val="true"/>
+        <w:overflowPunct w:val="false"/>
+        <w:bidi w:val="0"/>
+        <w:spacing w:lineRule="auto" w:line="259" w:before="0" w:after="0"/>
+        <w:jc w:val="start"/>
+        <w:rPr>
+          <w:rFonts w:ascii="Google Sans Flex;Google Sans;Helvetica Neue;sans-serif" w:hAnsi="Google Sans Flex;Google Sans;Helvetica Neue;sans-serif"/>
+          <w:b w:val="false"/>
+          <w:i w:val="false"/>
+          <w:caps w:val="false"/>
+          <w:smallCaps w:val="false"/>
+          <w:color w:val="E3E3E3"/>
+          <w:spacing w:val="0"/>
+          <w:sz w:val="24"/>
+          <w:lang w:val="es-AR"/>
+        </w:rPr>
+      </w:pPr>
+      <w:r>
+        <w:rPr>
+          <w:rFonts w:ascii="Google Sans Flex;Google Sans;Helvetica Neue;sans-serif" w:hAnsi="Google Sans Flex;Google Sans;Helvetica Neue;sans-serif"/>
+          <w:b w:val="false"/>
+          <w:i w:val="false"/>
+          <w:caps w:val="false"/>
+          <w:smallCaps w:val="false"/>
+          <w:color w:val="E3E3E3"/>
+          <w:spacing w:val="0"/>
+          <w:sz w:val="24"/>
+          <w:lang w:val="es-AR"/>
+        </w:rPr>
+        <w:t>No posee asignación destructiva: reemplazar el valor de una variable por otro valor.</w:t>
+      </w:r>
+    </w:p>
+    <w:p>
+      <w:pPr>
+        <w:pStyle w:val="BodyText"/>
+        <w:widowControl/>
+        <w:suppressAutoHyphens w:val="true"/>
+        <w:overflowPunct w:val="false"/>
+        <w:bidi w:val="0"/>
+        <w:spacing w:lineRule="auto" w:line="259" w:before="0" w:after="0"/>
+        <w:jc w:val="start"/>
+        <w:rPr>
+          <w:rFonts w:ascii="Google Sans Flex;Google Sans;Helvetica Neue;sans-serif" w:hAnsi="Google Sans Flex;Google Sans;Helvetica Neue;sans-serif"/>
+          <w:b w:val="false"/>
+          <w:i w:val="false"/>
+          <w:caps w:val="false"/>
+          <w:smallCaps w:val="false"/>
+          <w:color w:val="E3E3E3"/>
+          <w:spacing w:val="0"/>
+          <w:sz w:val="24"/>
+          <w:lang w:val="es-AR"/>
+        </w:rPr>
+      </w:pPr>
+      <w:r>
+        <w:rPr>
+          <w:rFonts w:ascii="Google Sans Flex;Google Sans;Helvetica Neue;sans-serif" w:hAnsi="Google Sans Flex;Google Sans;Helvetica Neue;sans-serif"/>
+          <w:b w:val="false"/>
+          <w:i w:val="false"/>
+          <w:caps w:val="false"/>
+          <w:smallCaps w:val="false"/>
+          <w:color w:val="E3E3E3"/>
+          <w:spacing w:val="0"/>
+          <w:sz w:val="24"/>
+          <w:lang w:val="es-AR"/>
+        </w:rPr>
+        <w:t>Ejercicio 2.9:</w:t>
+      </w:r>
+    </w:p>
+    <w:p>
+      <w:pPr>
+        <w:pStyle w:val="BodyText"/>
+        <w:widowControl/>
+        <w:suppressAutoHyphens w:val="true"/>
+        <w:overflowPunct w:val="false"/>
+        <w:bidi w:val="0"/>
+        <w:spacing w:lineRule="auto" w:line="259" w:before="0" w:after="0"/>
+        <w:ind w:hanging="0" w:start="720" w:end="0"/>
+        <w:jc w:val="start"/>
+        <w:rPr>
+          <w:rFonts w:ascii="Google Sans Flex;Google Sans;Helvetica Neue;sans-serif" w:hAnsi="Google Sans Flex;Google Sans;Helvetica Neue;sans-serif"/>
+          <w:b w:val="false"/>
+          <w:i w:val="false"/>
+          <w:caps w:val="false"/>
+          <w:smallCaps w:val="false"/>
+          <w:color w:val="E3E3E3"/>
+          <w:spacing w:val="0"/>
+          <w:sz w:val="24"/>
+          <w:lang w:val="es-AR"/>
+        </w:rPr>
+      </w:pPr>
+      <w:r>
+        <w:rPr>
+          <w:rFonts w:ascii="Google Sans Flex;Google Sans;Helvetica Neue;sans-serif" w:hAnsi="Google Sans Flex;Google Sans;Helvetica Neue;sans-serif"/>
+          <w:b w:val="false"/>
+          <w:i w:val="false"/>
+          <w:caps w:val="false"/>
+          <w:smallCaps w:val="false"/>
+          <w:color w:val="E3E3E3"/>
+          <w:spacing w:val="0"/>
+          <w:sz w:val="24"/>
+          <w:lang w:val="es-AR"/>
+        </w:rPr>
+      </w:r>
+    </w:p>
+    <w:p>
+      <w:pPr>
+        <w:pStyle w:val="Normal"/>
+        <w:widowControl/>
+        <w:suppressAutoHyphens w:val="true"/>
+        <w:overflowPunct w:val="false"/>
+        <w:bidi w:val="0"/>
+        <w:spacing w:lineRule="auto" w:line="259" w:before="0" w:after="160"/>
+        <w:ind w:hanging="0" w:start="720" w:end="0"/>
+        <w:jc w:val="start"/>
+        <w:rPr>
+          <w:rFonts w:ascii="Montserrat" w:hAnsi="Montserrat"/>
+          <w:u w:val="none"/>
+          <w:lang w:val="es-AR"/>
+        </w:rPr>
+      </w:pPr>
+      <w:r>
+        <w:rPr>
+          <w:rFonts w:ascii="Montserrat" w:hAnsi="Montserrat"/>
+          <w:u w:val="none"/>
+          <w:lang w:val="es-AR"/>
+        </w:rPr>
+        <w:t>d) Todas son verdaderas.</w:t>
+      </w:r>
+    </w:p>
+    <w:p>
+      <w:pPr>
+        <w:pStyle w:val="Normal"/>
+        <w:widowControl/>
+        <w:suppressAutoHyphens w:val="true"/>
+        <w:overflowPunct w:val="false"/>
+        <w:bidi w:val="0"/>
+        <w:spacing w:lineRule="auto" w:line="259" w:before="0" w:after="160"/>
+        <w:ind w:hanging="0" w:start="720" w:end="0"/>
+        <w:jc w:val="start"/>
+        <w:rPr>
+          <w:rFonts w:ascii="Montserrat" w:hAnsi="Montserrat"/>
+          <w:u w:val="none"/>
+          <w:lang w:val="es-AR"/>
+        </w:rPr>
+      </w:pPr>
+      <w:r>
+        <w:rPr>
+          <w:rFonts w:ascii="Montserrat" w:hAnsi="Montserrat"/>
+          <w:u w:val="none"/>
+          <w:lang w:val="es-AR"/>
+        </w:rPr>
+      </w:r>
+    </w:p>
+    <w:p>
+      <w:pPr>
+        <w:pStyle w:val="Normal"/>
+        <w:widowControl/>
+        <w:suppressAutoHyphens w:val="true"/>
+        <w:overflowPunct w:val="false"/>
+        <w:bidi w:val="0"/>
+        <w:spacing w:lineRule="auto" w:line="259" w:before="0" w:after="160"/>
+        <w:ind w:hanging="0" w:start="0" w:end="0"/>
+        <w:jc w:val="start"/>
+        <w:rPr>
+          <w:rFonts w:ascii="Montserrat" w:hAnsi="Montserrat"/>
+          <w:u w:val="none"/>
+          <w:lang w:val="es-AR"/>
+        </w:rPr>
+      </w:pPr>
+      <w:r>
+        <w:rPr>
+          <w:rFonts w:ascii="Montserrat" w:hAnsi="Montserrat"/>
+          <w:u w:val="none"/>
+          <w:lang w:val="es-AR"/>
+        </w:rPr>
+        <w:t>Ejercicio 2.10:</w:t>
+      </w:r>
+    </w:p>
+    <w:p>
+      <w:pPr>
+        <w:pStyle w:val="Normal"/>
+        <w:ind w:hanging="0" w:start="720" w:end="0"/>
+        <w:rPr/>
+      </w:pPr>
+      <w:r>
+        <w:rPr>
+          <w:rFonts w:ascii="Montserrat" w:hAnsi="Montserrat"/>
+          <w:u w:val="none"/>
+          <w:lang w:val="es-AR"/>
+        </w:rPr>
+        <w:t>VERDADERO.</w:t>
+      </w:r>
+    </w:p>
+    <w:p>
+      <w:pPr>
+        <w:pStyle w:val="BodyText"/>
+        <w:numPr>
+          <w:ilvl w:val="1"/>
+          <w:numId w:val="13"/>
+        </w:numPr>
+        <w:tabs>
+          <w:tab w:val="clear" w:pos="708"/>
+          <w:tab w:val="left" w:pos="0" w:leader="none"/>
+        </w:tabs>
+        <w:spacing w:lineRule="auto" w:line="259" w:before="0" w:after="160"/>
+        <w:ind w:hanging="283" w:start="1418"/>
+        <w:rPr/>
+      </w:pPr>
+      <w:r>
+        <w:rPr>
+          <w:rFonts w:eastAsia="SimSun" w:ascii="Montserrat" w:hAnsi="Montserrat"/>
+          <w:b w:val="false"/>
+          <w:bCs w:val="false"/>
+          <w:color w:val="auto"/>
+          <w:kern w:val="0"/>
+          <w:sz w:val="22"/>
+          <w:szCs w:val="22"/>
+          <w:u w:val="none"/>
+          <w:lang w:val="es-AR" w:eastAsia="en-US" w:bidi="ar-SA"/>
+        </w:rPr>
+        <w:t>L</w:t>
+      </w:r>
+      <w:r>
+        <w:rPr>
+          <w:rFonts w:eastAsia="SimSun" w:ascii="Montserrat" w:hAnsi="Montserrat"/>
+          <w:color w:val="auto"/>
+          <w:kern w:val="0"/>
+          <w:sz w:val="22"/>
+          <w:szCs w:val="22"/>
+          <w:u w:val="none"/>
+          <w:lang w:val="es-AR" w:eastAsia="en-US" w:bidi="ar-SA"/>
+        </w:rPr>
+        <w:t xml:space="preserve">istas (Homogéneas): En Haskell, una lista es una estructura de datos de longitud variable, pero todos sus elementos deben ser estrictamente del mismo tipo (por ejemplo, una lista de enteros </w:t>
+      </w:r>
+      <w:r>
+        <w:rPr>
+          <w:rStyle w:val="SourceText"/>
+          <w:rFonts w:eastAsia="SimSun" w:ascii="Montserrat" w:hAnsi="Montserrat"/>
+          <w:color w:val="auto"/>
+          <w:kern w:val="0"/>
+          <w:sz w:val="22"/>
+          <w:szCs w:val="22"/>
+          <w:u w:val="none"/>
+          <w:lang w:val="es-AR" w:eastAsia="en-US" w:bidi="ar-SA"/>
+        </w:rPr>
+        <w:t>[Int]</w:t>
+      </w:r>
+      <w:r>
+        <w:rPr>
+          <w:rFonts w:eastAsia="SimSun" w:ascii="Montserrat" w:hAnsi="Montserrat"/>
+          <w:color w:val="auto"/>
+          <w:kern w:val="0"/>
+          <w:sz w:val="22"/>
+          <w:szCs w:val="22"/>
+          <w:u w:val="none"/>
+          <w:lang w:val="es-AR" w:eastAsia="en-US" w:bidi="ar-SA"/>
+        </w:rPr>
+        <w:t xml:space="preserve"> o una lista de caracteres </w:t>
+      </w:r>
+      <w:r>
+        <w:rPr>
+          <w:rStyle w:val="SourceText"/>
+          <w:rFonts w:eastAsia="SimSun" w:ascii="Montserrat" w:hAnsi="Montserrat"/>
+          <w:color w:val="auto"/>
+          <w:kern w:val="0"/>
+          <w:sz w:val="22"/>
+          <w:szCs w:val="22"/>
+          <w:u w:val="none"/>
+          <w:lang w:val="es-AR" w:eastAsia="en-US" w:bidi="ar-SA"/>
+        </w:rPr>
+        <w:t>[Char]</w:t>
+      </w:r>
+      <w:r>
+        <w:rPr>
+          <w:rFonts w:eastAsia="SimSun" w:ascii="Montserrat" w:hAnsi="Montserrat"/>
+          <w:color w:val="auto"/>
+          <w:kern w:val="0"/>
+          <w:sz w:val="22"/>
+          <w:szCs w:val="22"/>
+          <w:u w:val="none"/>
+          <w:lang w:val="es-AR" w:eastAsia="en-US" w:bidi="ar-SA"/>
+        </w:rPr>
+        <w:t xml:space="preserve">). El sistema de tipos necesita que sean homogéneas para poder iterar sobre ellas de forma segura mediante recursividad o funciones como </w:t>
+      </w:r>
+      <w:r>
+        <w:rPr>
+          <w:rStyle w:val="SourceText"/>
+          <w:rFonts w:eastAsia="SimSun" w:ascii="Montserrat" w:hAnsi="Montserrat"/>
+          <w:color w:val="auto"/>
+          <w:kern w:val="0"/>
+          <w:sz w:val="22"/>
+          <w:szCs w:val="22"/>
+          <w:u w:val="none"/>
+          <w:lang w:val="es-AR" w:eastAsia="en-US" w:bidi="ar-SA"/>
+        </w:rPr>
+        <w:t>map</w:t>
+      </w:r>
+      <w:r>
+        <w:rPr>
+          <w:rFonts w:eastAsia="SimSun" w:ascii="Montserrat" w:hAnsi="Montserrat"/>
+          <w:color w:val="auto"/>
+          <w:kern w:val="0"/>
+          <w:sz w:val="22"/>
+          <w:szCs w:val="22"/>
+          <w:u w:val="none"/>
+          <w:lang w:val="es-AR" w:eastAsia="en-US" w:bidi="ar-SA"/>
+        </w:rPr>
+        <w:t>, garantizando que la operación aplicada sea válida para cualquier elemento sin importar la longitud de la lista.</w:t>
+      </w:r>
+    </w:p>
+    <w:p>
+      <w:pPr>
+        <w:pStyle w:val="BodyText"/>
+        <w:numPr>
+          <w:ilvl w:val="2"/>
+          <w:numId w:val="13"/>
+        </w:numPr>
+        <w:tabs>
+          <w:tab w:val="clear" w:pos="708"/>
+          <w:tab w:val="left" w:pos="0" w:leader="none"/>
+        </w:tabs>
+        <w:spacing w:lineRule="auto" w:line="259" w:before="0" w:after="160"/>
+        <w:ind w:hanging="283" w:start="2127"/>
+        <w:rPr/>
+      </w:pPr>
+      <w:r>
+        <w:rPr>
+          <w:rFonts w:eastAsia="SimSun" w:ascii="Montserrat" w:hAnsi="Montserrat"/>
+          <w:b w:val="false"/>
+          <w:bCs w:val="false"/>
+          <w:i w:val="false"/>
+          <w:iCs w:val="false"/>
+          <w:color w:val="auto"/>
+          <w:kern w:val="0"/>
+          <w:sz w:val="22"/>
+          <w:szCs w:val="22"/>
+          <w:u w:val="none"/>
+          <w:lang w:val="es-AR" w:eastAsia="en-US" w:bidi="ar-SA"/>
+        </w:rPr>
+        <w:t>E</w:t>
+      </w:r>
+      <w:r>
+        <w:rPr>
+          <w:rFonts w:eastAsia="SimSun" w:ascii="Montserrat" w:hAnsi="Montserrat"/>
+          <w:i w:val="false"/>
+          <w:iCs w:val="false"/>
+          <w:color w:val="auto"/>
+          <w:kern w:val="0"/>
+          <w:sz w:val="22"/>
+          <w:szCs w:val="22"/>
+          <w:u w:val="none"/>
+          <w:lang w:val="es-AR" w:eastAsia="en-US" w:bidi="ar-SA"/>
+        </w:rPr>
+        <w:t>jemplo</w:t>
+      </w:r>
+      <w:r>
+        <w:rPr>
+          <w:rFonts w:eastAsia="SimSun" w:ascii="Montserrat" w:hAnsi="Montserrat"/>
+          <w:color w:val="auto"/>
+          <w:kern w:val="0"/>
+          <w:sz w:val="22"/>
+          <w:szCs w:val="22"/>
+          <w:u w:val="none"/>
+          <w:lang w:val="es-AR" w:eastAsia="en-US" w:bidi="ar-SA"/>
+        </w:rPr>
+        <w:t xml:space="preserve"> válido: </w:t>
+      </w:r>
+      <w:r>
+        <w:rPr>
+          <w:rStyle w:val="SourceText"/>
+          <w:rFonts w:eastAsia="SimSun" w:ascii="Montserrat" w:hAnsi="Montserrat"/>
+          <w:color w:val="auto"/>
+          <w:kern w:val="0"/>
+          <w:sz w:val="22"/>
+          <w:szCs w:val="22"/>
+          <w:u w:val="none"/>
+          <w:lang w:val="es-AR" w:eastAsia="en-US" w:bidi="ar-SA"/>
+        </w:rPr>
+        <w:t>[1, 2, 3]</w:t>
+      </w:r>
+    </w:p>
+    <w:p>
+      <w:pPr>
+        <w:pStyle w:val="BodyText"/>
+        <w:numPr>
+          <w:ilvl w:val="2"/>
+          <w:numId w:val="13"/>
+        </w:numPr>
+        <w:tabs>
+          <w:tab w:val="clear" w:pos="708"/>
+          <w:tab w:val="left" w:pos="0" w:leader="none"/>
+        </w:tabs>
+        <w:spacing w:lineRule="auto" w:line="259" w:before="0" w:after="160"/>
+        <w:ind w:hanging="283" w:start="2127"/>
+        <w:rPr/>
+      </w:pPr>
+      <w:r>
+        <w:rPr>
+          <w:rFonts w:eastAsia="SimSun" w:ascii="Montserrat" w:hAnsi="Montserrat"/>
+          <w:i w:val="false"/>
+          <w:iCs w:val="false"/>
+          <w:color w:val="auto"/>
+          <w:kern w:val="0"/>
+          <w:sz w:val="22"/>
+          <w:szCs w:val="22"/>
+          <w:lang w:val="es-AR" w:eastAsia="en-US" w:bidi="ar-SA"/>
+        </w:rPr>
+        <w:t>E</w:t>
+      </w:r>
+      <w:r>
+        <w:rPr>
+          <w:rFonts w:eastAsia="SimSun" w:ascii="Montserrat" w:hAnsi="Montserrat"/>
+          <w:color w:val="auto"/>
+          <w:kern w:val="0"/>
+          <w:sz w:val="22"/>
+          <w:szCs w:val="22"/>
+          <w:lang w:val="es-AR" w:eastAsia="en-US" w:bidi="ar-SA"/>
+        </w:rPr>
+        <w:t xml:space="preserve">jemplo inválido: </w:t>
+      </w:r>
+      <w:r>
+        <w:rPr>
+          <w:rStyle w:val="SourceText"/>
+          <w:rFonts w:eastAsia="SimSun" w:ascii="Montserrat" w:hAnsi="Montserrat"/>
+          <w:color w:val="auto"/>
+          <w:kern w:val="0"/>
+          <w:sz w:val="22"/>
+          <w:szCs w:val="22"/>
+          <w:lang w:val="es-AR" w:eastAsia="en-US" w:bidi="ar-SA"/>
+        </w:rPr>
+        <w:t>[1, 'A', True]</w:t>
+      </w:r>
+      <w:r>
+        <w:rPr>
+          <w:rFonts w:eastAsia="SimSun" w:ascii="Montserrat" w:hAnsi="Montserrat"/>
+          <w:color w:val="auto"/>
+          <w:kern w:val="0"/>
+          <w:sz w:val="22"/>
+          <w:szCs w:val="22"/>
+          <w:lang w:val="es-AR" w:eastAsia="en-US" w:bidi="ar-SA"/>
+        </w:rPr>
+        <w:t xml:space="preserve"> (El compilador arrojará un error de tipo).</w:t>
+      </w:r>
+    </w:p>
+    <w:p>
+      <w:pPr>
+        <w:pStyle w:val="BodyText"/>
+        <w:numPr>
+          <w:ilvl w:val="1"/>
+          <w:numId w:val="13"/>
+        </w:numPr>
+        <w:tabs>
+          <w:tab w:val="clear" w:pos="708"/>
+          <w:tab w:val="left" w:pos="0" w:leader="none"/>
+        </w:tabs>
+        <w:spacing w:lineRule="auto" w:line="259" w:before="0" w:after="160"/>
+        <w:ind w:hanging="283" w:start="1418"/>
+        <w:rPr/>
+      </w:pPr>
+      <w:r>
+        <w:rPr>
+          <w:rFonts w:ascii="Montserrat" w:hAnsi="Montserrat"/>
+          <w:b w:val="false"/>
+          <w:bCs w:val="false"/>
+          <w:lang w:val="es-AR"/>
+        </w:rPr>
+        <w:t>T</w:t>
+      </w:r>
+      <w:r>
+        <w:rPr>
+          <w:rFonts w:eastAsia="SimSun" w:ascii="Montserrat" w:hAnsi="Montserrat"/>
+          <w:color w:val="auto"/>
+          <w:kern w:val="0"/>
+          <w:sz w:val="22"/>
+          <w:szCs w:val="22"/>
+          <w:lang w:val="es-AR" w:eastAsia="en-US" w:bidi="ar-SA"/>
+        </w:rPr>
+        <w:t>uplas (Heterogéneas): Las tuplas, por el contrario, son estructuras de longitud fija (aridad fija) donde cada posición puede contener un tipo de dato diferente. Como el tamaño de la tupla y el tipo exacto de cada una de sus posiciones se conocen en tiempo de compilación, el sistema de tipos de Haskell puede mantener el rastro de qué tipo hay en cada lugar de forma estática y segura.</w:t>
+      </w:r>
+    </w:p>
+    <w:p>
+      <w:pPr>
+        <w:pStyle w:val="BodyText"/>
+        <w:numPr>
+          <w:ilvl w:val="2"/>
+          <w:numId w:val="13"/>
+        </w:numPr>
+        <w:tabs>
+          <w:tab w:val="clear" w:pos="708"/>
+          <w:tab w:val="left" w:pos="0" w:leader="none"/>
+        </w:tabs>
+        <w:spacing w:lineRule="auto" w:line="259" w:before="0" w:after="160"/>
+        <w:ind w:hanging="283" w:start="2127"/>
+        <w:rPr/>
+      </w:pPr>
+      <w:r>
+        <w:rPr>
+          <w:rFonts w:eastAsia="SimSun" w:ascii="Montserrat" w:hAnsi="Montserrat"/>
+          <w:i w:val="false"/>
+          <w:iCs w:val="false"/>
+          <w:color w:val="auto"/>
+          <w:kern w:val="0"/>
+          <w:sz w:val="22"/>
+          <w:szCs w:val="22"/>
+          <w:lang w:val="es-AR" w:eastAsia="en-US" w:bidi="ar-SA"/>
+        </w:rPr>
+        <w:t>E</w:t>
+      </w:r>
+      <w:r>
+        <w:rPr>
+          <w:rFonts w:eastAsia="SimSun" w:ascii="Montserrat" w:hAnsi="Montserrat"/>
+          <w:i w:val="false"/>
+          <w:iCs w:val="false"/>
+          <w:color w:val="auto"/>
+          <w:kern w:val="0"/>
+          <w:sz w:val="22"/>
+          <w:szCs w:val="22"/>
+          <w:lang w:val="es-AR" w:eastAsia="en-US" w:bidi="ar-SA"/>
+        </w:rPr>
+        <w:t>j</w:t>
+      </w:r>
+      <w:r>
+        <w:rPr>
+          <w:rFonts w:eastAsia="SimSun" w:ascii="Montserrat" w:hAnsi="Montserrat"/>
+          <w:color w:val="auto"/>
+          <w:kern w:val="0"/>
+          <w:sz w:val="22"/>
+          <w:szCs w:val="22"/>
+          <w:lang w:val="es-AR" w:eastAsia="en-US" w:bidi="ar-SA"/>
+        </w:rPr>
+        <w:t xml:space="preserve">emplo válido: </w:t>
+      </w:r>
+      <w:r>
+        <w:rPr>
+          <w:rStyle w:val="SourceText"/>
+          <w:rFonts w:eastAsia="SimSun" w:ascii="Montserrat" w:hAnsi="Montserrat"/>
+          <w:color w:val="auto"/>
+          <w:kern w:val="0"/>
+          <w:sz w:val="22"/>
+          <w:szCs w:val="22"/>
+          <w:lang w:val="es-AR" w:eastAsia="en-US" w:bidi="ar-SA"/>
+        </w:rPr>
+        <w:t>(1, 'A', True)</w:t>
+      </w:r>
+      <w:r>
+        <w:rPr>
+          <w:rFonts w:eastAsia="SimSun" w:ascii="Montserrat" w:hAnsi="Montserrat"/>
+          <w:color w:val="auto"/>
+          <w:kern w:val="0"/>
+          <w:sz w:val="22"/>
+          <w:szCs w:val="22"/>
+          <w:lang w:val="es-AR" w:eastAsia="en-US" w:bidi="ar-SA"/>
+        </w:rPr>
+        <w:t xml:space="preserve"> (Su tipo inferido sería </w:t>
+      </w:r>
+    </w:p>
+    <w:p>
+      <w:pPr>
+        <w:pStyle w:val="BodyText"/>
+        <w:numPr>
+          <w:ilvl w:val="0"/>
+          <w:numId w:val="0"/>
+        </w:numPr>
+        <w:spacing w:lineRule="auto" w:line="259" w:before="0" w:after="160"/>
+        <w:ind w:hanging="0" w:start="0"/>
+        <w:rPr/>
+      </w:pPr>
+      <w:r>
+        <w:rPr>
+          <w:rStyle w:val="SourceText"/>
+          <w:rFonts w:eastAsia="SimSun" w:ascii="Montserrat" w:hAnsi="Montserrat"/>
+          <w:color w:val="auto"/>
+          <w:kern w:val="0"/>
+          <w:sz w:val="22"/>
+          <w:szCs w:val="22"/>
+          <w:lang w:val="es-AR" w:eastAsia="en-US" w:bidi="ar-SA"/>
+        </w:rPr>
+        <w:t>(Num a =&gt; a, Char, Bool)</w:t>
+      </w:r>
+      <w:r>
+        <w:rPr>
+          <w:rFonts w:eastAsia="SimSun" w:ascii="Montserrat" w:hAnsi="Montserrat"/>
+          <w:color w:val="auto"/>
+          <w:kern w:val="0"/>
+          <w:sz w:val="22"/>
+          <w:szCs w:val="22"/>
+          <w:lang w:val="es-AR" w:eastAsia="en-US" w:bidi="ar-SA"/>
+        </w:rPr>
+        <w:t>).</w:t>
+      </w:r>
+    </w:p>
+    <w:p>
+      <w:pPr>
+        <w:pStyle w:val="BodyText"/>
+        <w:spacing w:lineRule="auto" w:line="259" w:before="0" w:after="160"/>
+        <w:rPr>
+          <w:rFonts w:ascii="Montserrat" w:hAnsi="Montserrat" w:eastAsia="SimSun"/>
+          <w:color w:val="auto"/>
+          <w:kern w:val="0"/>
+          <w:sz w:val="22"/>
+          <w:szCs w:val="22"/>
+          <w:lang w:val="es-AR" w:eastAsia="en-US" w:bidi="ar-SA"/>
+        </w:rPr>
+      </w:pPr>
+      <w:r>
+        <w:rPr>
+          <w:rFonts w:eastAsia="SimSun" w:ascii="Montserrat" w:hAnsi="Montserrat"/>
+          <w:color w:val="auto"/>
+          <w:kern w:val="0"/>
+          <w:sz w:val="22"/>
+          <w:szCs w:val="22"/>
+          <w:lang w:val="es-AR" w:eastAsia="en-US" w:bidi="ar-SA"/>
+        </w:rPr>
+      </w:r>
+    </w:p>
+    <w:p>
+      <w:pPr>
+        <w:pStyle w:val="BodyText"/>
+        <w:spacing w:lineRule="auto" w:line="259" w:before="0" w:after="160"/>
+        <w:rPr>
+          <w:rFonts w:ascii="Montserrat" w:hAnsi="Montserrat" w:eastAsia="SimSun"/>
+          <w:color w:val="auto"/>
+          <w:kern w:val="0"/>
+          <w:sz w:val="22"/>
+          <w:szCs w:val="22"/>
+          <w:lang w:val="es-AR" w:eastAsia="en-US" w:bidi="ar-SA"/>
+        </w:rPr>
+      </w:pPr>
+      <w:r>
+        <w:rPr>
+          <w:rFonts w:eastAsia="SimSun" w:ascii="Montserrat" w:hAnsi="Montserrat"/>
+          <w:color w:val="auto"/>
+          <w:kern w:val="0"/>
+          <w:sz w:val="22"/>
+          <w:szCs w:val="22"/>
+          <w:lang w:val="es-AR" w:eastAsia="en-US" w:bidi="ar-SA"/>
+        </w:rPr>
+        <w:t>Ejercicio 2.11:</w:t>
+      </w:r>
+    </w:p>
+    <w:p>
+      <w:pPr>
+        <w:pStyle w:val="BodyText"/>
+        <w:widowControl/>
+        <w:suppressAutoHyphens w:val="true"/>
+        <w:overflowPunct w:val="false"/>
+        <w:bidi w:val="0"/>
+        <w:spacing w:lineRule="auto" w:line="259" w:before="0" w:after="160"/>
+        <w:ind w:hanging="0" w:start="720" w:end="0"/>
+        <w:jc w:val="start"/>
+        <w:rPr>
+          <w:rFonts w:ascii="Montserrat" w:hAnsi="Montserrat" w:eastAsia="SimSun"/>
+          <w:color w:val="auto"/>
+          <w:kern w:val="0"/>
+          <w:sz w:val="22"/>
+          <w:szCs w:val="22"/>
+          <w:u w:val="none"/>
+          <w:lang w:val="es-AR" w:eastAsia="en-US" w:bidi="ar-SA"/>
+        </w:rPr>
+      </w:pPr>
+      <w:r>
+        <w:rPr>
+          <w:rFonts w:eastAsia="SimSun" w:ascii="Montserrat" w:hAnsi="Montserrat"/>
+          <w:color w:val="auto"/>
+          <w:kern w:val="0"/>
+          <w:sz w:val="22"/>
+          <w:szCs w:val="22"/>
+          <w:u w:val="none"/>
+          <w:lang w:val="es-AR" w:eastAsia="en-US" w:bidi="ar-SA"/>
+        </w:rPr>
+        <w:t xml:space="preserve">NO están permitidas las tuplas de longitud </w:t>
+      </w:r>
+      <w:r>
+        <w:rPr>
+          <w:rFonts w:eastAsia="SimSun" w:ascii="Montserrat" w:hAnsi="Montserrat"/>
+          <w:color w:val="auto"/>
+          <w:kern w:val="0"/>
+          <w:sz w:val="22"/>
+          <w:szCs w:val="22"/>
+          <w:u w:val="none"/>
+          <w:lang w:val="es-AR" w:eastAsia="en-US" w:bidi="ar-SA"/>
+        </w:rPr>
+        <w:t>1</w:t>
+      </w:r>
+      <w:r>
+        <w:rPr>
+          <w:rFonts w:eastAsia="SimSun" w:ascii="Montserrat" w:hAnsi="Montserrat"/>
+          <w:color w:val="auto"/>
+          <w:kern w:val="0"/>
+          <w:sz w:val="22"/>
+          <w:szCs w:val="22"/>
+          <w:u w:val="none"/>
+          <w:lang w:val="es-AR" w:eastAsia="en-US" w:bidi="ar-SA"/>
+        </w:rPr>
+        <w:t>, por lo que la respuesta es Verdadero. La tupla de ariedad 0 es la tupla vacía (). Los paréntesis alrededor de un solo elemento se utilizan para agrupar expresiones y definir la prioridad de evaluación, por lo que si nosotros escribimos, por ejemplo (10) Haskell lo interpreta como un 10 entre paréntesis, no como una tupla de 1 elemento.</w:t>
+      </w:r>
+    </w:p>
+    <w:p>
+      <w:pPr>
+        <w:pStyle w:val="BodyText"/>
+        <w:widowControl/>
+        <w:suppressAutoHyphens w:val="true"/>
+        <w:overflowPunct w:val="false"/>
+        <w:bidi w:val="0"/>
+        <w:spacing w:lineRule="auto" w:line="259" w:before="0" w:after="160"/>
+        <w:ind w:hanging="0" w:start="720" w:end="0"/>
+        <w:jc w:val="start"/>
+        <w:rPr>
+          <w:rFonts w:ascii="Montserrat" w:hAnsi="Montserrat" w:eastAsia="SimSun"/>
+          <w:color w:val="auto"/>
+          <w:kern w:val="0"/>
+          <w:sz w:val="22"/>
+          <w:szCs w:val="22"/>
+          <w:u w:val="none"/>
+          <w:lang w:val="es-AR" w:eastAsia="en-US" w:bidi="ar-SA"/>
+        </w:rPr>
+      </w:pPr>
+      <w:r>
+        <w:rPr>
+          <w:rFonts w:eastAsia="SimSun" w:ascii="Montserrat" w:hAnsi="Montserrat"/>
+          <w:color w:val="auto"/>
+          <w:kern w:val="0"/>
+          <w:sz w:val="22"/>
+          <w:szCs w:val="22"/>
+          <w:u w:val="none"/>
+          <w:lang w:val="es-AR" w:eastAsia="en-US" w:bidi="ar-SA"/>
+        </w:rPr>
+      </w:r>
+    </w:p>
+    <w:p>
+      <w:pPr>
+        <w:pStyle w:val="BodyText"/>
+        <w:spacing w:lineRule="auto" w:line="259" w:before="0" w:after="160"/>
+        <w:rPr>
+          <w:rFonts w:ascii="Montserrat" w:hAnsi="Montserrat" w:eastAsia="SimSun"/>
+          <w:color w:val="auto"/>
+          <w:kern w:val="0"/>
+          <w:sz w:val="22"/>
+          <w:szCs w:val="22"/>
+          <w:lang w:val="es-AR" w:eastAsia="en-US" w:bidi="ar-SA"/>
+        </w:rPr>
+      </w:pPr>
+      <w:r>
+        <w:rPr>
+          <w:rFonts w:eastAsia="SimSun" w:ascii="Montserrat" w:hAnsi="Montserrat"/>
+          <w:color w:val="auto"/>
+          <w:kern w:val="0"/>
+          <w:sz w:val="22"/>
+          <w:szCs w:val="22"/>
+          <w:lang w:val="es-AR" w:eastAsia="en-US" w:bidi="ar-SA"/>
+        </w:rPr>
+      </w:r>
+    </w:p>
+    <w:p>
+      <w:pPr>
+        <w:pStyle w:val="BodyText"/>
+        <w:spacing w:lineRule="auto" w:line="259" w:before="0" w:after="160"/>
+        <w:rPr>
+          <w:rFonts w:ascii="Montserrat" w:hAnsi="Montserrat" w:eastAsia="SimSun"/>
+          <w:color w:val="auto"/>
+          <w:kern w:val="0"/>
+          <w:sz w:val="22"/>
+          <w:szCs w:val="22"/>
+          <w:lang w:val="es-AR" w:eastAsia="en-US" w:bidi="ar-SA"/>
+        </w:rPr>
+      </w:pPr>
+      <w:r>
+        <w:rPr>
+          <w:rFonts w:eastAsia="SimSun" w:ascii="Montserrat" w:hAnsi="Montserrat"/>
+          <w:color w:val="auto"/>
+          <w:kern w:val="0"/>
+          <w:sz w:val="22"/>
+          <w:szCs w:val="22"/>
+          <w:lang w:val="es-AR" w:eastAsia="en-US" w:bidi="ar-SA"/>
+        </w:rPr>
+      </w:r>
+    </w:p>
+    <w:p>
+      <w:pPr>
+        <w:pStyle w:val="BodyText"/>
+        <w:spacing w:lineRule="auto" w:line="259" w:before="0" w:after="160"/>
+        <w:rPr>
+          <w:rFonts w:ascii="Montserrat" w:hAnsi="Montserrat" w:eastAsia="SimSun"/>
+          <w:color w:val="auto"/>
+          <w:kern w:val="0"/>
+          <w:sz w:val="22"/>
+          <w:szCs w:val="22"/>
+          <w:lang w:val="es-AR" w:eastAsia="en-US" w:bidi="ar-SA"/>
+        </w:rPr>
+      </w:pPr>
+      <w:r>
+        <w:rPr>
+          <w:rFonts w:eastAsia="SimSun" w:ascii="Montserrat" w:hAnsi="Montserrat"/>
+          <w:color w:val="auto"/>
+          <w:kern w:val="0"/>
+          <w:sz w:val="22"/>
+          <w:szCs w:val="22"/>
+          <w:lang w:val="es-AR" w:eastAsia="en-US" w:bidi="ar-SA"/>
+        </w:rPr>
+      </w:r>
+    </w:p>
+    <w:p>
+      <w:pPr>
+        <w:pStyle w:val="BodyText"/>
+        <w:spacing w:lineRule="auto" w:line="259" w:before="0" w:after="160"/>
+        <w:rPr>
+          <w:rFonts w:ascii="Montserrat" w:hAnsi="Montserrat"/>
+          <w:color w:val="auto"/>
+          <w:sz w:val="22"/>
+          <w:lang w:val="es-AR"/>
+        </w:rPr>
+      </w:pPr>
+      <w:r>
+        <w:rPr>
+          <w:rFonts w:eastAsia="SimSun" w:ascii="Montserrat" w:hAnsi="Montserrat"/>
+          <w:color w:val="auto"/>
+          <w:kern w:val="0"/>
+          <w:sz w:val="22"/>
+          <w:szCs w:val="22"/>
+          <w:lang w:val="es-AR" w:eastAsia="en-US" w:bidi="ar-SA"/>
+        </w:rPr>
+        <w:t>Ejercicio 2.1</w:t>
+      </w:r>
+      <w:r>
+        <w:rPr>
+          <w:rFonts w:eastAsia="SimSun" w:ascii="Montserrat" w:hAnsi="Montserrat"/>
+          <w:color w:val="auto"/>
+          <w:kern w:val="0"/>
+          <w:sz w:val="22"/>
+          <w:szCs w:val="22"/>
+          <w:lang w:val="es-AR" w:eastAsia="en-US" w:bidi="ar-SA"/>
+        </w:rPr>
+        <w:t>2</w:t>
+      </w:r>
+      <w:r>
+        <w:rPr>
+          <w:rFonts w:eastAsia="SimSun" w:ascii="Montserrat" w:hAnsi="Montserrat"/>
+          <w:color w:val="auto"/>
+          <w:kern w:val="0"/>
+          <w:sz w:val="22"/>
+          <w:szCs w:val="22"/>
+          <w:lang w:val="es-AR" w:eastAsia="en-US" w:bidi="ar-SA"/>
+        </w:rPr>
+        <w:t>:</w:t>
+      </w:r>
+    </w:p>
+    <w:p>
+      <w:pPr>
+        <w:pStyle w:val="BodyText"/>
+        <w:widowControl/>
+        <w:suppressAutoHyphens w:val="true"/>
+        <w:overflowPunct w:val="false"/>
+        <w:bidi w:val="0"/>
+        <w:spacing w:lineRule="auto" w:line="259" w:before="0" w:after="0"/>
+        <w:ind w:hanging="0" w:start="720" w:end="0"/>
+        <w:jc w:val="start"/>
+        <w:rPr>
+          <w:rFonts w:ascii="Google Sans Flex;Google Sans;Helvetica Neue;sans-serif" w:hAnsi="Google Sans Flex;Google Sans;Helvetica Neue;sans-serif"/>
+          <w:b w:val="false"/>
+          <w:i w:val="false"/>
+          <w:caps w:val="false"/>
+          <w:smallCaps w:val="false"/>
+          <w:color w:val="E3E3E3"/>
+          <w:spacing w:val="0"/>
+          <w:sz w:val="24"/>
+          <w:lang w:val="es-AR"/>
+        </w:rPr>
+      </w:pPr>
+      <w:r>
+        <w:rPr>
+          <w:rFonts w:ascii="Google Sans Flex;Google Sans;Helvetica Neue;sans-serif" w:hAnsi="Google Sans Flex;Google Sans;Helvetica Neue;sans-serif"/>
+          <w:b w:val="false"/>
+          <w:i w:val="false"/>
+          <w:caps w:val="false"/>
+          <w:smallCaps w:val="false"/>
+          <w:color w:val="E3E3E3"/>
+          <w:spacing w:val="0"/>
+          <w:sz w:val="24"/>
+          <w:lang w:val="es-AR"/>
+        </w:rPr>
+        <w:t>Esta respuesta es verdadera. El tipo de una tupla informa sobre su longitud. Esta propiedad se puede ver en el propio haskell, por ejemplo:</w:t>
+      </w:r>
+    </w:p>
+    <w:p>
+      <w:pPr>
+        <w:pStyle w:val="BodyText"/>
+        <w:widowControl/>
+        <w:suppressAutoHyphens w:val="true"/>
+        <w:overflowPunct w:val="false"/>
+        <w:bidi w:val="0"/>
+        <w:spacing w:lineRule="auto" w:line="259" w:before="0" w:after="0"/>
+        <w:ind w:hanging="0" w:start="720" w:end="0"/>
+        <w:jc w:val="start"/>
+        <w:rPr>
+          <w:rFonts w:ascii="Google Sans Flex;Google Sans;Helvetica Neue;sans-serif" w:hAnsi="Google Sans Flex;Google Sans;Helvetica Neue;sans-serif"/>
+          <w:b w:val="false"/>
+          <w:i w:val="false"/>
+          <w:caps w:val="false"/>
+          <w:smallCaps w:val="false"/>
+          <w:color w:val="E3E3E3"/>
+          <w:spacing w:val="0"/>
+          <w:sz w:val="24"/>
+          <w:lang w:val="es-AR"/>
+        </w:rPr>
+      </w:pPr>
+      <w:r>
+        <w:rPr>
+          <w:rFonts w:ascii="Google Sans Flex;Google Sans;Helvetica Neue;sans-serif" w:hAnsi="Google Sans Flex;Google Sans;Helvetica Neue;sans-serif"/>
+          <w:b w:val="false"/>
+          <w:i w:val="false"/>
+          <w:caps w:val="false"/>
+          <w:smallCaps w:val="false"/>
+          <w:color w:val="E3E3E3"/>
+          <w:spacing w:val="0"/>
+          <w:sz w:val="24"/>
+          <w:lang w:val="es-AR"/>
+        </w:rPr>
+        <w:t>(‘a’, ’b’) :: (Char, Char)</w:t>
+      </w:r>
+    </w:p>
+    <w:p>
+      <w:pPr>
+        <w:pStyle w:val="BodyText"/>
+        <w:widowControl/>
+        <w:suppressAutoHyphens w:val="true"/>
+        <w:overflowPunct w:val="false"/>
+        <w:bidi w:val="0"/>
+        <w:spacing w:lineRule="auto" w:line="259" w:before="0" w:after="0"/>
+        <w:ind w:hanging="0" w:start="720" w:end="0"/>
+        <w:jc w:val="start"/>
+        <w:rPr>
+          <w:rFonts w:ascii="Google Sans Flex;Google Sans;Helvetica Neue;sans-serif" w:hAnsi="Google Sans Flex;Google Sans;Helvetica Neue;sans-serif"/>
+          <w:b w:val="false"/>
+          <w:i w:val="false"/>
+          <w:caps w:val="false"/>
+          <w:smallCaps w:val="false"/>
+          <w:color w:val="E3E3E3"/>
+          <w:spacing w:val="0"/>
+          <w:sz w:val="24"/>
+          <w:lang w:val="es-AR"/>
+        </w:rPr>
+      </w:pPr>
+      <w:r>
+        <w:rPr>
+          <w:rFonts w:ascii="Google Sans Flex;Google Sans;Helvetica Neue;sans-serif" w:hAnsi="Google Sans Flex;Google Sans;Helvetica Neue;sans-serif"/>
+          <w:b w:val="false"/>
+          <w:i w:val="false"/>
+          <w:caps w:val="false"/>
+          <w:smallCaps w:val="false"/>
+          <w:color w:val="E3E3E3"/>
+          <w:spacing w:val="0"/>
+          <w:sz w:val="24"/>
+          <w:lang w:val="es-AR"/>
+        </w:rPr>
+        <w:t>(‘a’, ’b’, ‘c’) :: (Char, Char, Char)</w:t>
+      </w:r>
+    </w:p>
+    <w:p>
+      <w:pPr>
+        <w:pStyle w:val="BodyText"/>
+        <w:widowControl/>
+        <w:suppressAutoHyphens w:val="true"/>
+        <w:overflowPunct w:val="false"/>
+        <w:bidi w:val="0"/>
+        <w:spacing w:lineRule="auto" w:line="259" w:before="0" w:after="0"/>
+        <w:ind w:hanging="0" w:start="720" w:end="0"/>
+        <w:jc w:val="start"/>
+        <w:rPr>
+          <w:rFonts w:ascii="Google Sans Flex;Google Sans;Helvetica Neue;sans-serif" w:hAnsi="Google Sans Flex;Google Sans;Helvetica Neue;sans-serif"/>
+          <w:b w:val="false"/>
+          <w:i w:val="false"/>
+          <w:caps w:val="false"/>
+          <w:smallCaps w:val="false"/>
+          <w:color w:val="E3E3E3"/>
+          <w:spacing w:val="0"/>
+          <w:sz w:val="24"/>
+          <w:lang w:val="es-AR"/>
+        </w:rPr>
+      </w:pPr>
+      <w:r>
+        <w:rPr>
+          <w:rFonts w:ascii="Google Sans Flex;Google Sans;Helvetica Neue;sans-serif" w:hAnsi="Google Sans Flex;Google Sans;Helvetica Neue;sans-serif"/>
+          <w:b w:val="false"/>
+          <w:i w:val="false"/>
+          <w:caps w:val="false"/>
+          <w:smallCaps w:val="false"/>
+          <w:color w:val="E3E3E3"/>
+          <w:spacing w:val="0"/>
+          <w:sz w:val="24"/>
+          <w:lang w:val="es-AR"/>
+        </w:rPr>
+        <w:t>Hay que tener en cuenta que el tamaño de las tuplas es fijo, entonces es importante distinguir entre una tupla de n elementos y una de m.</w:t>
+      </w:r>
+    </w:p>
+    <w:p>
+      <w:pPr>
+        <w:pStyle w:val="BodyText"/>
+        <w:widowControl/>
+        <w:suppressAutoHyphens w:val="true"/>
+        <w:overflowPunct w:val="false"/>
+        <w:bidi w:val="0"/>
+        <w:spacing w:lineRule="auto" w:line="259" w:before="0" w:after="160"/>
+        <w:ind w:hanging="0" w:start="0" w:end="0"/>
+        <w:jc w:val="start"/>
+        <w:rPr>
+          <w:rFonts w:ascii="Montserrat" w:hAnsi="Montserrat" w:eastAsia="SimSun"/>
+          <w:color w:val="auto"/>
+          <w:kern w:val="0"/>
+          <w:sz w:val="22"/>
+          <w:szCs w:val="22"/>
+          <w:lang w:val="es-AR" w:eastAsia="en-US" w:bidi="ar-SA"/>
+        </w:rPr>
+      </w:pPr>
+      <w:r>
+        <w:rPr>
+          <w:rFonts w:eastAsia="SimSun" w:ascii="Montserrat" w:hAnsi="Montserrat"/>
+          <w:color w:val="auto"/>
+          <w:kern w:val="0"/>
+          <w:sz w:val="22"/>
+          <w:szCs w:val="22"/>
+          <w:lang w:val="es-AR" w:eastAsia="en-US" w:bidi="ar-SA"/>
+        </w:rPr>
+      </w:r>
+    </w:p>
+    <w:p>
+      <w:pPr>
+        <w:pStyle w:val="BodyText"/>
+        <w:widowControl/>
+        <w:suppressAutoHyphens w:val="true"/>
+        <w:overflowPunct w:val="false"/>
+        <w:bidi w:val="0"/>
+        <w:spacing w:lineRule="auto" w:line="259" w:before="0" w:after="160"/>
+        <w:ind w:hanging="0" w:start="0" w:end="0"/>
+        <w:jc w:val="start"/>
+        <w:rPr>
+          <w:rFonts w:ascii="Montserrat" w:hAnsi="Montserrat" w:eastAsia="SimSun"/>
+          <w:b w:val="false"/>
+          <w:bCs w:val="false"/>
+          <w:color w:val="auto"/>
+          <w:kern w:val="0"/>
+          <w:sz w:val="22"/>
+          <w:szCs w:val="22"/>
+          <w:lang w:val="es-AR" w:eastAsia="en-US" w:bidi="ar-SA"/>
+        </w:rPr>
+      </w:pPr>
+      <w:r>
+        <w:rPr>
+          <w:rFonts w:eastAsia="SimSun" w:ascii="Montserrat" w:hAnsi="Montserrat"/>
+          <w:b w:val="false"/>
+          <w:bCs w:val="false"/>
+          <w:color w:val="auto"/>
+          <w:kern w:val="0"/>
+          <w:sz w:val="22"/>
+          <w:szCs w:val="22"/>
+          <w:lang w:val="es-AR" w:eastAsia="en-US" w:bidi="ar-SA"/>
+        </w:rPr>
+        <w:t>Ejercicio 2.13</w:t>
+      </w:r>
+    </w:p>
+    <w:p>
+      <w:pPr>
+        <w:pStyle w:val="BodyText"/>
+        <w:widowControl/>
+        <w:suppressAutoHyphens w:val="true"/>
+        <w:overflowPunct w:val="false"/>
+        <w:bidi w:val="0"/>
+        <w:spacing w:lineRule="auto" w:line="259" w:before="0" w:after="160"/>
+        <w:ind w:hanging="0" w:start="0" w:end="0"/>
+        <w:jc w:val="start"/>
+        <w:rPr>
+          <w:rFonts w:ascii="Montserrat" w:hAnsi="Montserrat"/>
+          <w:b w:val="false"/>
+          <w:lang w:val="es-AR"/>
+        </w:rPr>
+      </w:pPr>
+      <w:r>
+        <w:rPr>
+          <w:rFonts w:eastAsia="SimSun" w:ascii="Montserrat" w:hAnsi="Montserrat"/>
+          <w:b w:val="false"/>
+          <w:bCs w:val="false"/>
+          <w:color w:val="auto"/>
+          <w:kern w:val="0"/>
+          <w:sz w:val="22"/>
+          <w:szCs w:val="22"/>
+          <w:lang w:val="es-AR" w:eastAsia="en-US" w:bidi="ar-SA"/>
+        </w:rPr>
+        <w:t>VERDADERO</w:t>
+      </w:r>
+    </w:p>
+    <w:p>
+      <w:pPr>
+        <w:pStyle w:val="BodyText"/>
+        <w:widowControl/>
+        <w:numPr>
+          <w:ilvl w:val="0"/>
+          <w:numId w:val="14"/>
+        </w:numPr>
+        <w:tabs>
+          <w:tab w:val="clear" w:pos="708"/>
+          <w:tab w:val="left" w:pos="0" w:leader="none"/>
+        </w:tabs>
+        <w:suppressAutoHyphens w:val="true"/>
+        <w:overflowPunct w:val="false"/>
+        <w:bidi w:val="0"/>
+        <w:spacing w:lineRule="auto" w:line="259" w:before="0" w:after="160"/>
+        <w:ind w:hanging="283" w:start="709"/>
+        <w:jc w:val="start"/>
+        <w:rPr/>
+      </w:pPr>
+      <w:r>
+        <w:rPr>
+          <w:rFonts w:eastAsia="SimSun" w:ascii="Montserrat" w:hAnsi="Montserrat"/>
+          <w:color w:val="auto"/>
+          <w:kern w:val="0"/>
+          <w:sz w:val="22"/>
+          <w:szCs w:val="22"/>
+          <w:lang w:val="es-AR" w:eastAsia="en-US" w:bidi="ar-SA"/>
+        </w:rPr>
+        <w:t xml:space="preserve">Listas: En Haskell, gracias a la evaluación perezosa (lazy evaluation), las listas pueden ser infinitas (ej: </w:t>
+      </w:r>
+      <w:r>
+        <w:rPr>
+          <w:rStyle w:val="SourceText"/>
+          <w:rFonts w:eastAsia="SimSun" w:ascii="Montserrat" w:hAnsi="Montserrat"/>
+          <w:color w:val="auto"/>
+          <w:kern w:val="0"/>
+          <w:sz w:val="22"/>
+          <w:szCs w:val="22"/>
+          <w:lang w:val="es-AR" w:eastAsia="en-US" w:bidi="ar-SA"/>
+        </w:rPr>
+        <w:t>[1..]</w:t>
+      </w:r>
+      <w:r>
+        <w:rPr>
+          <w:rFonts w:eastAsia="SimSun" w:ascii="Montserrat" w:hAnsi="Montserrat"/>
+          <w:color w:val="auto"/>
+          <w:kern w:val="0"/>
+          <w:sz w:val="22"/>
+          <w:szCs w:val="22"/>
+          <w:lang w:val="es-AR" w:eastAsia="en-US" w:bidi="ar-SA"/>
+        </w:rPr>
+        <w:t xml:space="preserve">, que genera todos los números naturales). Esto es posible estáticamente porque el tipo de la lista es finito y conocido de antemano, sin importar su longitud. Una lista infinita de enteros tiene simplemente el tipo </w:t>
+      </w:r>
+      <w:r>
+        <w:rPr>
+          <w:rStyle w:val="SourceText"/>
+          <w:rFonts w:eastAsia="SimSun" w:ascii="Montserrat" w:hAnsi="Montserrat"/>
+          <w:color w:val="auto"/>
+          <w:kern w:val="0"/>
+          <w:sz w:val="22"/>
+          <w:szCs w:val="22"/>
+          <w:lang w:val="es-AR" w:eastAsia="en-US" w:bidi="ar-SA"/>
+        </w:rPr>
+        <w:t>[Int]</w:t>
+      </w:r>
+      <w:r>
+        <w:rPr>
+          <w:rFonts w:eastAsia="SimSun" w:ascii="Montserrat" w:hAnsi="Montserrat"/>
+          <w:color w:val="auto"/>
+          <w:kern w:val="0"/>
+          <w:sz w:val="22"/>
+          <w:szCs w:val="22"/>
+          <w:lang w:val="es-AR" w:eastAsia="en-US" w:bidi="ar-SA"/>
+        </w:rPr>
+        <w:t>. El compilador sabe cómo manejarla sin necesidad de conocer su tamaño.</w:t>
+      </w:r>
+    </w:p>
+    <w:p>
+      <w:pPr>
+        <w:pStyle w:val="BodyText"/>
+        <w:widowControl/>
+        <w:numPr>
+          <w:ilvl w:val="0"/>
+          <w:numId w:val="14"/>
+        </w:numPr>
+        <w:tabs>
+          <w:tab w:val="clear" w:pos="708"/>
+          <w:tab w:val="left" w:pos="0" w:leader="none"/>
+        </w:tabs>
+        <w:suppressAutoHyphens w:val="true"/>
+        <w:overflowPunct w:val="false"/>
+        <w:bidi w:val="0"/>
+        <w:spacing w:lineRule="auto" w:line="259" w:before="0" w:after="160"/>
+        <w:ind w:hanging="283" w:start="709"/>
+        <w:jc w:val="start"/>
+        <w:rPr/>
+      </w:pPr>
+      <w:r>
+        <w:rPr>
+          <w:rFonts w:eastAsia="SimSun" w:ascii="Montserrat" w:hAnsi="Montserrat"/>
+          <w:color w:val="auto"/>
+          <w:kern w:val="0"/>
+          <w:sz w:val="22"/>
+          <w:szCs w:val="22"/>
+          <w:lang w:val="es-AR" w:eastAsia="en-US" w:bidi="ar-SA"/>
+        </w:rPr>
+        <w:t xml:space="preserve">Tuplas (Finitas): Por el contrario, el tipo de una tupla describe explícitamente su aridad (longitud) y el tipo de cada uno de sus elementos. Si existiera una tupla infinita, su firma de tipo también tendría que ser infinita (ej: </w:t>
+      </w:r>
+      <w:r>
+        <w:rPr>
+          <w:rStyle w:val="SourceText"/>
+          <w:rFonts w:eastAsia="SimSun" w:ascii="Montserrat" w:hAnsi="Montserrat"/>
+          <w:color w:val="auto"/>
+          <w:kern w:val="0"/>
+          <w:sz w:val="22"/>
+          <w:szCs w:val="22"/>
+          <w:lang w:val="es-AR" w:eastAsia="en-US" w:bidi="ar-SA"/>
+        </w:rPr>
+        <w:t>(Int, Int, Int, ...)</w:t>
+      </w:r>
+      <w:r>
+        <w:rPr>
+          <w:rFonts w:eastAsia="SimSun" w:ascii="Montserrat" w:hAnsi="Montserrat"/>
+          <w:color w:val="auto"/>
+          <w:kern w:val="0"/>
+          <w:sz w:val="22"/>
+          <w:szCs w:val="22"/>
+          <w:lang w:val="es-AR" w:eastAsia="en-US" w:bidi="ar-SA"/>
+        </w:rPr>
+        <w:t>). Como Haskell es de tipado estático, el compilador debe calcular y verificar todos los tipos antes de la evaluación (en tiempo de compilación). Es imposible para el compilador procesar una firma de tipo de longitud infinita, por lo que las tuplas están estrictamente limitadas a una aridad finita.</w:t>
+      </w:r>
+    </w:p>
+    <w:p>
+      <w:pPr>
+        <w:pStyle w:val="BodyText"/>
+        <w:widowControl/>
+        <w:suppressAutoHyphens w:val="true"/>
+        <w:overflowPunct w:val="false"/>
+        <w:bidi w:val="0"/>
+        <w:spacing w:lineRule="auto" w:line="259" w:before="0" w:after="160"/>
+        <w:ind w:hanging="0" w:start="0" w:end="0"/>
+        <w:jc w:val="start"/>
+        <w:rPr>
+          <w:rFonts w:ascii="Montserrat" w:hAnsi="Montserrat" w:eastAsia="SimSun"/>
+          <w:color w:val="auto"/>
+          <w:kern w:val="0"/>
+          <w:sz w:val="22"/>
+          <w:szCs w:val="22"/>
+          <w:lang w:val="es-AR" w:eastAsia="en-US" w:bidi="ar-SA"/>
+        </w:rPr>
+      </w:pPr>
+      <w:r>
+        <w:rPr>
+          <w:rFonts w:eastAsia="SimSun" w:ascii="Montserrat" w:hAnsi="Montserrat"/>
+          <w:color w:val="auto"/>
+          <w:kern w:val="0"/>
+          <w:sz w:val="22"/>
+          <w:szCs w:val="22"/>
+          <w:lang w:val="es-AR" w:eastAsia="en-US" w:bidi="ar-SA"/>
+        </w:rPr>
+      </w:r>
+    </w:p>
+    <w:p>
+      <w:pPr>
+        <w:pStyle w:val="BodyText"/>
+        <w:spacing w:lineRule="auto" w:line="259" w:before="0" w:after="160"/>
+        <w:rPr>
+          <w:rFonts w:ascii="Montserrat" w:hAnsi="Montserrat"/>
+          <w:color w:val="auto"/>
+          <w:sz w:val="22"/>
+          <w:lang w:val="es-AR"/>
+        </w:rPr>
+      </w:pPr>
+      <w:r>
+        <w:rPr>
+          <w:rFonts w:ascii="Montserrat" w:hAnsi="Montserrat"/>
+          <w:color w:val="auto"/>
+          <w:sz w:val="22"/>
+          <w:lang w:val="es-AR"/>
+        </w:rPr>
+        <w:t>Ejercicio 2.1</w:t>
+      </w:r>
+      <w:r>
+        <w:rPr>
+          <w:rFonts w:ascii="Montserrat" w:hAnsi="Montserrat"/>
+          <w:color w:val="auto"/>
+          <w:sz w:val="22"/>
+          <w:lang w:val="es-AR"/>
+        </w:rPr>
+        <w:t>4</w:t>
+      </w:r>
+      <w:r>
+        <w:rPr>
+          <w:rFonts w:ascii="Montserrat" w:hAnsi="Montserrat"/>
+          <w:color w:val="auto"/>
+          <w:sz w:val="22"/>
+          <w:lang w:val="es-AR"/>
+        </w:rPr>
+        <w:t>:</w:t>
+      </w:r>
+    </w:p>
+    <w:p>
+      <w:pPr>
+        <w:pStyle w:val="BodyText"/>
+        <w:widowControl/>
+        <w:suppressAutoHyphens w:val="true"/>
+        <w:overflowPunct w:val="false"/>
+        <w:bidi w:val="0"/>
+        <w:spacing w:lineRule="auto" w:line="259" w:before="0" w:after="160"/>
+        <w:ind w:hanging="0" w:start="720" w:end="0"/>
+        <w:jc w:val="start"/>
+        <w:rPr>
+          <w:rFonts w:ascii="Montserrat" w:hAnsi="Montserrat"/>
+          <w:color w:val="auto"/>
+          <w:sz w:val="22"/>
+          <w:lang w:val="es-AR"/>
+        </w:rPr>
+      </w:pPr>
+      <w:r>
+        <w:rPr>
+          <w:rFonts w:ascii="Montserrat" w:hAnsi="Montserrat"/>
+          <w:color w:val="auto"/>
+          <w:sz w:val="22"/>
+          <w:lang w:val="es-AR"/>
+        </w:rPr>
+        <w:t>VERDADERO.</w:t>
+      </w:r>
+    </w:p>
+    <w:p>
+      <w:pPr>
+        <w:pStyle w:val="BodyText"/>
+        <w:widowControl/>
+        <w:suppressAutoHyphens w:val="true"/>
+        <w:overflowPunct w:val="false"/>
+        <w:bidi w:val="0"/>
+        <w:spacing w:lineRule="auto" w:line="259" w:before="0" w:after="160"/>
+        <w:ind w:hanging="0" w:start="720" w:end="0"/>
+        <w:jc w:val="start"/>
+        <w:rPr>
+          <w:rFonts w:ascii="Montserrat" w:hAnsi="Montserrat"/>
+          <w:color w:val="auto"/>
+          <w:sz w:val="22"/>
+          <w:lang w:val="es-AR"/>
+        </w:rPr>
+      </w:pPr>
+      <w:r>
+        <w:rPr>
+          <w:rFonts w:ascii="Montserrat" w:hAnsi="Montserrat"/>
+          <w:color w:val="auto"/>
+          <w:sz w:val="22"/>
+          <w:lang w:val="es-AR"/>
+        </w:rPr>
+        <w:t>En el sistema de tipos de Haskell, una variable de tipo (se escriben en minúscula) actúa como un comodín o parámetro de tipo. Un tipo que incluye estas variables es un tipo polimórfico.</w:t>
+      </w:r>
+    </w:p>
+    <w:p>
+      <w:pPr>
+        <w:pStyle w:val="BodyText"/>
+        <w:widowControl/>
+        <w:suppressAutoHyphens w:val="true"/>
+        <w:overflowPunct w:val="false"/>
+        <w:bidi w:val="0"/>
+        <w:spacing w:lineRule="auto" w:line="259" w:before="0" w:after="160"/>
+        <w:ind w:hanging="0" w:start="720" w:end="0"/>
+        <w:jc w:val="start"/>
+        <w:rPr>
+          <w:rFonts w:ascii="Montserrat" w:hAnsi="Montserrat"/>
+          <w:color w:val="auto"/>
+          <w:sz w:val="22"/>
+          <w:lang w:val="es-AR"/>
+        </w:rPr>
+      </w:pPr>
+      <w:r>
+        <w:rPr>
+          <w:rFonts w:ascii="Montserrat" w:hAnsi="Montserrat"/>
+          <w:color w:val="auto"/>
+          <w:sz w:val="22"/>
+          <w:lang w:val="es-AR"/>
+        </w:rPr>
+        <w:t>Cuando una función posee este tipo de firma, se denomina función polimórfica porque es capaz de operar sobre múltiples tipos de datos concretos sin la necesidad de reescribir su código, siempre y cuando su lógica interna no dependa de un tipo específico.</w:t>
+      </w:r>
+    </w:p>
+    <w:p>
+      <w:pPr>
+        <w:pStyle w:val="BodyText"/>
+        <w:widowControl/>
+        <w:suppressAutoHyphens w:val="true"/>
+        <w:overflowPunct w:val="false"/>
+        <w:bidi w:val="0"/>
+        <w:spacing w:lineRule="auto" w:line="259" w:before="0" w:after="160"/>
+        <w:ind w:hanging="0" w:start="720" w:end="0"/>
+        <w:jc w:val="start"/>
+        <w:rPr>
+          <w:rFonts w:ascii="Montserrat" w:hAnsi="Montserrat"/>
+          <w:color w:val="auto"/>
+          <w:sz w:val="22"/>
+          <w:lang w:val="es-AR"/>
+        </w:rPr>
+      </w:pPr>
+      <w:r>
+        <w:rPr>
+          <w:rFonts w:ascii="Montserrat" w:hAnsi="Montserrat"/>
+          <w:color w:val="auto"/>
+          <w:sz w:val="22"/>
+          <w:lang w:val="es-AR"/>
+        </w:rPr>
+      </w:r>
+    </w:p>
+    <w:p>
+      <w:pPr>
+        <w:pStyle w:val="BodyText"/>
+        <w:widowControl/>
+        <w:suppressAutoHyphens w:val="true"/>
+        <w:overflowPunct w:val="false"/>
+        <w:bidi w:val="0"/>
+        <w:spacing w:lineRule="auto" w:line="259" w:before="0" w:after="160"/>
+        <w:ind w:hanging="0" w:start="720" w:end="0"/>
+        <w:jc w:val="start"/>
+        <w:rPr>
+          <w:rFonts w:ascii="Montserrat" w:hAnsi="Montserrat"/>
+          <w:color w:val="auto"/>
+          <w:sz w:val="22"/>
+          <w:lang w:val="es-AR"/>
+        </w:rPr>
+      </w:pPr>
+      <w:r>
+        <w:rPr>
+          <w:rFonts w:ascii="Montserrat" w:hAnsi="Montserrat"/>
+          <w:color w:val="auto"/>
+          <w:sz w:val="22"/>
+          <w:lang w:val="es-AR"/>
+        </w:rPr>
+      </w:r>
+    </w:p>
+    <w:p>
+      <w:pPr>
+        <w:pStyle w:val="BodyText"/>
+        <w:widowControl/>
+        <w:suppressAutoHyphens w:val="true"/>
+        <w:overflowPunct w:val="false"/>
+        <w:bidi w:val="0"/>
+        <w:spacing w:lineRule="auto" w:line="259" w:before="0" w:after="160"/>
+        <w:ind w:hanging="0" w:start="720" w:end="0"/>
+        <w:jc w:val="start"/>
+        <w:rPr>
+          <w:rFonts w:ascii="Montserrat" w:hAnsi="Montserrat"/>
+          <w:color w:val="auto"/>
+          <w:sz w:val="22"/>
+          <w:lang w:val="es-AR"/>
+        </w:rPr>
+      </w:pPr>
+      <w:r>
+        <w:rPr>
+          <w:rFonts w:ascii="Montserrat" w:hAnsi="Montserrat"/>
+          <w:color w:val="auto"/>
+          <w:sz w:val="22"/>
+          <w:lang w:val="es-AR"/>
+        </w:rPr>
+      </w:r>
+    </w:p>
+    <w:p>
+      <w:pPr>
+        <w:pStyle w:val="BodyText"/>
+        <w:widowControl/>
+        <w:suppressAutoHyphens w:val="true"/>
+        <w:overflowPunct w:val="false"/>
+        <w:bidi w:val="0"/>
+        <w:spacing w:lineRule="auto" w:line="259" w:before="0" w:after="160"/>
+        <w:ind w:hanging="0" w:start="0" w:end="0"/>
+        <w:jc w:val="start"/>
+        <w:rPr>
+          <w:rFonts w:ascii="Montserrat" w:hAnsi="Montserrat"/>
+          <w:color w:val="auto"/>
+          <w:sz w:val="22"/>
+          <w:lang w:val="es-AR"/>
+        </w:rPr>
+      </w:pPr>
+      <w:r>
+        <w:rPr>
+          <w:rFonts w:ascii="Montserrat" w:hAnsi="Montserrat"/>
+          <w:color w:val="auto"/>
+          <w:sz w:val="22"/>
+          <w:lang w:val="es-AR"/>
+        </w:rPr>
+        <w:t>Ejercicio 2.15:</w:t>
+      </w:r>
+    </w:p>
+    <w:p>
+      <w:pPr>
+        <w:pStyle w:val="BodyText"/>
+        <w:widowControl/>
+        <w:suppressAutoHyphens w:val="true"/>
+        <w:overflowPunct w:val="false"/>
+        <w:bidi w:val="0"/>
+        <w:spacing w:lineRule="auto" w:line="259" w:before="0" w:after="160"/>
+        <w:ind w:hanging="0" w:start="720" w:end="0"/>
+        <w:jc w:val="start"/>
+        <w:rPr>
+          <w:rFonts w:ascii="Montserrat" w:hAnsi="Montserrat"/>
+          <w:color w:val="auto"/>
+          <w:sz w:val="22"/>
+          <w:lang w:val="es-AR"/>
+        </w:rPr>
+      </w:pPr>
+      <w:r>
+        <w:rPr>
+          <w:rFonts w:ascii="Montserrat" w:hAnsi="Montserrat"/>
+          <w:color w:val="auto"/>
+          <w:sz w:val="22"/>
+          <w:lang w:val="es-AR"/>
+        </w:rPr>
+        <w:t xml:space="preserve">Una función es polimórfica si su </w:t>
+      </w:r>
+      <w:r>
+        <w:rPr>
+          <w:rFonts w:ascii="Montserrat" w:hAnsi="Montserrat"/>
+          <w:color w:val="auto"/>
+          <w:sz w:val="22"/>
+          <w:lang w:val="es-AR"/>
+        </w:rPr>
+        <w:t>firma contiene variables de tipo (por ej. length :: [a] → Int). Que tenga una variable de tipo indica que , para cualquier tipo a, la función puede operar con esos datos. En el caso de length, toma una lista de elementos de cualquier tipo “a” y devuelve un entero. Esto indica que la función es polimórfica porque en su misma lógica interna sirve para múltiples formas o tipos de datos sin necesidad de reescribir código.</w:t>
+      </w:r>
+    </w:p>
+    <w:p>
+      <w:pPr>
+        <w:pStyle w:val="BodyText"/>
+        <w:widowControl/>
+        <w:suppressAutoHyphens w:val="true"/>
+        <w:overflowPunct w:val="false"/>
+        <w:bidi w:val="0"/>
+        <w:spacing w:lineRule="auto" w:line="259" w:before="0" w:after="160"/>
+        <w:ind w:hanging="0" w:start="0" w:end="0"/>
+        <w:jc w:val="start"/>
+        <w:rPr>
+          <w:rFonts w:ascii="Montserrat" w:hAnsi="Montserrat"/>
+          <w:color w:val="auto"/>
+          <w:sz w:val="22"/>
+          <w:lang w:val="es-AR"/>
+        </w:rPr>
+      </w:pPr>
+      <w:r>
+        <w:rPr>
+          <w:rFonts w:ascii="Montserrat" w:hAnsi="Montserrat"/>
+          <w:color w:val="auto"/>
+          <w:sz w:val="22"/>
+          <w:lang w:val="es-AR"/>
+        </w:rPr>
+      </w:r>
+    </w:p>
+    <w:p>
+      <w:pPr>
+        <w:pStyle w:val="BodyText"/>
+        <w:widowControl/>
+        <w:suppressAutoHyphens w:val="true"/>
+        <w:overflowPunct w:val="false"/>
+        <w:bidi w:val="0"/>
+        <w:spacing w:lineRule="auto" w:line="259" w:before="0" w:after="160"/>
+        <w:ind w:hanging="0" w:start="0" w:end="0"/>
+        <w:jc w:val="start"/>
+        <w:rPr>
+          <w:rFonts w:ascii="Montserrat" w:hAnsi="Montserrat"/>
+          <w:color w:val="auto"/>
+          <w:sz w:val="22"/>
+          <w:lang w:val="es-AR"/>
+        </w:rPr>
+      </w:pPr>
+      <w:r>
+        <w:rPr>
+          <w:rFonts w:ascii="Montserrat" w:hAnsi="Montserrat"/>
+          <w:color w:val="auto"/>
+          <w:sz w:val="22"/>
+          <w:lang w:val="es-AR"/>
+        </w:rPr>
+        <w:t>Ejercicio 2.1</w:t>
+      </w:r>
+      <w:r>
+        <w:rPr>
+          <w:rFonts w:ascii="Montserrat" w:hAnsi="Montserrat"/>
+          <w:color w:val="auto"/>
+          <w:sz w:val="22"/>
+          <w:lang w:val="es-AR"/>
+        </w:rPr>
+        <w:t>6</w:t>
+      </w:r>
+      <w:r>
+        <w:rPr>
+          <w:rFonts w:ascii="Montserrat" w:hAnsi="Montserrat"/>
+          <w:color w:val="auto"/>
+          <w:sz w:val="22"/>
+          <w:lang w:val="es-AR"/>
+        </w:rPr>
+        <w:t>:</w:t>
+      </w:r>
+    </w:p>
+    <w:p>
+      <w:pPr>
+        <w:pStyle w:val="BodyText"/>
+        <w:widowControl/>
+        <w:numPr>
+          <w:ilvl w:val="0"/>
+          <w:numId w:val="15"/>
+        </w:numPr>
+        <w:suppressAutoHyphens w:val="true"/>
+        <w:overflowPunct w:val="false"/>
+        <w:bidi w:val="0"/>
+        <w:spacing w:lineRule="auto" w:line="259" w:before="0" w:after="160"/>
+        <w:jc w:val="start"/>
+        <w:rPr>
+          <w:rFonts w:ascii="Montserrat" w:hAnsi="Montserrat"/>
+          <w:color w:val="auto"/>
+          <w:sz w:val="22"/>
+          <w:lang w:val="es-AR"/>
+        </w:rPr>
+      </w:pPr>
+      <w:r>
+        <w:rPr>
+          <w:rFonts w:ascii="Montserrat" w:hAnsi="Montserrat"/>
+          <w:color w:val="auto"/>
+          <w:sz w:val="22"/>
+          <w:lang w:val="es-AR"/>
+        </w:rPr>
+        <w:t xml:space="preserve">Parcialización </w:t>
+      </w:r>
+      <w:r>
+        <w:rPr>
+          <w:rFonts w:ascii="Montserrat" w:hAnsi="Montserrat"/>
+          <w:color w:val="auto"/>
+          <w:sz w:val="22"/>
+          <w:lang w:val="es-AR"/>
+        </w:rPr>
+        <w:t>(aplicación parcial)</w:t>
+      </w:r>
+      <w:r>
+        <w:rPr>
+          <w:rFonts w:ascii="Montserrat" w:hAnsi="Montserrat"/>
+          <w:color w:val="auto"/>
+          <w:sz w:val="22"/>
+          <w:lang w:val="es-AR"/>
+        </w:rPr>
+        <w:t>: Parcializar es aplicar solo algunos argumentos de una función currificada. El resultado es otra función, más especializada.</w:t>
+      </w:r>
+    </w:p>
+    <w:p>
+      <w:pPr>
+        <w:pStyle w:val="BodyText"/>
+        <w:widowControl/>
+        <w:numPr>
+          <w:ilvl w:val="0"/>
+          <w:numId w:val="15"/>
+        </w:numPr>
+        <w:suppressAutoHyphens w:val="true"/>
+        <w:overflowPunct w:val="false"/>
+        <w:bidi w:val="0"/>
+        <w:spacing w:lineRule="auto" w:line="259" w:before="0" w:after="160"/>
+        <w:jc w:val="start"/>
+        <w:rPr>
+          <w:rFonts w:ascii="Montserrat" w:hAnsi="Montserrat"/>
+          <w:color w:val="auto"/>
+          <w:sz w:val="22"/>
+          <w:lang w:val="es-AR"/>
+        </w:rPr>
+      </w:pPr>
+      <w:r>
+        <w:rPr>
+          <w:rFonts w:ascii="Montserrat" w:hAnsi="Montserrat"/>
+          <w:color w:val="auto"/>
+          <w:sz w:val="22"/>
+          <w:lang w:val="es-AR"/>
+        </w:rPr>
+        <w:t xml:space="preserve">Currificación: </w:t>
+      </w:r>
+      <w:r>
+        <w:rPr>
+          <w:rFonts w:ascii="Montserrat" w:hAnsi="Montserrat"/>
+          <w:color w:val="auto"/>
+          <w:sz w:val="22"/>
+          <w:lang w:val="es-AR"/>
+        </w:rPr>
+        <w:t>Es un mecanismo estructural del paradigma funcional. Consiste en transformar una función que teóricamente recibe múltiples argumentos en una cadena de funciones sucesivas</w:t>
+      </w:r>
+      <w:r>
+        <w:rPr>
+          <w:rFonts w:ascii="Montserrat" w:hAnsi="Montserrat"/>
+          <w:color w:val="auto"/>
+          <w:sz w:val="22"/>
+          <w:lang w:val="es-AR"/>
+        </w:rPr>
+        <w:t xml:space="preserve"> </w:t>
+      </w:r>
+      <w:r>
+        <w:rPr>
+          <w:rFonts w:ascii="Montserrat" w:hAnsi="Montserrat"/>
+          <w:color w:val="auto"/>
+          <w:sz w:val="22"/>
+          <w:lang w:val="es-AR"/>
+        </w:rPr>
+        <w:t>donde cada una recibe un solo argumento (funciones unarias).</w:t>
+      </w:r>
+    </w:p>
+    <w:p>
+      <w:pPr>
+        <w:pStyle w:val="BodyText"/>
+        <w:widowControl/>
+        <w:numPr>
+          <w:ilvl w:val="0"/>
+          <w:numId w:val="15"/>
+        </w:numPr>
+        <w:suppressAutoHyphens w:val="true"/>
+        <w:overflowPunct w:val="false"/>
+        <w:bidi w:val="0"/>
+        <w:spacing w:lineRule="auto" w:line="259" w:before="0" w:after="160"/>
+        <w:jc w:val="start"/>
+        <w:rPr>
+          <w:rFonts w:ascii="Montserrat" w:hAnsi="Montserrat"/>
+          <w:color w:val="auto"/>
+          <w:sz w:val="22"/>
+          <w:lang w:val="es-AR"/>
+        </w:rPr>
+      </w:pPr>
+      <w:r>
+        <w:rPr>
+          <w:rFonts w:ascii="Montserrat" w:hAnsi="Montserrat"/>
+          <w:color w:val="auto"/>
+          <w:sz w:val="22"/>
+          <w:lang w:val="es-AR"/>
+        </w:rPr>
+        <w:t>Interpretación: Se podría decir que la currificación es la propiedad de forma de la función mientras que la parcialización es el uso concreto de esa forma, es el uso práctico de la currificación.</w:t>
+      </w:r>
+    </w:p>
+    <w:p>
+      <w:pPr>
+        <w:pStyle w:val="BodyText"/>
+        <w:widowControl/>
+        <w:suppressAutoHyphens w:val="true"/>
+        <w:overflowPunct w:val="false"/>
+        <w:bidi w:val="0"/>
+        <w:spacing w:lineRule="auto" w:line="259" w:before="0" w:after="160"/>
+        <w:jc w:val="start"/>
+        <w:rPr>
+          <w:rFonts w:ascii="Montserrat" w:hAnsi="Montserrat"/>
+          <w:color w:val="auto"/>
+          <w:sz w:val="22"/>
+          <w:lang w:val="es-AR"/>
+        </w:rPr>
+      </w:pPr>
+      <w:r>
+        <w:rPr>
+          <w:rFonts w:ascii="Montserrat" w:hAnsi="Montserrat"/>
+          <w:color w:val="auto"/>
+          <w:sz w:val="22"/>
+          <w:lang w:val="es-AR"/>
+        </w:rPr>
+      </w:r>
+    </w:p>
+    <w:p>
+      <w:pPr>
+        <w:pStyle w:val="BodyText"/>
+        <w:widowControl/>
+        <w:suppressAutoHyphens w:val="true"/>
+        <w:overflowPunct w:val="false"/>
+        <w:bidi w:val="0"/>
+        <w:spacing w:lineRule="auto" w:line="259" w:before="0" w:after="160"/>
+        <w:ind w:hanging="0" w:start="0" w:end="0"/>
+        <w:jc w:val="start"/>
+        <w:rPr>
+          <w:rFonts w:ascii="Montserrat" w:hAnsi="Montserrat"/>
+          <w:color w:val="auto"/>
+          <w:sz w:val="22"/>
+          <w:lang w:val="es-AR"/>
+        </w:rPr>
+      </w:pPr>
+      <w:r>
+        <w:rPr>
+          <w:rFonts w:ascii="Montserrat" w:hAnsi="Montserrat"/>
+          <w:color w:val="auto"/>
+          <w:sz w:val="22"/>
+          <w:lang w:val="es-AR"/>
+        </w:rPr>
+        <w:t>Ejercicio 2.1</w:t>
+      </w:r>
+      <w:r>
+        <w:rPr>
+          <w:rFonts w:ascii="Montserrat" w:hAnsi="Montserrat"/>
+          <w:color w:val="auto"/>
+          <w:sz w:val="22"/>
+          <w:lang w:val="es-AR"/>
+        </w:rPr>
+        <w:t>7</w:t>
+      </w:r>
+      <w:r>
+        <w:rPr>
+          <w:rFonts w:ascii="Montserrat" w:hAnsi="Montserrat"/>
+          <w:color w:val="auto"/>
+          <w:sz w:val="22"/>
+          <w:lang w:val="es-AR"/>
+        </w:rPr>
+        <w:t>:</w:t>
+      </w:r>
+    </w:p>
+    <w:p>
+      <w:pPr>
+        <w:pStyle w:val="BodyText"/>
+        <w:widowControl/>
+        <w:suppressAutoHyphens w:val="true"/>
+        <w:overflowPunct w:val="false"/>
+        <w:bidi w:val="0"/>
+        <w:spacing w:lineRule="auto" w:line="259" w:before="0" w:after="160"/>
+        <w:ind w:hanging="0" w:start="720" w:end="0"/>
+        <w:jc w:val="start"/>
+        <w:rPr>
+          <w:rFonts w:ascii="Montserrat" w:hAnsi="Montserrat"/>
+          <w:color w:val="auto"/>
+          <w:sz w:val="22"/>
+          <w:lang w:val="es-AR"/>
+        </w:rPr>
+      </w:pPr>
+      <w:r>
+        <w:rPr>
+          <w:rFonts w:ascii="Montserrat" w:hAnsi="Montserrat"/>
+          <w:color w:val="auto"/>
+          <w:sz w:val="22"/>
+          <w:lang w:val="es-AR"/>
+        </w:rPr>
+        <w:t>Evaluación lazy: Evalúa los argumentos solo cuando hace falta. Tiene como ventaja que permite modularidad, estructuras infinitas y cortocircuito natural. Como contrapartida puede ocultar costos o acumular thunks.</w:t>
+      </w:r>
+    </w:p>
+    <w:p>
+      <w:pPr>
+        <w:pStyle w:val="BodyText"/>
+        <w:widowControl/>
+        <w:suppressAutoHyphens w:val="true"/>
+        <w:overflowPunct w:val="false"/>
+        <w:bidi w:val="0"/>
+        <w:spacing w:lineRule="auto" w:line="259" w:before="0" w:after="160"/>
+        <w:ind w:hanging="0" w:start="720" w:end="0"/>
+        <w:jc w:val="start"/>
+        <w:rPr>
+          <w:rFonts w:ascii="Montserrat" w:hAnsi="Montserrat"/>
+          <w:color w:val="auto"/>
+          <w:sz w:val="22"/>
+          <w:lang w:val="es-AR"/>
+        </w:rPr>
+      </w:pPr>
+      <w:r>
+        <w:rPr>
+          <w:rFonts w:ascii="Montserrat" w:hAnsi="Montserrat"/>
+          <w:color w:val="auto"/>
+          <w:sz w:val="22"/>
+          <w:lang w:val="es-AR"/>
+        </w:rPr>
+      </w:r>
+    </w:p>
+    <w:p>
+      <w:pPr>
+        <w:pStyle w:val="BodyText"/>
+        <w:widowControl/>
+        <w:suppressAutoHyphens w:val="true"/>
+        <w:overflowPunct w:val="false"/>
+        <w:bidi w:val="0"/>
+        <w:spacing w:lineRule="auto" w:line="259" w:before="0" w:after="160"/>
+        <w:ind w:hanging="0" w:start="0" w:end="0"/>
+        <w:jc w:val="start"/>
+        <w:rPr>
+          <w:rFonts w:ascii="Montserrat" w:hAnsi="Montserrat"/>
+          <w:color w:val="auto"/>
+          <w:sz w:val="22"/>
+          <w:lang w:val="es-AR"/>
+        </w:rPr>
+      </w:pPr>
+      <w:r>
+        <w:rPr>
+          <w:rFonts w:ascii="Montserrat" w:hAnsi="Montserrat"/>
+          <w:color w:val="auto"/>
+          <w:sz w:val="22"/>
+          <w:lang w:val="es-AR"/>
+        </w:rPr>
+        <w:t>Ejercicio 2.18:</w:t>
+      </w:r>
+    </w:p>
+    <w:p>
+      <w:pPr>
+        <w:pStyle w:val="BodyText"/>
+        <w:widowControl/>
+        <w:suppressAutoHyphens w:val="true"/>
+        <w:overflowPunct w:val="false"/>
+        <w:bidi w:val="0"/>
+        <w:spacing w:lineRule="auto" w:line="259" w:before="0" w:after="160"/>
+        <w:ind w:hanging="0" w:start="720" w:end="0"/>
+        <w:jc w:val="start"/>
+        <w:rPr>
+          <w:rFonts w:ascii="Montserrat" w:hAnsi="Montserrat"/>
+          <w:color w:val="auto"/>
+          <w:sz w:val="22"/>
+          <w:lang w:val="es-AR"/>
+        </w:rPr>
+      </w:pPr>
+      <w:r>
+        <w:rPr>
+          <w:rFonts w:ascii="Montserrat" w:hAnsi="Montserrat"/>
+          <w:color w:val="auto"/>
+          <w:sz w:val="22"/>
+          <w:lang w:val="es-AR"/>
+        </w:rPr>
+        <w:t>Una función es de orden superior si:</w:t>
+      </w:r>
+    </w:p>
+    <w:p>
+      <w:pPr>
+        <w:pStyle w:val="BodyText"/>
+        <w:widowControl/>
+        <w:numPr>
+          <w:ilvl w:val="0"/>
+          <w:numId w:val="16"/>
+        </w:numPr>
+        <w:suppressAutoHyphens w:val="true"/>
+        <w:overflowPunct w:val="false"/>
+        <w:bidi w:val="0"/>
+        <w:spacing w:lineRule="auto" w:line="259" w:before="0" w:after="160"/>
+        <w:jc w:val="start"/>
+        <w:rPr>
+          <w:rFonts w:ascii="Montserrat" w:hAnsi="Montserrat"/>
+          <w:color w:val="auto"/>
+          <w:sz w:val="22"/>
+          <w:lang w:val="es-AR"/>
+        </w:rPr>
+      </w:pPr>
+      <w:r>
+        <w:rPr>
+          <w:rFonts w:ascii="Montserrat" w:hAnsi="Montserrat"/>
+          <w:color w:val="auto"/>
+          <w:sz w:val="22"/>
+          <w:lang w:val="es-AR"/>
+        </w:rPr>
+        <w:t>Recibe funciones como argumentos o</w:t>
+      </w:r>
+    </w:p>
+    <w:p>
+      <w:pPr>
+        <w:pStyle w:val="BodyText"/>
+        <w:widowControl/>
+        <w:numPr>
+          <w:ilvl w:val="0"/>
+          <w:numId w:val="16"/>
+        </w:numPr>
+        <w:suppressAutoHyphens w:val="true"/>
+        <w:overflowPunct w:val="false"/>
+        <w:bidi w:val="0"/>
+        <w:spacing w:lineRule="auto" w:line="259" w:before="0" w:after="160"/>
+        <w:jc w:val="start"/>
+        <w:rPr>
+          <w:rFonts w:ascii="Montserrat" w:hAnsi="Montserrat"/>
+          <w:color w:val="auto"/>
+          <w:sz w:val="22"/>
+          <w:lang w:val="es-AR"/>
+        </w:rPr>
+      </w:pPr>
+      <w:r>
+        <w:rPr>
+          <w:rFonts w:ascii="Montserrat" w:hAnsi="Montserrat"/>
+          <w:color w:val="auto"/>
+          <w:sz w:val="22"/>
+          <w:lang w:val="es-AR"/>
+        </w:rPr>
+        <w:t>devuelve funciones como resultado.</w:t>
+      </w:r>
+    </w:p>
+    <w:p>
+      <w:pPr>
+        <w:pStyle w:val="BodyText"/>
+        <w:widowControl/>
+        <w:suppressAutoHyphens w:val="true"/>
+        <w:overflowPunct w:val="false"/>
+        <w:bidi w:val="0"/>
+        <w:spacing w:lineRule="auto" w:line="259" w:before="0" w:after="160"/>
+        <w:ind w:hanging="0" w:start="720" w:end="0"/>
+        <w:jc w:val="start"/>
+        <w:rPr>
+          <w:rFonts w:ascii="Montserrat" w:hAnsi="Montserrat"/>
+          <w:color w:val="auto"/>
+          <w:sz w:val="22"/>
+          <w:lang w:val="es-AR"/>
+        </w:rPr>
+      </w:pPr>
+      <w:r>
+        <w:rPr>
+          <w:rFonts w:ascii="Montserrat" w:hAnsi="Montserrat"/>
+          <w:color w:val="auto"/>
+          <w:sz w:val="22"/>
+          <w:lang w:val="es-AR"/>
+        </w:rPr>
+        <w:t>El cálculo lambda trata a las funciones como ciudadanos de primera clase. Haskell toma esta idea y la vuevle cotidiana mediante tipos y combinadores reutilizables.</w:t>
+      </w:r>
+    </w:p>
+    <w:p>
+      <w:pPr>
+        <w:pStyle w:val="BodyText"/>
+        <w:widowControl/>
+        <w:suppressAutoHyphens w:val="true"/>
+        <w:overflowPunct w:val="false"/>
+        <w:bidi w:val="0"/>
+        <w:spacing w:lineRule="auto" w:line="259" w:before="0" w:after="160"/>
+        <w:ind w:hanging="0" w:start="720" w:end="0"/>
+        <w:jc w:val="start"/>
+        <w:rPr>
+          <w:rFonts w:ascii="Montserrat" w:hAnsi="Montserrat"/>
+          <w:color w:val="auto"/>
+          <w:sz w:val="22"/>
+          <w:lang w:val="es-AR"/>
+        </w:rPr>
+      </w:pPr>
+      <w:r>
+        <w:rPr>
+          <w:rFonts w:ascii="Montserrat" w:hAnsi="Montserrat"/>
+          <w:color w:val="auto"/>
+          <w:sz w:val="22"/>
+          <w:lang w:val="es-AR"/>
+        </w:rPr>
+        <w:t>Que una función sea considerada un ciudadano de primera clase implica que no son solo bloques de código estáticos, sino que son valores en sí mismos. Por lo tanto pueden ser manipulados como cualquier otro dato básico (como un booleano o un entero).</w:t>
+      </w:r>
+    </w:p>
+    <w:p>
+      <w:pPr>
+        <w:pStyle w:val="BodyText"/>
+        <w:widowControl/>
+        <w:suppressAutoHyphens w:val="true"/>
+        <w:overflowPunct w:val="false"/>
+        <w:bidi w:val="0"/>
+        <w:spacing w:lineRule="auto" w:line="259" w:before="0" w:after="160"/>
+        <w:ind w:hanging="0" w:start="720" w:end="0"/>
+        <w:jc w:val="start"/>
+        <w:rPr>
+          <w:rFonts w:ascii="Montserrat" w:hAnsi="Montserrat"/>
+          <w:color w:val="auto"/>
+          <w:sz w:val="22"/>
+          <w:lang w:val="es-AR"/>
+        </w:rPr>
+      </w:pPr>
+      <w:r>
+        <w:rPr>
+          <w:rFonts w:ascii="Montserrat" w:hAnsi="Montserrat"/>
+          <w:color w:val="auto"/>
+          <w:sz w:val="22"/>
+          <w:lang w:val="es-AR"/>
+        </w:rPr>
+      </w:r>
+    </w:p>
+    <w:p>
+      <w:pPr>
+        <w:pStyle w:val="BodyText"/>
+        <w:widowControl/>
+        <w:suppressAutoHyphens w:val="true"/>
+        <w:overflowPunct w:val="false"/>
+        <w:bidi w:val="0"/>
+        <w:spacing w:lineRule="auto" w:line="259" w:before="0" w:after="160"/>
+        <w:ind w:hanging="0" w:start="0" w:end="0"/>
+        <w:jc w:val="start"/>
+        <w:rPr>
+          <w:rFonts w:ascii="Montserrat" w:hAnsi="Montserrat"/>
+          <w:color w:val="auto"/>
+          <w:sz w:val="22"/>
+          <w:lang w:val="es-AR"/>
+        </w:rPr>
+      </w:pPr>
+      <w:r>
+        <w:rPr>
+          <w:rFonts w:ascii="Montserrat" w:hAnsi="Montserrat"/>
+          <w:color w:val="auto"/>
+          <w:sz w:val="22"/>
+          <w:lang w:val="es-AR"/>
+        </w:rPr>
+        <w:t>Ejercicio 2.19:</w:t>
+      </w:r>
+    </w:p>
+    <w:p>
+      <w:pPr>
+        <w:pStyle w:val="BodyText"/>
+        <w:widowControl/>
+        <w:suppressAutoHyphens w:val="true"/>
+        <w:overflowPunct w:val="false"/>
+        <w:bidi w:val="0"/>
+        <w:spacing w:lineRule="auto" w:line="259" w:before="0" w:after="160"/>
+        <w:ind w:hanging="0" w:start="720" w:end="0"/>
+        <w:jc w:val="start"/>
+        <w:rPr>
+          <w:rFonts w:ascii="Montserrat" w:hAnsi="Montserrat"/>
+          <w:color w:val="auto"/>
+          <w:sz w:val="22"/>
+          <w:lang w:val="es-AR"/>
+        </w:rPr>
+      </w:pPr>
+      <w:r>
+        <w:rPr>
+          <w:rFonts w:ascii="Montserrat" w:hAnsi="Montserrat"/>
+          <w:color w:val="auto"/>
+          <w:sz w:val="22"/>
+          <w:lang w:val="es-AR"/>
+        </w:rPr>
+        <w:t>Monada: Es una forma de encadenar funciones cuando los resultados vienen con contexto (posible falla, estado, IO, lista de alternativas).</w:t>
+      </w:r>
+    </w:p>
+    <w:p>
+      <w:pPr>
+        <w:pStyle w:val="BodyText"/>
+        <w:widowControl/>
+        <w:suppressAutoHyphens w:val="true"/>
+        <w:overflowPunct w:val="false"/>
+        <w:bidi w:val="0"/>
+        <w:spacing w:lineRule="auto" w:line="259" w:before="0" w:after="160"/>
+        <w:ind w:hanging="0" w:start="720" w:end="0"/>
+        <w:jc w:val="start"/>
+        <w:rPr>
+          <w:rFonts w:ascii="Montserrat" w:hAnsi="Montserrat"/>
+          <w:color w:val="auto"/>
+          <w:sz w:val="22"/>
+          <w:lang w:val="es-AR"/>
+        </w:rPr>
+      </w:pPr>
+      <w:r>
+        <w:rPr>
+          <w:rFonts w:ascii="Montserrat" w:hAnsi="Montserrat"/>
+          <w:color w:val="auto"/>
+          <w:sz w:val="22"/>
+          <w:lang w:val="es-AR"/>
+        </w:rPr>
+        <w:t>No pertenecen al cálculo lambda puro. Surgen como una abstracción adicional sobre funciones tipadas y composición.</w:t>
+      </w:r>
+    </w:p>
+    <w:p>
+      <w:pPr>
+        <w:pStyle w:val="BodyText"/>
+        <w:widowControl/>
+        <w:suppressAutoHyphens w:val="true"/>
+        <w:overflowPunct w:val="false"/>
+        <w:bidi w:val="0"/>
+        <w:spacing w:lineRule="auto" w:line="259" w:before="0" w:after="160"/>
+        <w:ind w:hanging="0" w:start="720" w:end="0"/>
+        <w:jc w:val="start"/>
+        <w:rPr>
+          <w:rFonts w:ascii="Montserrat" w:hAnsi="Montserrat"/>
+          <w:color w:val="auto"/>
+          <w:sz w:val="22"/>
+          <w:lang w:val="es-AR"/>
+        </w:rPr>
+      </w:pPr>
+      <w:r>
+        <w:rPr>
+          <w:rFonts w:ascii="Montserrat" w:hAnsi="Montserrat"/>
+          <w:color w:val="auto"/>
+          <w:sz w:val="22"/>
+          <w:lang w:val="es-AR"/>
+        </w:rPr>
+        <w:t>Sirve para:</w:t>
+      </w:r>
+    </w:p>
+    <w:p>
+      <w:pPr>
+        <w:pStyle w:val="BodyText"/>
+        <w:widowControl/>
+        <w:numPr>
+          <w:ilvl w:val="0"/>
+          <w:numId w:val="17"/>
+        </w:numPr>
+        <w:suppressAutoHyphens w:val="true"/>
+        <w:overflowPunct w:val="false"/>
+        <w:bidi w:val="0"/>
+        <w:spacing w:lineRule="auto" w:line="259" w:before="0" w:after="160"/>
+        <w:jc w:val="start"/>
+        <w:rPr>
+          <w:rFonts w:ascii="Montserrat" w:hAnsi="Montserrat"/>
+          <w:color w:val="auto"/>
+          <w:sz w:val="22"/>
+          <w:lang w:val="es-AR"/>
+        </w:rPr>
+      </w:pPr>
+      <w:r>
+        <w:rPr>
+          <w:rFonts w:ascii="Montserrat" w:hAnsi="Montserrat"/>
+          <w:color w:val="auto"/>
+          <w:sz w:val="22"/>
+          <w:lang w:val="es-AR"/>
+        </w:rPr>
+        <w:t>Evita anidar case.</w:t>
+      </w:r>
+    </w:p>
+    <w:p>
+      <w:pPr>
+        <w:pStyle w:val="BodyText"/>
+        <w:widowControl/>
+        <w:numPr>
+          <w:ilvl w:val="0"/>
+          <w:numId w:val="17"/>
+        </w:numPr>
+        <w:suppressAutoHyphens w:val="true"/>
+        <w:overflowPunct w:val="false"/>
+        <w:bidi w:val="0"/>
+        <w:spacing w:lineRule="auto" w:line="259" w:before="0" w:after="160"/>
+        <w:jc w:val="start"/>
+        <w:rPr>
+          <w:rFonts w:ascii="Montserrat" w:hAnsi="Montserrat"/>
+          <w:color w:val="auto"/>
+          <w:sz w:val="22"/>
+          <w:lang w:val="es-AR"/>
+        </w:rPr>
+      </w:pPr>
+      <w:r>
+        <w:rPr>
+          <w:rFonts w:ascii="Montserrat" w:hAnsi="Montserrat"/>
+          <w:color w:val="auto"/>
+          <w:sz w:val="22"/>
+          <w:lang w:val="es-AR"/>
+        </w:rPr>
+        <w:t>Expresa el flujo principal y delega el manejo del contexto.</w:t>
+      </w:r>
+    </w:p>
+    <w:p>
+      <w:pPr>
+        <w:pStyle w:val="BodyText"/>
+        <w:widowControl/>
+        <w:numPr>
+          <w:ilvl w:val="0"/>
+          <w:numId w:val="17"/>
+        </w:numPr>
+        <w:suppressAutoHyphens w:val="true"/>
+        <w:overflowPunct w:val="false"/>
+        <w:bidi w:val="0"/>
+        <w:spacing w:lineRule="auto" w:line="259" w:before="0" w:after="160"/>
+        <w:jc w:val="start"/>
+        <w:rPr>
+          <w:rFonts w:ascii="Montserrat" w:hAnsi="Montserrat"/>
+          <w:color w:val="auto"/>
+          <w:sz w:val="22"/>
+          <w:lang w:val="es-AR"/>
+        </w:rPr>
+      </w:pPr>
+      <w:r>
+        <w:rPr>
+          <w:rFonts w:ascii="Montserrat" w:hAnsi="Montserrat"/>
+          <w:color w:val="auto"/>
+          <w:sz w:val="22"/>
+          <w:lang w:val="es-AR"/>
+        </w:rPr>
+        <w:t>Hace más legible la secuenciación.</w:t>
+      </w:r>
+    </w:p>
+    <w:p>
+      <w:pPr>
+        <w:pStyle w:val="BodyText"/>
+        <w:widowControl/>
+        <w:suppressAutoHyphens w:val="true"/>
+        <w:overflowPunct w:val="false"/>
+        <w:bidi w:val="0"/>
+        <w:spacing w:lineRule="auto" w:line="259" w:before="0" w:after="160"/>
+        <w:jc w:val="start"/>
+        <w:rPr>
+          <w:rFonts w:ascii="Montserrat" w:hAnsi="Montserrat"/>
+          <w:color w:val="auto"/>
+          <w:sz w:val="22"/>
+          <w:lang w:val="es-AR"/>
+        </w:rPr>
+      </w:pPr>
+      <w:r>
+        <w:rPr>
+          <w:rFonts w:ascii="Montserrat" w:hAnsi="Montserrat"/>
+          <w:color w:val="auto"/>
+          <w:sz w:val="22"/>
+          <w:lang w:val="es-AR"/>
+        </w:rPr>
+      </w:r>
+    </w:p>
+    <w:p>
+      <w:pPr>
+        <w:pStyle w:val="BodyText"/>
+        <w:widowControl/>
+        <w:suppressAutoHyphens w:val="true"/>
+        <w:overflowPunct w:val="false"/>
+        <w:bidi w:val="0"/>
+        <w:spacing w:lineRule="auto" w:line="259" w:before="0" w:after="160"/>
+        <w:jc w:val="start"/>
+        <w:rPr>
+          <w:rFonts w:ascii="Montserrat" w:hAnsi="Montserrat"/>
+          <w:color w:val="auto"/>
+          <w:sz w:val="22"/>
+          <w:lang w:val="es-AR"/>
+        </w:rPr>
+      </w:pPr>
+      <w:r>
+        <w:rPr>
+          <w:rFonts w:ascii="Montserrat" w:hAnsi="Montserrat"/>
+          <w:color w:val="auto"/>
+          <w:sz w:val="22"/>
+          <w:lang w:val="es-AR"/>
+        </w:rPr>
+        <w:t>Ejercicio 2.20:</w:t>
+      </w:r>
+    </w:p>
+    <w:p>
+      <w:pPr>
+        <w:pStyle w:val="BodyText"/>
+        <w:widowControl/>
+        <w:numPr>
+          <w:ilvl w:val="0"/>
+          <w:numId w:val="18"/>
+        </w:numPr>
+        <w:suppressAutoHyphens w:val="true"/>
+        <w:overflowPunct w:val="false"/>
+        <w:bidi w:val="0"/>
+        <w:spacing w:lineRule="auto" w:line="259" w:before="0" w:after="160"/>
+        <w:jc w:val="start"/>
+        <w:rPr>
+          <w:rFonts w:ascii="Montserrat" w:hAnsi="Montserrat"/>
+          <w:color w:val="auto"/>
+          <w:sz w:val="22"/>
+          <w:lang w:val="es-AR"/>
+        </w:rPr>
+      </w:pPr>
+      <w:r>
+        <w:rPr>
+          <w:rFonts w:ascii="Montserrat" w:hAnsi="Montserrat"/>
+          <w:color w:val="auto"/>
+          <w:sz w:val="22"/>
+          <w:lang w:val="es-AR"/>
+        </w:rPr>
+        <w:t>Constructor de tipos: Va a la izquierda del = en una declaración de “data”. Es el nombre del tipo en sí. Se utiliza exclusivamente en las firmas de las funciones (después de los :: ) para decirle al compilador qué tipo de dato estamos esperando o devolviendo</w:t>
+      </w:r>
+    </w:p>
+    <w:p>
+      <w:pPr>
+        <w:pStyle w:val="BodyText"/>
+        <w:widowControl/>
+        <w:numPr>
+          <w:ilvl w:val="0"/>
+          <w:numId w:val="18"/>
+        </w:numPr>
+        <w:suppressAutoHyphens w:val="true"/>
+        <w:overflowPunct w:val="false"/>
+        <w:bidi w:val="0"/>
+        <w:spacing w:lineRule="auto" w:line="259" w:before="0" w:after="160"/>
+        <w:jc w:val="start"/>
+        <w:rPr>
+          <w:rFonts w:ascii="Montserrat" w:hAnsi="Montserrat"/>
+          <w:color w:val="auto"/>
+          <w:sz w:val="22"/>
+          <w:lang w:val="es-AR"/>
+        </w:rPr>
+      </w:pPr>
+      <w:r>
+        <w:rPr>
+          <w:rFonts w:ascii="Montserrat" w:hAnsi="Montserrat"/>
+          <w:color w:val="auto"/>
+          <w:sz w:val="22"/>
+          <w:lang w:val="es-AR"/>
+        </w:rPr>
+        <w:t>Constructor de datos: Va a la derecha del = en una declaración “data”. Si hay varios se separan con “|” (que se lee como o). Son las etiquetas o funciones constructoras que se usan realmente dentro de la lógica del código para crear un valor en memoria o para desarmarlo usando equiparación de patrones (pattern matching).</w:t>
+      </w:r>
+    </w:p>
+    <w:p>
+      <w:pPr>
+        <w:pStyle w:val="BodyText"/>
+        <w:widowControl/>
+        <w:suppressAutoHyphens w:val="true"/>
+        <w:overflowPunct w:val="false"/>
+        <w:bidi w:val="0"/>
+        <w:spacing w:lineRule="auto" w:line="259" w:before="0" w:after="160"/>
+        <w:ind w:hanging="0" w:start="720" w:end="0"/>
+        <w:jc w:val="start"/>
+        <w:rPr>
+          <w:rFonts w:ascii="Montserrat" w:hAnsi="Montserrat"/>
+          <w:color w:val="auto"/>
+          <w:sz w:val="22"/>
+          <w:lang w:val="es-AR"/>
+        </w:rPr>
+      </w:pPr>
+      <w:r>
+        <w:rPr>
+          <w:rFonts w:ascii="Montserrat" w:hAnsi="Montserrat"/>
+          <w:color w:val="auto"/>
+          <w:sz w:val="22"/>
+          <w:lang w:val="es-AR"/>
+        </w:rPr>
+        <w:t>Un ejemplo de esto puede ser:</w:t>
+      </w:r>
+    </w:p>
+    <w:p>
+      <w:pPr>
+        <w:pStyle w:val="BodyText"/>
+        <w:widowControl/>
+        <w:suppressAutoHyphens w:val="true"/>
+        <w:overflowPunct w:val="false"/>
+        <w:bidi w:val="0"/>
+        <w:spacing w:lineRule="auto" w:line="259" w:before="0" w:after="160"/>
+        <w:ind w:hanging="0" w:start="720" w:end="0"/>
+        <w:jc w:val="start"/>
+        <w:rPr>
+          <w:rFonts w:ascii="Montserrat" w:hAnsi="Montserrat"/>
+          <w:color w:val="auto"/>
+          <w:sz w:val="22"/>
+          <w:lang w:val="es-AR"/>
+        </w:rPr>
+      </w:pPr>
+      <w:r>
+        <w:rPr>
+          <w:rFonts w:ascii="Montserrat" w:hAnsi="Montserrat"/>
+          <w:color w:val="auto"/>
+          <w:sz w:val="22"/>
+          <w:lang w:val="es-AR"/>
+        </w:rPr>
+        <w:t>data Figura = Circulo Float | Rectangulo Float Float</w:t>
+      </w:r>
+    </w:p>
+    <w:p>
+      <w:pPr>
+        <w:pStyle w:val="BodyText"/>
+        <w:widowControl/>
+        <w:suppressAutoHyphens w:val="true"/>
+        <w:overflowPunct w:val="false"/>
+        <w:bidi w:val="0"/>
+        <w:spacing w:lineRule="auto" w:line="259" w:before="0" w:after="160"/>
+        <w:ind w:hanging="0" w:start="720" w:end="0"/>
+        <w:jc w:val="start"/>
+        <w:rPr>
+          <w:rFonts w:ascii="Montserrat" w:hAnsi="Montserrat"/>
+          <w:color w:val="auto"/>
+          <w:sz w:val="22"/>
+          <w:lang w:val="es-AR"/>
+        </w:rPr>
+      </w:pPr>
+      <w:r>
+        <w:rPr>
+          <w:rFonts w:ascii="Montserrat" w:hAnsi="Montserrat"/>
+          <w:color w:val="auto"/>
+          <w:sz w:val="22"/>
+          <w:lang w:val="es-AR"/>
+        </w:rPr>
+        <w:t>Aquí se puede ver el constructor de tipo “Figura” y los constructores de dato “Circulo” y “Rectangulo”.</w:t>
       </w:r>
     </w:p>
     <w:sectPr>
@@ -4170,9 +7262,1105 @@
   <w:abstractNum w:abstractNumId="11">
     <w:lvl w:ilvl="0">
       <w:start w:val="1"/>
+      <w:numFmt w:val="bullet"/>
+      <w:lvlText w:val=""/>
+      <w:lvlJc w:val="start"/>
+      <w:pPr>
+        <w:tabs>
+          <w:tab w:val="num" w:pos="1440"/>
+        </w:tabs>
+        <w:ind w:start="1440" w:hanging="360"/>
+      </w:pPr>
+      <w:rPr>
+        <w:rFonts w:ascii="Symbol" w:hAnsi="Symbol" w:cs="Symbol" w:hint="default"/>
+      </w:rPr>
+    </w:lvl>
+    <w:lvl w:ilvl="1">
+      <w:start w:val="1"/>
+      <w:numFmt w:val="bullet"/>
+      <w:lvlText w:val="◦"/>
+      <w:lvlJc w:val="start"/>
+      <w:pPr>
+        <w:tabs>
+          <w:tab w:val="num" w:pos="1800"/>
+        </w:tabs>
+        <w:ind w:start="1800" w:hanging="360"/>
+      </w:pPr>
+      <w:rPr>
+        <w:rFonts w:ascii="OpenSymbol" w:hAnsi="OpenSymbol" w:cs="OpenSymbol" w:hint="default"/>
+      </w:rPr>
+    </w:lvl>
+    <w:lvl w:ilvl="2">
+      <w:start w:val="1"/>
+      <w:numFmt w:val="bullet"/>
+      <w:lvlText w:val="▪"/>
+      <w:lvlJc w:val="start"/>
+      <w:pPr>
+        <w:tabs>
+          <w:tab w:val="num" w:pos="2160"/>
+        </w:tabs>
+        <w:ind w:start="2160" w:hanging="360"/>
+      </w:pPr>
+      <w:rPr>
+        <w:rFonts w:ascii="OpenSymbol" w:hAnsi="OpenSymbol" w:cs="OpenSymbol" w:hint="default"/>
+      </w:rPr>
+    </w:lvl>
+    <w:lvl w:ilvl="3">
+      <w:start w:val="1"/>
+      <w:numFmt w:val="bullet"/>
+      <w:lvlText w:val=""/>
+      <w:lvlJc w:val="start"/>
+      <w:pPr>
+        <w:tabs>
+          <w:tab w:val="num" w:pos="2520"/>
+        </w:tabs>
+        <w:ind w:start="2520" w:hanging="360"/>
+      </w:pPr>
+      <w:rPr>
+        <w:rFonts w:ascii="Symbol" w:hAnsi="Symbol" w:cs="Symbol" w:hint="default"/>
+      </w:rPr>
+    </w:lvl>
+    <w:lvl w:ilvl="4">
+      <w:start w:val="1"/>
+      <w:numFmt w:val="bullet"/>
+      <w:lvlText w:val="◦"/>
+      <w:lvlJc w:val="start"/>
+      <w:pPr>
+        <w:tabs>
+          <w:tab w:val="num" w:pos="2880"/>
+        </w:tabs>
+        <w:ind w:start="2880" w:hanging="360"/>
+      </w:pPr>
+      <w:rPr>
+        <w:rFonts w:ascii="OpenSymbol" w:hAnsi="OpenSymbol" w:cs="OpenSymbol" w:hint="default"/>
+      </w:rPr>
+    </w:lvl>
+    <w:lvl w:ilvl="5">
+      <w:start w:val="1"/>
+      <w:numFmt w:val="bullet"/>
+      <w:lvlText w:val="▪"/>
+      <w:lvlJc w:val="start"/>
+      <w:pPr>
+        <w:tabs>
+          <w:tab w:val="num" w:pos="3240"/>
+        </w:tabs>
+        <w:ind w:start="3240" w:hanging="360"/>
+      </w:pPr>
+      <w:rPr>
+        <w:rFonts w:ascii="OpenSymbol" w:hAnsi="OpenSymbol" w:cs="OpenSymbol" w:hint="default"/>
+      </w:rPr>
+    </w:lvl>
+    <w:lvl w:ilvl="6">
+      <w:start w:val="1"/>
+      <w:numFmt w:val="bullet"/>
+      <w:lvlText w:val=""/>
+      <w:lvlJc w:val="start"/>
+      <w:pPr>
+        <w:tabs>
+          <w:tab w:val="num" w:pos="3600"/>
+        </w:tabs>
+        <w:ind w:start="3600" w:hanging="360"/>
+      </w:pPr>
+      <w:rPr>
+        <w:rFonts w:ascii="Symbol" w:hAnsi="Symbol" w:cs="Symbol" w:hint="default"/>
+      </w:rPr>
+    </w:lvl>
+    <w:lvl w:ilvl="7">
+      <w:start w:val="1"/>
+      <w:numFmt w:val="bullet"/>
+      <w:lvlText w:val="◦"/>
+      <w:lvlJc w:val="start"/>
+      <w:pPr>
+        <w:tabs>
+          <w:tab w:val="num" w:pos="3960"/>
+        </w:tabs>
+        <w:ind w:start="3960" w:hanging="360"/>
+      </w:pPr>
+      <w:rPr>
+        <w:rFonts w:ascii="OpenSymbol" w:hAnsi="OpenSymbol" w:cs="OpenSymbol" w:hint="default"/>
+      </w:rPr>
+    </w:lvl>
+    <w:lvl w:ilvl="8">
+      <w:start w:val="1"/>
+      <w:numFmt w:val="bullet"/>
+      <w:lvlText w:val="▪"/>
+      <w:lvlJc w:val="start"/>
+      <w:pPr>
+        <w:tabs>
+          <w:tab w:val="num" w:pos="4320"/>
+        </w:tabs>
+        <w:ind w:start="4320" w:hanging="360"/>
+      </w:pPr>
+      <w:rPr>
+        <w:rFonts w:ascii="OpenSymbol" w:hAnsi="OpenSymbol" w:cs="OpenSymbol" w:hint="default"/>
+      </w:rPr>
+    </w:lvl>
+  </w:abstractNum>
+  <w:abstractNum w:abstractNumId="12">
+    <w:lvl w:ilvl="0">
+      <w:start w:val="1"/>
+      <w:numFmt w:val="bullet"/>
+      <w:lvlText w:val=""/>
+      <w:lvlJc w:val="start"/>
+      <w:pPr>
+        <w:tabs>
+          <w:tab w:val="num" w:pos="1440"/>
+        </w:tabs>
+        <w:ind w:start="1440" w:hanging="360"/>
+      </w:pPr>
+      <w:rPr>
+        <w:rFonts w:ascii="Symbol" w:hAnsi="Symbol" w:cs="Symbol" w:hint="default"/>
+      </w:rPr>
+    </w:lvl>
+    <w:lvl w:ilvl="1">
+      <w:start w:val="1"/>
+      <w:numFmt w:val="bullet"/>
+      <w:lvlText w:val="◦"/>
+      <w:lvlJc w:val="start"/>
+      <w:pPr>
+        <w:tabs>
+          <w:tab w:val="num" w:pos="1800"/>
+        </w:tabs>
+        <w:ind w:start="1800" w:hanging="360"/>
+      </w:pPr>
+      <w:rPr>
+        <w:rFonts w:ascii="OpenSymbol" w:hAnsi="OpenSymbol" w:cs="OpenSymbol" w:hint="default"/>
+      </w:rPr>
+    </w:lvl>
+    <w:lvl w:ilvl="2">
+      <w:start w:val="1"/>
+      <w:numFmt w:val="bullet"/>
+      <w:lvlText w:val="▪"/>
+      <w:lvlJc w:val="start"/>
+      <w:pPr>
+        <w:tabs>
+          <w:tab w:val="num" w:pos="2160"/>
+        </w:tabs>
+        <w:ind w:start="2160" w:hanging="360"/>
+      </w:pPr>
+      <w:rPr>
+        <w:rFonts w:ascii="OpenSymbol" w:hAnsi="OpenSymbol" w:cs="OpenSymbol" w:hint="default"/>
+      </w:rPr>
+    </w:lvl>
+    <w:lvl w:ilvl="3">
+      <w:start w:val="1"/>
+      <w:numFmt w:val="bullet"/>
+      <w:lvlText w:val=""/>
+      <w:lvlJc w:val="start"/>
+      <w:pPr>
+        <w:tabs>
+          <w:tab w:val="num" w:pos="2520"/>
+        </w:tabs>
+        <w:ind w:start="2520" w:hanging="360"/>
+      </w:pPr>
+      <w:rPr>
+        <w:rFonts w:ascii="Symbol" w:hAnsi="Symbol" w:cs="Symbol" w:hint="default"/>
+      </w:rPr>
+    </w:lvl>
+    <w:lvl w:ilvl="4">
+      <w:start w:val="1"/>
+      <w:numFmt w:val="bullet"/>
+      <w:lvlText w:val="◦"/>
+      <w:lvlJc w:val="start"/>
+      <w:pPr>
+        <w:tabs>
+          <w:tab w:val="num" w:pos="2880"/>
+        </w:tabs>
+        <w:ind w:start="2880" w:hanging="360"/>
+      </w:pPr>
+      <w:rPr>
+        <w:rFonts w:ascii="OpenSymbol" w:hAnsi="OpenSymbol" w:cs="OpenSymbol" w:hint="default"/>
+      </w:rPr>
+    </w:lvl>
+    <w:lvl w:ilvl="5">
+      <w:start w:val="1"/>
+      <w:numFmt w:val="bullet"/>
+      <w:lvlText w:val="▪"/>
+      <w:lvlJc w:val="start"/>
+      <w:pPr>
+        <w:tabs>
+          <w:tab w:val="num" w:pos="3240"/>
+        </w:tabs>
+        <w:ind w:start="3240" w:hanging="360"/>
+      </w:pPr>
+      <w:rPr>
+        <w:rFonts w:ascii="OpenSymbol" w:hAnsi="OpenSymbol" w:cs="OpenSymbol" w:hint="default"/>
+      </w:rPr>
+    </w:lvl>
+    <w:lvl w:ilvl="6">
+      <w:start w:val="1"/>
+      <w:numFmt w:val="bullet"/>
+      <w:lvlText w:val=""/>
+      <w:lvlJc w:val="start"/>
+      <w:pPr>
+        <w:tabs>
+          <w:tab w:val="num" w:pos="3600"/>
+        </w:tabs>
+        <w:ind w:start="3600" w:hanging="360"/>
+      </w:pPr>
+      <w:rPr>
+        <w:rFonts w:ascii="Symbol" w:hAnsi="Symbol" w:cs="Symbol" w:hint="default"/>
+      </w:rPr>
+    </w:lvl>
+    <w:lvl w:ilvl="7">
+      <w:start w:val="1"/>
+      <w:numFmt w:val="bullet"/>
+      <w:lvlText w:val="◦"/>
+      <w:lvlJc w:val="start"/>
+      <w:pPr>
+        <w:tabs>
+          <w:tab w:val="num" w:pos="3960"/>
+        </w:tabs>
+        <w:ind w:start="3960" w:hanging="360"/>
+      </w:pPr>
+      <w:rPr>
+        <w:rFonts w:ascii="OpenSymbol" w:hAnsi="OpenSymbol" w:cs="OpenSymbol" w:hint="default"/>
+      </w:rPr>
+    </w:lvl>
+    <w:lvl w:ilvl="8">
+      <w:start w:val="1"/>
+      <w:numFmt w:val="bullet"/>
+      <w:lvlText w:val="▪"/>
+      <w:lvlJc w:val="start"/>
+      <w:pPr>
+        <w:tabs>
+          <w:tab w:val="num" w:pos="4320"/>
+        </w:tabs>
+        <w:ind w:start="4320" w:hanging="360"/>
+      </w:pPr>
+      <w:rPr>
+        <w:rFonts w:ascii="OpenSymbol" w:hAnsi="OpenSymbol" w:cs="OpenSymbol" w:hint="default"/>
+      </w:rPr>
+    </w:lvl>
+  </w:abstractNum>
+  <w:abstractNum w:abstractNumId="13">
+    <w:lvl w:ilvl="0">
+      <w:start w:val="1"/>
+      <w:numFmt w:val="bullet"/>
+      <w:lvlText w:val=""/>
+      <w:lvlJc w:val="start"/>
+      <w:pPr>
+        <w:tabs>
+          <w:tab w:val="num" w:pos="709"/>
+        </w:tabs>
+        <w:ind w:start="709" w:hanging="283"/>
+      </w:pPr>
+      <w:rPr>
+        <w:rFonts w:ascii="Symbol" w:hAnsi="Symbol" w:cs="Symbol" w:hint="default"/>
+      </w:rPr>
+    </w:lvl>
+    <w:lvl w:ilvl="1">
+      <w:start w:val="1"/>
+      <w:numFmt w:val="bullet"/>
+      <w:lvlText w:val=""/>
+      <w:lvlJc w:val="start"/>
+      <w:pPr>
+        <w:tabs>
+          <w:tab w:val="num" w:pos="1418"/>
+        </w:tabs>
+        <w:ind w:start="1418" w:hanging="283"/>
+      </w:pPr>
+      <w:rPr>
+        <w:rFonts w:ascii="Symbol" w:hAnsi="Symbol" w:cs="Symbol" w:hint="default"/>
+      </w:rPr>
+    </w:lvl>
+    <w:lvl w:ilvl="2">
+      <w:start w:val="1"/>
+      <w:numFmt w:val="bullet"/>
+      <w:lvlText w:val=""/>
+      <w:lvlJc w:val="start"/>
+      <w:pPr>
+        <w:tabs>
+          <w:tab w:val="num" w:pos="2127"/>
+        </w:tabs>
+        <w:ind w:start="2127" w:hanging="283"/>
+      </w:pPr>
+      <w:rPr>
+        <w:rFonts w:ascii="Symbol" w:hAnsi="Symbol" w:cs="Symbol" w:hint="default"/>
+      </w:rPr>
+    </w:lvl>
+    <w:lvl w:ilvl="3">
+      <w:start w:val="1"/>
+      <w:numFmt w:val="bullet"/>
+      <w:lvlText w:val=""/>
+      <w:lvlJc w:val="start"/>
+      <w:pPr>
+        <w:tabs>
+          <w:tab w:val="num" w:pos="2836"/>
+        </w:tabs>
+        <w:ind w:start="2836" w:hanging="283"/>
+      </w:pPr>
+      <w:rPr>
+        <w:rFonts w:ascii="Symbol" w:hAnsi="Symbol" w:cs="Symbol" w:hint="default"/>
+      </w:rPr>
+    </w:lvl>
+    <w:lvl w:ilvl="4">
+      <w:start w:val="1"/>
+      <w:numFmt w:val="bullet"/>
+      <w:lvlText w:val=""/>
+      <w:lvlJc w:val="start"/>
+      <w:pPr>
+        <w:tabs>
+          <w:tab w:val="num" w:pos="3545"/>
+        </w:tabs>
+        <w:ind w:start="3545" w:hanging="283"/>
+      </w:pPr>
+      <w:rPr>
+        <w:rFonts w:ascii="Symbol" w:hAnsi="Symbol" w:cs="Symbol" w:hint="default"/>
+      </w:rPr>
+    </w:lvl>
+    <w:lvl w:ilvl="5">
+      <w:start w:val="1"/>
+      <w:numFmt w:val="bullet"/>
+      <w:lvlText w:val=""/>
+      <w:lvlJc w:val="start"/>
+      <w:pPr>
+        <w:tabs>
+          <w:tab w:val="num" w:pos="4254"/>
+        </w:tabs>
+        <w:ind w:start="4254" w:hanging="283"/>
+      </w:pPr>
+      <w:rPr>
+        <w:rFonts w:ascii="Symbol" w:hAnsi="Symbol" w:cs="Symbol" w:hint="default"/>
+      </w:rPr>
+    </w:lvl>
+    <w:lvl w:ilvl="6">
+      <w:start w:val="1"/>
+      <w:numFmt w:val="bullet"/>
+      <w:lvlText w:val=""/>
+      <w:lvlJc w:val="start"/>
+      <w:pPr>
+        <w:tabs>
+          <w:tab w:val="num" w:pos="4963"/>
+        </w:tabs>
+        <w:ind w:start="4963" w:hanging="283"/>
+      </w:pPr>
+      <w:rPr>
+        <w:rFonts w:ascii="Symbol" w:hAnsi="Symbol" w:cs="Symbol" w:hint="default"/>
+      </w:rPr>
+    </w:lvl>
+    <w:lvl w:ilvl="7">
+      <w:start w:val="1"/>
+      <w:numFmt w:val="bullet"/>
+      <w:lvlText w:val=""/>
+      <w:lvlJc w:val="start"/>
+      <w:pPr>
+        <w:tabs>
+          <w:tab w:val="num" w:pos="5672"/>
+        </w:tabs>
+        <w:ind w:start="5672" w:hanging="283"/>
+      </w:pPr>
+      <w:rPr>
+        <w:rFonts w:ascii="Symbol" w:hAnsi="Symbol" w:cs="Symbol" w:hint="default"/>
+      </w:rPr>
+    </w:lvl>
+    <w:lvl w:ilvl="8">
+      <w:start w:val="1"/>
+      <w:numFmt w:val="bullet"/>
+      <w:lvlText w:val=""/>
+      <w:lvlJc w:val="start"/>
+      <w:pPr>
+        <w:tabs>
+          <w:tab w:val="num" w:pos="6381"/>
+        </w:tabs>
+        <w:ind w:start="6381" w:hanging="283"/>
+      </w:pPr>
+      <w:rPr>
+        <w:rFonts w:ascii="Symbol" w:hAnsi="Symbol" w:cs="Symbol" w:hint="default"/>
+      </w:rPr>
+    </w:lvl>
+  </w:abstractNum>
+  <w:abstractNum w:abstractNumId="14">
+    <w:lvl w:ilvl="0">
+      <w:start w:val="1"/>
+      <w:numFmt w:val="bullet"/>
+      <w:lvlText w:val=""/>
+      <w:lvlJc w:val="start"/>
+      <w:pPr>
+        <w:tabs>
+          <w:tab w:val="num" w:pos="709"/>
+        </w:tabs>
+        <w:ind w:start="709" w:hanging="283"/>
+      </w:pPr>
+      <w:rPr>
+        <w:rFonts w:ascii="Symbol" w:hAnsi="Symbol" w:cs="Symbol" w:hint="default"/>
+      </w:rPr>
+    </w:lvl>
+    <w:lvl w:ilvl="1">
+      <w:start w:val="1"/>
+      <w:numFmt w:val="bullet"/>
+      <w:lvlText w:val=""/>
+      <w:lvlJc w:val="start"/>
+      <w:pPr>
+        <w:tabs>
+          <w:tab w:val="num" w:pos="1418"/>
+        </w:tabs>
+        <w:ind w:start="1418" w:hanging="283"/>
+      </w:pPr>
+      <w:rPr>
+        <w:rFonts w:ascii="Symbol" w:hAnsi="Symbol" w:cs="Symbol" w:hint="default"/>
+      </w:rPr>
+    </w:lvl>
+    <w:lvl w:ilvl="2">
+      <w:start w:val="1"/>
+      <w:numFmt w:val="bullet"/>
+      <w:lvlText w:val=""/>
+      <w:lvlJc w:val="start"/>
+      <w:pPr>
+        <w:tabs>
+          <w:tab w:val="num" w:pos="2127"/>
+        </w:tabs>
+        <w:ind w:start="2127" w:hanging="283"/>
+      </w:pPr>
+      <w:rPr>
+        <w:rFonts w:ascii="Symbol" w:hAnsi="Symbol" w:cs="Symbol" w:hint="default"/>
+      </w:rPr>
+    </w:lvl>
+    <w:lvl w:ilvl="3">
+      <w:start w:val="1"/>
+      <w:numFmt w:val="bullet"/>
+      <w:lvlText w:val=""/>
+      <w:lvlJc w:val="start"/>
+      <w:pPr>
+        <w:tabs>
+          <w:tab w:val="num" w:pos="2836"/>
+        </w:tabs>
+        <w:ind w:start="2836" w:hanging="283"/>
+      </w:pPr>
+      <w:rPr>
+        <w:rFonts w:ascii="Symbol" w:hAnsi="Symbol" w:cs="Symbol" w:hint="default"/>
+      </w:rPr>
+    </w:lvl>
+    <w:lvl w:ilvl="4">
+      <w:start w:val="1"/>
+      <w:numFmt w:val="bullet"/>
+      <w:lvlText w:val=""/>
+      <w:lvlJc w:val="start"/>
+      <w:pPr>
+        <w:tabs>
+          <w:tab w:val="num" w:pos="3545"/>
+        </w:tabs>
+        <w:ind w:start="3545" w:hanging="283"/>
+      </w:pPr>
+      <w:rPr>
+        <w:rFonts w:ascii="Symbol" w:hAnsi="Symbol" w:cs="Symbol" w:hint="default"/>
+      </w:rPr>
+    </w:lvl>
+    <w:lvl w:ilvl="5">
+      <w:start w:val="1"/>
+      <w:numFmt w:val="bullet"/>
+      <w:lvlText w:val=""/>
+      <w:lvlJc w:val="start"/>
+      <w:pPr>
+        <w:tabs>
+          <w:tab w:val="num" w:pos="4254"/>
+        </w:tabs>
+        <w:ind w:start="4254" w:hanging="283"/>
+      </w:pPr>
+      <w:rPr>
+        <w:rFonts w:ascii="Symbol" w:hAnsi="Symbol" w:cs="Symbol" w:hint="default"/>
+      </w:rPr>
+    </w:lvl>
+    <w:lvl w:ilvl="6">
+      <w:start w:val="1"/>
+      <w:numFmt w:val="bullet"/>
+      <w:lvlText w:val=""/>
+      <w:lvlJc w:val="start"/>
+      <w:pPr>
+        <w:tabs>
+          <w:tab w:val="num" w:pos="4963"/>
+        </w:tabs>
+        <w:ind w:start="4963" w:hanging="283"/>
+      </w:pPr>
+      <w:rPr>
+        <w:rFonts w:ascii="Symbol" w:hAnsi="Symbol" w:cs="Symbol" w:hint="default"/>
+      </w:rPr>
+    </w:lvl>
+    <w:lvl w:ilvl="7">
+      <w:start w:val="1"/>
+      <w:numFmt w:val="bullet"/>
+      <w:lvlText w:val=""/>
+      <w:lvlJc w:val="start"/>
+      <w:pPr>
+        <w:tabs>
+          <w:tab w:val="num" w:pos="5672"/>
+        </w:tabs>
+        <w:ind w:start="5672" w:hanging="283"/>
+      </w:pPr>
+      <w:rPr>
+        <w:rFonts w:ascii="Symbol" w:hAnsi="Symbol" w:cs="Symbol" w:hint="default"/>
+      </w:rPr>
+    </w:lvl>
+    <w:lvl w:ilvl="8">
+      <w:start w:val="1"/>
+      <w:numFmt w:val="bullet"/>
+      <w:lvlText w:val=""/>
+      <w:lvlJc w:val="start"/>
+      <w:pPr>
+        <w:tabs>
+          <w:tab w:val="num" w:pos="6381"/>
+        </w:tabs>
+        <w:ind w:start="6381" w:hanging="283"/>
+      </w:pPr>
+      <w:rPr>
+        <w:rFonts w:ascii="Symbol" w:hAnsi="Symbol" w:cs="Symbol" w:hint="default"/>
+      </w:rPr>
+    </w:lvl>
+  </w:abstractNum>
+  <w:abstractNum w:abstractNumId="15">
+    <w:lvl w:ilvl="0">
+      <w:start w:val="1"/>
+      <w:numFmt w:val="bullet"/>
+      <w:lvlText w:val=""/>
+      <w:lvlJc w:val="start"/>
+      <w:pPr>
+        <w:tabs>
+          <w:tab w:val="num" w:pos="1440"/>
+        </w:tabs>
+        <w:ind w:start="1440" w:hanging="360"/>
+      </w:pPr>
+      <w:rPr>
+        <w:rFonts w:ascii="Symbol" w:hAnsi="Symbol" w:cs="Symbol" w:hint="default"/>
+      </w:rPr>
+    </w:lvl>
+    <w:lvl w:ilvl="1">
+      <w:start w:val="1"/>
+      <w:numFmt w:val="bullet"/>
+      <w:lvlText w:val="◦"/>
+      <w:lvlJc w:val="start"/>
+      <w:pPr>
+        <w:tabs>
+          <w:tab w:val="num" w:pos="1800"/>
+        </w:tabs>
+        <w:ind w:start="1800" w:hanging="360"/>
+      </w:pPr>
+      <w:rPr>
+        <w:rFonts w:ascii="OpenSymbol" w:hAnsi="OpenSymbol" w:cs="OpenSymbol" w:hint="default"/>
+      </w:rPr>
+    </w:lvl>
+    <w:lvl w:ilvl="2">
+      <w:start w:val="1"/>
+      <w:numFmt w:val="bullet"/>
+      <w:lvlText w:val="▪"/>
+      <w:lvlJc w:val="start"/>
+      <w:pPr>
+        <w:tabs>
+          <w:tab w:val="num" w:pos="2160"/>
+        </w:tabs>
+        <w:ind w:start="2160" w:hanging="360"/>
+      </w:pPr>
+      <w:rPr>
+        <w:rFonts w:ascii="OpenSymbol" w:hAnsi="OpenSymbol" w:cs="OpenSymbol" w:hint="default"/>
+      </w:rPr>
+    </w:lvl>
+    <w:lvl w:ilvl="3">
+      <w:start w:val="1"/>
+      <w:numFmt w:val="bullet"/>
+      <w:lvlText w:val=""/>
+      <w:lvlJc w:val="start"/>
+      <w:pPr>
+        <w:tabs>
+          <w:tab w:val="num" w:pos="2520"/>
+        </w:tabs>
+        <w:ind w:start="2520" w:hanging="360"/>
+      </w:pPr>
+      <w:rPr>
+        <w:rFonts w:ascii="Symbol" w:hAnsi="Symbol" w:cs="Symbol" w:hint="default"/>
+      </w:rPr>
+    </w:lvl>
+    <w:lvl w:ilvl="4">
+      <w:start w:val="1"/>
+      <w:numFmt w:val="bullet"/>
+      <w:lvlText w:val="◦"/>
+      <w:lvlJc w:val="start"/>
+      <w:pPr>
+        <w:tabs>
+          <w:tab w:val="num" w:pos="2880"/>
+        </w:tabs>
+        <w:ind w:start="2880" w:hanging="360"/>
+      </w:pPr>
+      <w:rPr>
+        <w:rFonts w:ascii="OpenSymbol" w:hAnsi="OpenSymbol" w:cs="OpenSymbol" w:hint="default"/>
+      </w:rPr>
+    </w:lvl>
+    <w:lvl w:ilvl="5">
+      <w:start w:val="1"/>
+      <w:numFmt w:val="bullet"/>
+      <w:lvlText w:val="▪"/>
+      <w:lvlJc w:val="start"/>
+      <w:pPr>
+        <w:tabs>
+          <w:tab w:val="num" w:pos="3240"/>
+        </w:tabs>
+        <w:ind w:start="3240" w:hanging="360"/>
+      </w:pPr>
+      <w:rPr>
+        <w:rFonts w:ascii="OpenSymbol" w:hAnsi="OpenSymbol" w:cs="OpenSymbol" w:hint="default"/>
+      </w:rPr>
+    </w:lvl>
+    <w:lvl w:ilvl="6">
+      <w:start w:val="1"/>
+      <w:numFmt w:val="bullet"/>
+      <w:lvlText w:val=""/>
+      <w:lvlJc w:val="start"/>
+      <w:pPr>
+        <w:tabs>
+          <w:tab w:val="num" w:pos="3600"/>
+        </w:tabs>
+        <w:ind w:start="3600" w:hanging="360"/>
+      </w:pPr>
+      <w:rPr>
+        <w:rFonts w:ascii="Symbol" w:hAnsi="Symbol" w:cs="Symbol" w:hint="default"/>
+      </w:rPr>
+    </w:lvl>
+    <w:lvl w:ilvl="7">
+      <w:start w:val="1"/>
+      <w:numFmt w:val="bullet"/>
+      <w:lvlText w:val="◦"/>
+      <w:lvlJc w:val="start"/>
+      <w:pPr>
+        <w:tabs>
+          <w:tab w:val="num" w:pos="3960"/>
+        </w:tabs>
+        <w:ind w:start="3960" w:hanging="360"/>
+      </w:pPr>
+      <w:rPr>
+        <w:rFonts w:ascii="OpenSymbol" w:hAnsi="OpenSymbol" w:cs="OpenSymbol" w:hint="default"/>
+      </w:rPr>
+    </w:lvl>
+    <w:lvl w:ilvl="8">
+      <w:start w:val="1"/>
+      <w:numFmt w:val="bullet"/>
+      <w:lvlText w:val="▪"/>
+      <w:lvlJc w:val="start"/>
+      <w:pPr>
+        <w:tabs>
+          <w:tab w:val="num" w:pos="4320"/>
+        </w:tabs>
+        <w:ind w:start="4320" w:hanging="360"/>
+      </w:pPr>
+      <w:rPr>
+        <w:rFonts w:ascii="OpenSymbol" w:hAnsi="OpenSymbol" w:cs="OpenSymbol" w:hint="default"/>
+      </w:rPr>
+    </w:lvl>
+  </w:abstractNum>
+  <w:abstractNum w:abstractNumId="16">
+    <w:lvl w:ilvl="0">
+      <w:start w:val="1"/>
+      <w:numFmt w:val="bullet"/>
+      <w:lvlText w:val=""/>
+      <w:lvlJc w:val="start"/>
+      <w:pPr>
+        <w:tabs>
+          <w:tab w:val="num" w:pos="1440"/>
+        </w:tabs>
+        <w:ind w:start="1440" w:hanging="360"/>
+      </w:pPr>
+      <w:rPr>
+        <w:rFonts w:ascii="Symbol" w:hAnsi="Symbol" w:cs="Symbol" w:hint="default"/>
+      </w:rPr>
+    </w:lvl>
+    <w:lvl w:ilvl="1">
+      <w:start w:val="1"/>
+      <w:numFmt w:val="bullet"/>
+      <w:lvlText w:val="◦"/>
+      <w:lvlJc w:val="start"/>
+      <w:pPr>
+        <w:tabs>
+          <w:tab w:val="num" w:pos="1800"/>
+        </w:tabs>
+        <w:ind w:start="1800" w:hanging="360"/>
+      </w:pPr>
+      <w:rPr>
+        <w:rFonts w:ascii="OpenSymbol" w:hAnsi="OpenSymbol" w:cs="OpenSymbol" w:hint="default"/>
+      </w:rPr>
+    </w:lvl>
+    <w:lvl w:ilvl="2">
+      <w:start w:val="1"/>
+      <w:numFmt w:val="bullet"/>
+      <w:lvlText w:val="▪"/>
+      <w:lvlJc w:val="start"/>
+      <w:pPr>
+        <w:tabs>
+          <w:tab w:val="num" w:pos="2160"/>
+        </w:tabs>
+        <w:ind w:start="2160" w:hanging="360"/>
+      </w:pPr>
+      <w:rPr>
+        <w:rFonts w:ascii="OpenSymbol" w:hAnsi="OpenSymbol" w:cs="OpenSymbol" w:hint="default"/>
+      </w:rPr>
+    </w:lvl>
+    <w:lvl w:ilvl="3">
+      <w:start w:val="1"/>
+      <w:numFmt w:val="bullet"/>
+      <w:lvlText w:val=""/>
+      <w:lvlJc w:val="start"/>
+      <w:pPr>
+        <w:tabs>
+          <w:tab w:val="num" w:pos="2520"/>
+        </w:tabs>
+        <w:ind w:start="2520" w:hanging="360"/>
+      </w:pPr>
+      <w:rPr>
+        <w:rFonts w:ascii="Symbol" w:hAnsi="Symbol" w:cs="Symbol" w:hint="default"/>
+      </w:rPr>
+    </w:lvl>
+    <w:lvl w:ilvl="4">
+      <w:start w:val="1"/>
+      <w:numFmt w:val="bullet"/>
+      <w:lvlText w:val="◦"/>
+      <w:lvlJc w:val="start"/>
+      <w:pPr>
+        <w:tabs>
+          <w:tab w:val="num" w:pos="2880"/>
+        </w:tabs>
+        <w:ind w:start="2880" w:hanging="360"/>
+      </w:pPr>
+      <w:rPr>
+        <w:rFonts w:ascii="OpenSymbol" w:hAnsi="OpenSymbol" w:cs="OpenSymbol" w:hint="default"/>
+      </w:rPr>
+    </w:lvl>
+    <w:lvl w:ilvl="5">
+      <w:start w:val="1"/>
+      <w:numFmt w:val="bullet"/>
+      <w:lvlText w:val="▪"/>
+      <w:lvlJc w:val="start"/>
+      <w:pPr>
+        <w:tabs>
+          <w:tab w:val="num" w:pos="3240"/>
+        </w:tabs>
+        <w:ind w:start="3240" w:hanging="360"/>
+      </w:pPr>
+      <w:rPr>
+        <w:rFonts w:ascii="OpenSymbol" w:hAnsi="OpenSymbol" w:cs="OpenSymbol" w:hint="default"/>
+      </w:rPr>
+    </w:lvl>
+    <w:lvl w:ilvl="6">
+      <w:start w:val="1"/>
+      <w:numFmt w:val="bullet"/>
+      <w:lvlText w:val=""/>
+      <w:lvlJc w:val="start"/>
+      <w:pPr>
+        <w:tabs>
+          <w:tab w:val="num" w:pos="3600"/>
+        </w:tabs>
+        <w:ind w:start="3600" w:hanging="360"/>
+      </w:pPr>
+      <w:rPr>
+        <w:rFonts w:ascii="Symbol" w:hAnsi="Symbol" w:cs="Symbol" w:hint="default"/>
+      </w:rPr>
+    </w:lvl>
+    <w:lvl w:ilvl="7">
+      <w:start w:val="1"/>
+      <w:numFmt w:val="bullet"/>
+      <w:lvlText w:val="◦"/>
+      <w:lvlJc w:val="start"/>
+      <w:pPr>
+        <w:tabs>
+          <w:tab w:val="num" w:pos="3960"/>
+        </w:tabs>
+        <w:ind w:start="3960" w:hanging="360"/>
+      </w:pPr>
+      <w:rPr>
+        <w:rFonts w:ascii="OpenSymbol" w:hAnsi="OpenSymbol" w:cs="OpenSymbol" w:hint="default"/>
+      </w:rPr>
+    </w:lvl>
+    <w:lvl w:ilvl="8">
+      <w:start w:val="1"/>
+      <w:numFmt w:val="bullet"/>
+      <w:lvlText w:val="▪"/>
+      <w:lvlJc w:val="start"/>
+      <w:pPr>
+        <w:tabs>
+          <w:tab w:val="num" w:pos="4320"/>
+        </w:tabs>
+        <w:ind w:start="4320" w:hanging="360"/>
+      </w:pPr>
+      <w:rPr>
+        <w:rFonts w:ascii="OpenSymbol" w:hAnsi="OpenSymbol" w:cs="OpenSymbol" w:hint="default"/>
+      </w:rPr>
+    </w:lvl>
+  </w:abstractNum>
+  <w:abstractNum w:abstractNumId="17">
+    <w:lvl w:ilvl="0">
+      <w:start w:val="1"/>
+      <w:numFmt w:val="bullet"/>
+      <w:lvlText w:val=""/>
+      <w:lvlJc w:val="start"/>
+      <w:pPr>
+        <w:tabs>
+          <w:tab w:val="num" w:pos="1440"/>
+        </w:tabs>
+        <w:ind w:start="1440" w:hanging="360"/>
+      </w:pPr>
+      <w:rPr>
+        <w:rFonts w:ascii="Symbol" w:hAnsi="Symbol" w:cs="Symbol" w:hint="default"/>
+      </w:rPr>
+    </w:lvl>
+    <w:lvl w:ilvl="1">
+      <w:start w:val="1"/>
+      <w:numFmt w:val="bullet"/>
+      <w:lvlText w:val="◦"/>
+      <w:lvlJc w:val="start"/>
+      <w:pPr>
+        <w:tabs>
+          <w:tab w:val="num" w:pos="1800"/>
+        </w:tabs>
+        <w:ind w:start="1800" w:hanging="360"/>
+      </w:pPr>
+      <w:rPr>
+        <w:rFonts w:ascii="OpenSymbol" w:hAnsi="OpenSymbol" w:cs="OpenSymbol" w:hint="default"/>
+      </w:rPr>
+    </w:lvl>
+    <w:lvl w:ilvl="2">
+      <w:start w:val="1"/>
+      <w:numFmt w:val="bullet"/>
+      <w:lvlText w:val="▪"/>
+      <w:lvlJc w:val="start"/>
+      <w:pPr>
+        <w:tabs>
+          <w:tab w:val="num" w:pos="2160"/>
+        </w:tabs>
+        <w:ind w:start="2160" w:hanging="360"/>
+      </w:pPr>
+      <w:rPr>
+        <w:rFonts w:ascii="OpenSymbol" w:hAnsi="OpenSymbol" w:cs="OpenSymbol" w:hint="default"/>
+      </w:rPr>
+    </w:lvl>
+    <w:lvl w:ilvl="3">
+      <w:start w:val="1"/>
+      <w:numFmt w:val="bullet"/>
+      <w:lvlText w:val=""/>
+      <w:lvlJc w:val="start"/>
+      <w:pPr>
+        <w:tabs>
+          <w:tab w:val="num" w:pos="2520"/>
+        </w:tabs>
+        <w:ind w:start="2520" w:hanging="360"/>
+      </w:pPr>
+      <w:rPr>
+        <w:rFonts w:ascii="Symbol" w:hAnsi="Symbol" w:cs="Symbol" w:hint="default"/>
+      </w:rPr>
+    </w:lvl>
+    <w:lvl w:ilvl="4">
+      <w:start w:val="1"/>
+      <w:numFmt w:val="bullet"/>
+      <w:lvlText w:val="◦"/>
+      <w:lvlJc w:val="start"/>
+      <w:pPr>
+        <w:tabs>
+          <w:tab w:val="num" w:pos="2880"/>
+        </w:tabs>
+        <w:ind w:start="2880" w:hanging="360"/>
+      </w:pPr>
+      <w:rPr>
+        <w:rFonts w:ascii="OpenSymbol" w:hAnsi="OpenSymbol" w:cs="OpenSymbol" w:hint="default"/>
+      </w:rPr>
+    </w:lvl>
+    <w:lvl w:ilvl="5">
+      <w:start w:val="1"/>
+      <w:numFmt w:val="bullet"/>
+      <w:lvlText w:val="▪"/>
+      <w:lvlJc w:val="start"/>
+      <w:pPr>
+        <w:tabs>
+          <w:tab w:val="num" w:pos="3240"/>
+        </w:tabs>
+        <w:ind w:start="3240" w:hanging="360"/>
+      </w:pPr>
+      <w:rPr>
+        <w:rFonts w:ascii="OpenSymbol" w:hAnsi="OpenSymbol" w:cs="OpenSymbol" w:hint="default"/>
+      </w:rPr>
+    </w:lvl>
+    <w:lvl w:ilvl="6">
+      <w:start w:val="1"/>
+      <w:numFmt w:val="bullet"/>
+      <w:lvlText w:val=""/>
+      <w:lvlJc w:val="start"/>
+      <w:pPr>
+        <w:tabs>
+          <w:tab w:val="num" w:pos="3600"/>
+        </w:tabs>
+        <w:ind w:start="3600" w:hanging="360"/>
+      </w:pPr>
+      <w:rPr>
+        <w:rFonts w:ascii="Symbol" w:hAnsi="Symbol" w:cs="Symbol" w:hint="default"/>
+      </w:rPr>
+    </w:lvl>
+    <w:lvl w:ilvl="7">
+      <w:start w:val="1"/>
+      <w:numFmt w:val="bullet"/>
+      <w:lvlText w:val="◦"/>
+      <w:lvlJc w:val="start"/>
+      <w:pPr>
+        <w:tabs>
+          <w:tab w:val="num" w:pos="3960"/>
+        </w:tabs>
+        <w:ind w:start="3960" w:hanging="360"/>
+      </w:pPr>
+      <w:rPr>
+        <w:rFonts w:ascii="OpenSymbol" w:hAnsi="OpenSymbol" w:cs="OpenSymbol" w:hint="default"/>
+      </w:rPr>
+    </w:lvl>
+    <w:lvl w:ilvl="8">
+      <w:start w:val="1"/>
+      <w:numFmt w:val="bullet"/>
+      <w:lvlText w:val="▪"/>
+      <w:lvlJc w:val="start"/>
+      <w:pPr>
+        <w:tabs>
+          <w:tab w:val="num" w:pos="4320"/>
+        </w:tabs>
+        <w:ind w:start="4320" w:hanging="360"/>
+      </w:pPr>
+      <w:rPr>
+        <w:rFonts w:ascii="OpenSymbol" w:hAnsi="OpenSymbol" w:cs="OpenSymbol" w:hint="default"/>
+      </w:rPr>
+    </w:lvl>
+  </w:abstractNum>
+  <w:abstractNum w:abstractNumId="18">
+    <w:lvl w:ilvl="0">
+      <w:start w:val="1"/>
+      <w:numFmt w:val="bullet"/>
+      <w:lvlText w:val=""/>
+      <w:lvlJc w:val="start"/>
+      <w:pPr>
+        <w:tabs>
+          <w:tab w:val="num" w:pos="1440"/>
+        </w:tabs>
+        <w:ind w:start="1440" w:hanging="360"/>
+      </w:pPr>
+      <w:rPr>
+        <w:rFonts w:ascii="Symbol" w:hAnsi="Symbol" w:cs="Symbol" w:hint="default"/>
+      </w:rPr>
+    </w:lvl>
+    <w:lvl w:ilvl="1">
+      <w:start w:val="1"/>
+      <w:numFmt w:val="bullet"/>
+      <w:lvlText w:val="◦"/>
+      <w:lvlJc w:val="start"/>
+      <w:pPr>
+        <w:tabs>
+          <w:tab w:val="num" w:pos="1800"/>
+        </w:tabs>
+        <w:ind w:start="1800" w:hanging="360"/>
+      </w:pPr>
+      <w:rPr>
+        <w:rFonts w:ascii="OpenSymbol" w:hAnsi="OpenSymbol" w:cs="OpenSymbol" w:hint="default"/>
+      </w:rPr>
+    </w:lvl>
+    <w:lvl w:ilvl="2">
+      <w:start w:val="1"/>
+      <w:numFmt w:val="bullet"/>
+      <w:lvlText w:val="▪"/>
+      <w:lvlJc w:val="start"/>
+      <w:pPr>
+        <w:tabs>
+          <w:tab w:val="num" w:pos="2160"/>
+        </w:tabs>
+        <w:ind w:start="2160" w:hanging="360"/>
+      </w:pPr>
+      <w:rPr>
+        <w:rFonts w:ascii="OpenSymbol" w:hAnsi="OpenSymbol" w:cs="OpenSymbol" w:hint="default"/>
+      </w:rPr>
+    </w:lvl>
+    <w:lvl w:ilvl="3">
+      <w:start w:val="1"/>
+      <w:numFmt w:val="bullet"/>
+      <w:lvlText w:val=""/>
+      <w:lvlJc w:val="start"/>
+      <w:pPr>
+        <w:tabs>
+          <w:tab w:val="num" w:pos="2520"/>
+        </w:tabs>
+        <w:ind w:start="2520" w:hanging="360"/>
+      </w:pPr>
+      <w:rPr>
+        <w:rFonts w:ascii="Symbol" w:hAnsi="Symbol" w:cs="Symbol" w:hint="default"/>
+      </w:rPr>
+    </w:lvl>
+    <w:lvl w:ilvl="4">
+      <w:start w:val="1"/>
+      <w:numFmt w:val="bullet"/>
+      <w:lvlText w:val="◦"/>
+      <w:lvlJc w:val="start"/>
+      <w:pPr>
+        <w:tabs>
+          <w:tab w:val="num" w:pos="2880"/>
+        </w:tabs>
+        <w:ind w:start="2880" w:hanging="360"/>
+      </w:pPr>
+      <w:rPr>
+        <w:rFonts w:ascii="OpenSymbol" w:hAnsi="OpenSymbol" w:cs="OpenSymbol" w:hint="default"/>
+      </w:rPr>
+    </w:lvl>
+    <w:lvl w:ilvl="5">
+      <w:start w:val="1"/>
+      <w:numFmt w:val="bullet"/>
+      <w:lvlText w:val="▪"/>
+      <w:lvlJc w:val="start"/>
+      <w:pPr>
+        <w:tabs>
+          <w:tab w:val="num" w:pos="3240"/>
+        </w:tabs>
+        <w:ind w:start="3240" w:hanging="360"/>
+      </w:pPr>
+      <w:rPr>
+        <w:rFonts w:ascii="OpenSymbol" w:hAnsi="OpenSymbol" w:cs="OpenSymbol" w:hint="default"/>
+      </w:rPr>
+    </w:lvl>
+    <w:lvl w:ilvl="6">
+      <w:start w:val="1"/>
+      <w:numFmt w:val="bullet"/>
+      <w:lvlText w:val=""/>
+      <w:lvlJc w:val="start"/>
+      <w:pPr>
+        <w:tabs>
+          <w:tab w:val="num" w:pos="3600"/>
+        </w:tabs>
+        <w:ind w:start="3600" w:hanging="360"/>
+      </w:pPr>
+      <w:rPr>
+        <w:rFonts w:ascii="Symbol" w:hAnsi="Symbol" w:cs="Symbol" w:hint="default"/>
+      </w:rPr>
+    </w:lvl>
+    <w:lvl w:ilvl="7">
+      <w:start w:val="1"/>
+      <w:numFmt w:val="bullet"/>
+      <w:lvlText w:val="◦"/>
+      <w:lvlJc w:val="start"/>
+      <w:pPr>
+        <w:tabs>
+          <w:tab w:val="num" w:pos="3960"/>
+        </w:tabs>
+        <w:ind w:start="3960" w:hanging="360"/>
+      </w:pPr>
+      <w:rPr>
+        <w:rFonts w:ascii="OpenSymbol" w:hAnsi="OpenSymbol" w:cs="OpenSymbol" w:hint="default"/>
+      </w:rPr>
+    </w:lvl>
+    <w:lvl w:ilvl="8">
+      <w:start w:val="1"/>
+      <w:numFmt w:val="bullet"/>
+      <w:lvlText w:val="▪"/>
+      <w:lvlJc w:val="start"/>
+      <w:pPr>
+        <w:tabs>
+          <w:tab w:val="num" w:pos="4320"/>
+        </w:tabs>
+        <w:ind w:start="4320" w:hanging="360"/>
+      </w:pPr>
+      <w:rPr>
+        <w:rFonts w:ascii="OpenSymbol" w:hAnsi="OpenSymbol" w:cs="OpenSymbol" w:hint="default"/>
+      </w:rPr>
+    </w:lvl>
+  </w:abstractNum>
+  <w:abstractNum w:abstractNumId="19">
+    <w:lvl w:ilvl="0">
+      <w:start w:val="1"/>
       <w:numFmt w:val="none"/>
       <w:suff w:val="nothing"/>
-      <w:lvlText w:val="%1"/>
+      <w:lvlText w:val=""/>
       <w:lvlJc w:val="start"/>
       <w:pPr>
         <w:tabs>
@@ -4185,7 +8373,7 @@
       <w:start w:val="1"/>
       <w:numFmt w:val="none"/>
       <w:suff w:val="nothing"/>
-      <w:lvlText w:val="%2"/>
+      <w:lvlText w:val=""/>
       <w:lvlJc w:val="start"/>
       <w:pPr>
         <w:tabs>
@@ -4198,7 +8386,7 @@
       <w:start w:val="1"/>
       <w:numFmt w:val="none"/>
       <w:suff w:val="nothing"/>
-      <w:lvlText w:val="%3"/>
+      <w:lvlText w:val=""/>
       <w:lvlJc w:val="start"/>
       <w:pPr>
         <w:tabs>
@@ -4211,7 +8399,7 @@
       <w:start w:val="1"/>
       <w:numFmt w:val="none"/>
       <w:suff w:val="nothing"/>
-      <w:lvlText w:val="%4"/>
+      <w:lvlText w:val=""/>
       <w:lvlJc w:val="start"/>
       <w:pPr>
         <w:tabs>
@@ -4224,7 +8412,7 @@
       <w:start w:val="1"/>
       <w:numFmt w:val="none"/>
       <w:suff w:val="nothing"/>
-      <w:lvlText w:val="%5"/>
+      <w:lvlText w:val=""/>
       <w:lvlJc w:val="start"/>
       <w:pPr>
         <w:tabs>
@@ -4237,7 +8425,7 @@
       <w:start w:val="1"/>
       <w:numFmt w:val="none"/>
       <w:suff w:val="nothing"/>
-      <w:lvlText w:val="%6"/>
+      <w:lvlText w:val=""/>
       <w:lvlJc w:val="start"/>
       <w:pPr>
         <w:tabs>
@@ -4250,7 +8438,7 @@
       <w:start w:val="1"/>
       <w:numFmt w:val="none"/>
       <w:suff w:val="nothing"/>
-      <w:lvlText w:val="%7"/>
+      <w:lvlText w:val=""/>
       <w:lvlJc w:val="start"/>
       <w:pPr>
         <w:tabs>
@@ -4263,7 +8451,7 @@
       <w:start w:val="1"/>
       <w:numFmt w:val="none"/>
       <w:suff w:val="nothing"/>
-      <w:lvlText w:val="%8"/>
+      <w:lvlText w:val=""/>
       <w:lvlJc w:val="start"/>
       <w:pPr>
         <w:tabs>
@@ -4276,7 +8464,7 @@
       <w:start w:val="1"/>
       <w:numFmt w:val="none"/>
       <w:suff w:val="nothing"/>
-      <w:lvlText w:val="%9"/>
+      <w:lvlText w:val=""/>
       <w:lvlJc w:val="start"/>
       <w:pPr>
         <w:tabs>
@@ -4319,6 +8507,30 @@
   <w:num w:numId="11">
     <w:abstractNumId w:val="11"/>
   </w:num>
+  <w:num w:numId="12">
+    <w:abstractNumId w:val="12"/>
+  </w:num>
+  <w:num w:numId="13">
+    <w:abstractNumId w:val="13"/>
+  </w:num>
+  <w:num w:numId="14">
+    <w:abstractNumId w:val="14"/>
+  </w:num>
+  <w:num w:numId="15">
+    <w:abstractNumId w:val="15"/>
+  </w:num>
+  <w:num w:numId="16">
+    <w:abstractNumId w:val="16"/>
+  </w:num>
+  <w:num w:numId="17">
+    <w:abstractNumId w:val="17"/>
+  </w:num>
+  <w:num w:numId="18">
+    <w:abstractNumId w:val="18"/>
+  </w:num>
+  <w:num w:numId="19">
+    <w:abstractNumId w:val="19"/>
+  </w:num>
 </w:numbering>
 </file>
 
@@ -4330,7 +8542,7 @@
         <w:rFonts w:ascii="Calibri" w:hAnsi="Calibri" w:eastAsia="SimSun" w:cs="Noto Nastaliq Urdu"/>
         <w:sz w:val="22"/>
         <w:szCs w:val="22"/>
-        <w:lang w:val="es" w:eastAsia="en-US" w:bidi="ar-SA"/>
+        <w:lang w:val="es-ES" w:eastAsia="en-US" w:bidi="ar-SA"/>
       </w:rPr>
     </w:rPrDefault>
     <w:pPrDefault>
@@ -4344,20 +8556,19 @@
     <w:qFormat/>
     <w:pPr>
       <w:widowControl/>
-      <w:kinsoku w:val="true"/>
-      <w:overflowPunct w:val="true"/>
-      <w:autoSpaceDE w:val="true"/>
+      <w:suppressAutoHyphens w:val="true"/>
+      <w:overflowPunct w:val="false"/>
       <w:bidi w:val="0"/>
       <w:spacing w:lineRule="auto" w:line="259" w:before="0" w:after="160"/>
       <w:jc w:val="start"/>
     </w:pPr>
     <w:rPr>
-      <w:rFonts w:ascii="Calibri" w:hAnsi="Calibri" w:eastAsia="SimSun"/>
+      <w:rFonts w:ascii="Calibri" w:hAnsi="Calibri" w:eastAsia="SimSun" w:cs="Noto Nastaliq Urdu"/>
       <w:color w:val="auto"/>
       <w:kern w:val="0"/>
       <w:sz w:val="22"/>
       <w:szCs w:val="22"/>
-      <w:lang w:val="es" w:eastAsia="en-US" w:bidi="ar-SA"/>
+      <w:lang w:val="es-ES" w:eastAsia="en-US" w:bidi="ar-SA"/>
     </w:rPr>
   </w:style>
   <w:style w:type="character" w:styleId="DefaultParagraphFont">
@@ -4379,11 +8590,25 @@
     <w:qFormat/>
     <w:rPr/>
   </w:style>
+  <w:style w:type="character" w:styleId="Bulletsuser">
+    <w:name w:val="Bullets (user)"/>
+    <w:qFormat/>
+    <w:rPr>
+      <w:rFonts w:ascii="OpenSymbol" w:hAnsi="OpenSymbol" w:eastAsia="OpenSymbol" w:cs="OpenSymbol"/>
+    </w:rPr>
+  </w:style>
   <w:style w:type="character" w:styleId="Bullets">
     <w:name w:val="Bullets"/>
     <w:qFormat/>
     <w:rPr>
       <w:rFonts w:ascii="OpenSymbol" w:hAnsi="OpenSymbol" w:eastAsia="OpenSymbol" w:cs="OpenSymbol"/>
+    </w:rPr>
+  </w:style>
+  <w:style w:type="character" w:styleId="SourceText">
+    <w:name w:val="Source Text"/>
+    <w:qFormat/>
+    <w:rPr>
+      <w:rFonts w:ascii="Liberation Mono" w:hAnsi="Liberation Mono" w:eastAsia="Liberation Mono" w:cs="Liberation Mono"/>
     </w:rPr>
   </w:style>
   <w:style w:type="paragraph" w:styleId="Heading">

</xml_diff>